<commit_message>
updated dining car menu and removed logo.png
</commit_message>
<xml_diff>
--- a/documents/dining-car-menu.docx
+++ b/documents/dining-car-menu.docx
@@ -12,11 +12,10 @@
       <w:r>
         <w:rPr>
           <w:b/>
-          <w:noProof/>
         </w:rPr>
         <w:drawing>
-          <wp:inline distT="0" distB="0" distL="0" distR="0" wp14:anchorId="1645BF68" wp14:editId="432C49E6">
-            <wp:extent cx="1219200" cy="1219200"/>
+          <wp:inline distT="0" distB="0" distL="0" distR="0" wp14:anchorId="1645BF68" wp14:editId="3ED21FCB">
+            <wp:extent cx="5114949" cy="5114949"/>
             <wp:effectExtent l="0" t="0" r="0" b="0"/>
             <wp:docPr id="1132558173" name="Picture 1"/>
             <wp:cNvGraphicFramePr>
@@ -26,11 +25,11 @@
               <a:graphicData uri="http://schemas.openxmlformats.org/drawingml/2006/picture">
                 <pic:pic xmlns:pic="http://schemas.openxmlformats.org/drawingml/2006/picture">
                   <pic:nvPicPr>
-                    <pic:cNvPr id="1132558173" name="Picture 1132558173"/>
+                    <pic:cNvPr id="1132558173" name="Picture 1"/>
                     <pic:cNvPicPr/>
                   </pic:nvPicPr>
                   <pic:blipFill>
-                    <a:blip r:embed="rId7" cstate="print">
+                    <a:blip r:embed="rId8">
                       <a:extLst>
                         <a:ext uri="{28A0092B-C50C-407E-A947-70E740481C1C}">
                           <a14:useLocalDpi xmlns:a14="http://schemas.microsoft.com/office/drawing/2010/main" val="0"/>
@@ -44,7 +43,7 @@
                   <pic:spPr>
                     <a:xfrm>
                       <a:off x="0" y="0"/>
-                      <a:ext cx="1219209" cy="1219209"/>
+                      <a:ext cx="5114949" cy="5114949"/>
                     </a:xfrm>
                     <a:prstGeom prst="rect">
                       <a:avLst/>
@@ -67,24 +66,71 @@
         <w:jc w:val="center"/>
         <w:rPr>
           <w:b/>
+          <w:sz w:val="72"/>
+          <w:szCs w:val="72"/>
+        </w:rPr>
+      </w:pPr>
+      <w:r>
+        <w:rPr>
+          <w:b/>
+          <w:sz w:val="72"/>
+          <w:szCs w:val="72"/>
+        </w:rPr>
+        <w:lastRenderedPageBreak/>
+        <w:t>SRT Dining Car Menu</w:t>
+      </w:r>
+    </w:p>
+    <w:p>
+      <w:pPr>
+        <w:rPr>
+          <w:b/>
+          <w:sz w:val="72"/>
+          <w:szCs w:val="72"/>
+        </w:rPr>
+      </w:pPr>
+      <w:r>
+        <w:rPr>
+          <w:b/>
+          <w:sz w:val="72"/>
+          <w:szCs w:val="72"/>
+        </w:rPr>
+        <w:br w:type="page"/>
+      </w:r>
+    </w:p>
+    <w:p>
+      <w:pPr>
+        <w:rPr>
+          <w:b/>
+          <w:bCs/>
           <w:sz w:val="40"/>
           <w:szCs w:val="40"/>
         </w:rPr>
       </w:pPr>
       <w:r>
         <w:rPr>
+          <w:rFonts w:ascii="Segoe UI Emoji" w:hAnsi="Segoe UI Emoji" w:cs="Segoe UI Emoji"/>
           <w:b/>
+          <w:bCs/>
           <w:sz w:val="40"/>
           <w:szCs w:val="40"/>
         </w:rPr>
-        <w:t>SRT Dining Car Menu</w:t>
+        <w:t>🧃</w:t>
+      </w:r>
+      <w:r>
+        <w:rPr>
+          <w:b/>
+          <w:bCs/>
+          <w:sz w:val="40"/>
+          <w:szCs w:val="40"/>
+        </w:rPr>
+        <w:t xml:space="preserve"> Juices</w:t>
       </w:r>
     </w:p>
     <w:p>
       <w:pPr>
-        <w:jc w:val="center"/>
         <w:rPr>
           <w:b/>
+          <w:bCs/>
           <w:sz w:val="40"/>
           <w:szCs w:val="40"/>
         </w:rPr>
@@ -92,13 +138,1428 @@
     </w:p>
     <w:p>
       <w:pPr>
+        <w:numPr>
+          <w:ilvl w:val="0"/>
+          <w:numId w:val="10"/>
+        </w:numPr>
+        <w:tabs>
+          <w:tab w:val="right" w:leader="dot" w:pos="8505"/>
+        </w:tabs>
+        <w:spacing w:line="360" w:lineRule="auto"/>
+        <w:ind w:left="714" w:hanging="357"/>
+        <w:rPr>
+          <w:bCs/>
+          <w:sz w:val="28"/>
+          <w:szCs w:val="28"/>
+        </w:rPr>
+      </w:pPr>
+      <w:r>
+        <w:rPr>
+          <w:bCs/>
+          <w:sz w:val="28"/>
+          <w:szCs w:val="28"/>
+        </w:rPr>
+        <w:t xml:space="preserve">Orange Juice </w:t>
+      </w:r>
+      <w:r>
+        <w:rPr>
+          <w:bCs/>
+          <w:sz w:val="28"/>
+          <w:szCs w:val="28"/>
+        </w:rPr>
+        <w:tab/>
+      </w:r>
+      <w:r>
+        <w:rPr>
+          <w:bCs/>
+          <w:sz w:val="28"/>
+          <w:szCs w:val="28"/>
+        </w:rPr>
+        <w:t>1.60</w:t>
+      </w:r>
+      <w:r>
+        <w:rPr>
+          <w:bCs/>
+          <w:sz w:val="28"/>
+          <w:szCs w:val="28"/>
+        </w:rPr>
+        <w:t xml:space="preserve"> EUR</w:t>
+      </w:r>
+    </w:p>
+    <w:p>
+      <w:pPr>
+        <w:numPr>
+          <w:ilvl w:val="0"/>
+          <w:numId w:val="10"/>
+        </w:numPr>
+        <w:tabs>
+          <w:tab w:val="right" w:leader="dot" w:pos="8505"/>
+        </w:tabs>
+        <w:spacing w:line="360" w:lineRule="auto"/>
+        <w:ind w:left="714" w:hanging="357"/>
+        <w:rPr>
+          <w:bCs/>
+          <w:sz w:val="28"/>
+          <w:szCs w:val="28"/>
+        </w:rPr>
+      </w:pPr>
+      <w:r>
+        <w:rPr>
+          <w:bCs/>
+          <w:sz w:val="28"/>
+          <w:szCs w:val="28"/>
+        </w:rPr>
+        <w:t xml:space="preserve">Apple Juice </w:t>
+      </w:r>
+      <w:r>
+        <w:rPr>
+          <w:bCs/>
+          <w:sz w:val="28"/>
+          <w:szCs w:val="28"/>
+        </w:rPr>
+        <w:tab/>
+      </w:r>
+      <w:r>
+        <w:rPr>
+          <w:bCs/>
+          <w:sz w:val="28"/>
+          <w:szCs w:val="28"/>
+        </w:rPr>
+        <w:t>1.60</w:t>
+      </w:r>
+      <w:r>
+        <w:rPr>
+          <w:bCs/>
+          <w:sz w:val="28"/>
+          <w:szCs w:val="28"/>
+        </w:rPr>
+        <w:t xml:space="preserve"> EUR</w:t>
+      </w:r>
+    </w:p>
+    <w:p>
+      <w:pPr>
+        <w:numPr>
+          <w:ilvl w:val="0"/>
+          <w:numId w:val="10"/>
+        </w:numPr>
+        <w:tabs>
+          <w:tab w:val="right" w:leader="dot" w:pos="8505"/>
+        </w:tabs>
+        <w:spacing w:line="360" w:lineRule="auto"/>
+        <w:ind w:left="714" w:hanging="357"/>
+        <w:rPr>
+          <w:bCs/>
+          <w:sz w:val="28"/>
+          <w:szCs w:val="28"/>
+        </w:rPr>
+      </w:pPr>
+      <w:r>
+        <w:rPr>
+          <w:bCs/>
+          <w:sz w:val="28"/>
+          <w:szCs w:val="28"/>
+        </w:rPr>
+        <w:t xml:space="preserve">Pear Juice </w:t>
+      </w:r>
+      <w:r>
+        <w:rPr>
+          <w:bCs/>
+          <w:sz w:val="28"/>
+          <w:szCs w:val="28"/>
+        </w:rPr>
+        <w:tab/>
+      </w:r>
+      <w:r>
+        <w:rPr>
+          <w:bCs/>
+          <w:sz w:val="28"/>
+          <w:szCs w:val="28"/>
+        </w:rPr>
+        <w:t>1.70</w:t>
+      </w:r>
+      <w:r>
+        <w:rPr>
+          <w:bCs/>
+          <w:sz w:val="28"/>
+          <w:szCs w:val="28"/>
+        </w:rPr>
+        <w:t xml:space="preserve"> EUR</w:t>
+      </w:r>
+    </w:p>
+    <w:p>
+      <w:pPr>
+        <w:numPr>
+          <w:ilvl w:val="0"/>
+          <w:numId w:val="10"/>
+        </w:numPr>
+        <w:tabs>
+          <w:tab w:val="right" w:leader="dot" w:pos="8505"/>
+        </w:tabs>
+        <w:spacing w:line="360" w:lineRule="auto"/>
+        <w:ind w:left="714" w:hanging="357"/>
+        <w:rPr>
+          <w:bCs/>
+          <w:sz w:val="28"/>
+          <w:szCs w:val="28"/>
+        </w:rPr>
+      </w:pPr>
+      <w:r>
+        <w:rPr>
+          <w:bCs/>
+          <w:sz w:val="28"/>
+          <w:szCs w:val="28"/>
+        </w:rPr>
+        <w:t xml:space="preserve">Grape Juice </w:t>
+      </w:r>
+      <w:r>
+        <w:rPr>
+          <w:bCs/>
+          <w:sz w:val="28"/>
+          <w:szCs w:val="28"/>
+        </w:rPr>
+        <w:tab/>
+      </w:r>
+      <w:r>
+        <w:rPr>
+          <w:bCs/>
+          <w:sz w:val="28"/>
+          <w:szCs w:val="28"/>
+        </w:rPr>
+        <w:t>1.80</w:t>
+      </w:r>
+      <w:r>
+        <w:rPr>
+          <w:bCs/>
+          <w:sz w:val="28"/>
+          <w:szCs w:val="28"/>
+        </w:rPr>
+        <w:t xml:space="preserve"> EUR</w:t>
+      </w:r>
+    </w:p>
+    <w:p>
+      <w:pPr>
+        <w:numPr>
+          <w:ilvl w:val="0"/>
+          <w:numId w:val="10"/>
+        </w:numPr>
+        <w:tabs>
+          <w:tab w:val="right" w:leader="dot" w:pos="8505"/>
+        </w:tabs>
+        <w:spacing w:line="360" w:lineRule="auto"/>
+        <w:ind w:left="714" w:hanging="357"/>
+        <w:rPr>
+          <w:bCs/>
+          <w:sz w:val="28"/>
+          <w:szCs w:val="28"/>
+        </w:rPr>
+      </w:pPr>
+      <w:r>
+        <w:rPr>
+          <w:bCs/>
+          <w:sz w:val="28"/>
+          <w:szCs w:val="28"/>
+        </w:rPr>
+        <w:t xml:space="preserve">Pineapple Juice </w:t>
+      </w:r>
+      <w:r>
+        <w:rPr>
+          <w:bCs/>
+          <w:sz w:val="28"/>
+          <w:szCs w:val="28"/>
+        </w:rPr>
+        <w:tab/>
+      </w:r>
+      <w:r>
+        <w:rPr>
+          <w:bCs/>
+          <w:sz w:val="28"/>
+          <w:szCs w:val="28"/>
+        </w:rPr>
+        <w:t>1.80</w:t>
+      </w:r>
+      <w:r>
+        <w:rPr>
+          <w:bCs/>
+          <w:sz w:val="28"/>
+          <w:szCs w:val="28"/>
+        </w:rPr>
+        <w:t xml:space="preserve"> EUR</w:t>
+      </w:r>
+    </w:p>
+    <w:p>
+      <w:pPr>
+        <w:numPr>
+          <w:ilvl w:val="0"/>
+          <w:numId w:val="10"/>
+        </w:numPr>
+        <w:tabs>
+          <w:tab w:val="right" w:leader="dot" w:pos="8505"/>
+        </w:tabs>
+        <w:spacing w:line="360" w:lineRule="auto"/>
+        <w:ind w:left="714" w:hanging="357"/>
+        <w:rPr>
+          <w:bCs/>
+          <w:sz w:val="28"/>
+          <w:szCs w:val="28"/>
+        </w:rPr>
+      </w:pPr>
+      <w:r>
+        <w:rPr>
+          <w:bCs/>
+          <w:sz w:val="28"/>
+          <w:szCs w:val="28"/>
+        </w:rPr>
+        <w:t xml:space="preserve">Peach Juice </w:t>
+      </w:r>
+      <w:r>
+        <w:rPr>
+          <w:bCs/>
+          <w:sz w:val="28"/>
+          <w:szCs w:val="28"/>
+        </w:rPr>
+        <w:tab/>
+      </w:r>
+      <w:r>
+        <w:rPr>
+          <w:bCs/>
+          <w:sz w:val="28"/>
+          <w:szCs w:val="28"/>
+        </w:rPr>
+        <w:t>1.70</w:t>
+      </w:r>
+      <w:r>
+        <w:rPr>
+          <w:bCs/>
+          <w:sz w:val="28"/>
+          <w:szCs w:val="28"/>
+        </w:rPr>
+        <w:t xml:space="preserve"> EUR</w:t>
+      </w:r>
+    </w:p>
+    <w:p>
+      <w:pPr>
+        <w:numPr>
+          <w:ilvl w:val="0"/>
+          <w:numId w:val="10"/>
+        </w:numPr>
+        <w:tabs>
+          <w:tab w:val="right" w:leader="dot" w:pos="8505"/>
+        </w:tabs>
+        <w:spacing w:line="360" w:lineRule="auto"/>
+        <w:ind w:left="714" w:hanging="357"/>
+        <w:rPr>
+          <w:bCs/>
+          <w:sz w:val="28"/>
+          <w:szCs w:val="28"/>
+        </w:rPr>
+      </w:pPr>
+      <w:r>
+        <w:rPr>
+          <w:bCs/>
+          <w:sz w:val="28"/>
+          <w:szCs w:val="28"/>
+        </w:rPr>
+        <w:t xml:space="preserve">Apricot Juice </w:t>
+      </w:r>
+      <w:r>
+        <w:rPr>
+          <w:bCs/>
+          <w:sz w:val="28"/>
+          <w:szCs w:val="28"/>
+        </w:rPr>
+        <w:tab/>
+      </w:r>
+      <w:r>
+        <w:rPr>
+          <w:bCs/>
+          <w:sz w:val="28"/>
+          <w:szCs w:val="28"/>
+        </w:rPr>
+        <w:t>1.70</w:t>
+      </w:r>
+      <w:r>
+        <w:rPr>
+          <w:bCs/>
+          <w:sz w:val="28"/>
+          <w:szCs w:val="28"/>
+        </w:rPr>
+        <w:t xml:space="preserve"> EUR</w:t>
+      </w:r>
+    </w:p>
+    <w:p>
+      <w:pPr>
+        <w:numPr>
+          <w:ilvl w:val="0"/>
+          <w:numId w:val="10"/>
+        </w:numPr>
+        <w:tabs>
+          <w:tab w:val="right" w:leader="dot" w:pos="8505"/>
+        </w:tabs>
+        <w:spacing w:line="360" w:lineRule="auto"/>
+        <w:ind w:left="714" w:hanging="357"/>
+        <w:rPr>
+          <w:bCs/>
+          <w:sz w:val="28"/>
+          <w:szCs w:val="28"/>
+        </w:rPr>
+      </w:pPr>
+      <w:r>
+        <w:rPr>
+          <w:bCs/>
+          <w:sz w:val="28"/>
+          <w:szCs w:val="28"/>
+        </w:rPr>
+        <w:t xml:space="preserve">Mango Juice </w:t>
+      </w:r>
+      <w:r>
+        <w:rPr>
+          <w:bCs/>
+          <w:sz w:val="28"/>
+          <w:szCs w:val="28"/>
+        </w:rPr>
+        <w:tab/>
+      </w:r>
+      <w:r>
+        <w:rPr>
+          <w:bCs/>
+          <w:sz w:val="28"/>
+          <w:szCs w:val="28"/>
+        </w:rPr>
+        <w:t>1.90</w:t>
+      </w:r>
+      <w:r>
+        <w:rPr>
+          <w:bCs/>
+          <w:sz w:val="28"/>
+          <w:szCs w:val="28"/>
+        </w:rPr>
+        <w:t xml:space="preserve"> EUR</w:t>
+      </w:r>
+    </w:p>
+    <w:p>
+      <w:pPr>
+        <w:numPr>
+          <w:ilvl w:val="0"/>
+          <w:numId w:val="10"/>
+        </w:numPr>
+        <w:tabs>
+          <w:tab w:val="right" w:leader="dot" w:pos="8505"/>
+        </w:tabs>
+        <w:spacing w:line="360" w:lineRule="auto"/>
+        <w:ind w:left="714" w:hanging="357"/>
+        <w:rPr>
+          <w:bCs/>
+          <w:sz w:val="28"/>
+          <w:szCs w:val="28"/>
+        </w:rPr>
+      </w:pPr>
+      <w:r>
+        <w:rPr>
+          <w:bCs/>
+          <w:sz w:val="28"/>
+          <w:szCs w:val="28"/>
+        </w:rPr>
+        <w:t xml:space="preserve">Multivitamin Juice </w:t>
+      </w:r>
+      <w:r>
+        <w:rPr>
+          <w:bCs/>
+          <w:sz w:val="28"/>
+          <w:szCs w:val="28"/>
+        </w:rPr>
+        <w:tab/>
+      </w:r>
+      <w:r>
+        <w:rPr>
+          <w:bCs/>
+          <w:sz w:val="28"/>
+          <w:szCs w:val="28"/>
+        </w:rPr>
+        <w:t>1.80</w:t>
+      </w:r>
+      <w:r>
+        <w:rPr>
+          <w:bCs/>
+          <w:sz w:val="28"/>
+          <w:szCs w:val="28"/>
+        </w:rPr>
+        <w:t xml:space="preserve"> EUR</w:t>
+      </w:r>
+    </w:p>
+    <w:p>
+      <w:pPr>
+        <w:numPr>
+          <w:ilvl w:val="0"/>
+          <w:numId w:val="10"/>
+        </w:numPr>
+        <w:tabs>
+          <w:tab w:val="right" w:leader="dot" w:pos="8505"/>
+        </w:tabs>
+        <w:spacing w:line="360" w:lineRule="auto"/>
+        <w:ind w:left="714" w:hanging="357"/>
+        <w:rPr>
+          <w:bCs/>
+          <w:sz w:val="28"/>
+          <w:szCs w:val="28"/>
+        </w:rPr>
+      </w:pPr>
+      <w:r>
+        <w:rPr>
+          <w:bCs/>
+          <w:sz w:val="28"/>
+          <w:szCs w:val="28"/>
+        </w:rPr>
+        <w:t xml:space="preserve">Forest Fruit Juice </w:t>
+      </w:r>
+      <w:r>
+        <w:rPr>
+          <w:bCs/>
+          <w:sz w:val="28"/>
+          <w:szCs w:val="28"/>
+        </w:rPr>
+        <w:tab/>
+      </w:r>
+      <w:r>
+        <w:rPr>
+          <w:bCs/>
+          <w:sz w:val="28"/>
+          <w:szCs w:val="28"/>
+        </w:rPr>
+        <w:t>1.90</w:t>
+      </w:r>
+      <w:r>
+        <w:rPr>
+          <w:bCs/>
+          <w:sz w:val="28"/>
+          <w:szCs w:val="28"/>
+        </w:rPr>
+        <w:t xml:space="preserve"> EUR</w:t>
+      </w:r>
+    </w:p>
+    <w:p>
+      <w:pPr>
+        <w:numPr>
+          <w:ilvl w:val="0"/>
+          <w:numId w:val="10"/>
+        </w:numPr>
+        <w:tabs>
+          <w:tab w:val="right" w:leader="dot" w:pos="8505"/>
+        </w:tabs>
+        <w:spacing w:line="360" w:lineRule="auto"/>
+        <w:ind w:left="714" w:hanging="357"/>
+        <w:rPr>
+          <w:bCs/>
+          <w:sz w:val="28"/>
+          <w:szCs w:val="28"/>
+        </w:rPr>
+      </w:pPr>
+      <w:r>
+        <w:rPr>
+          <w:bCs/>
+          <w:sz w:val="28"/>
+          <w:szCs w:val="28"/>
+        </w:rPr>
+        <w:t xml:space="preserve">Cranberry Juice </w:t>
+      </w:r>
+      <w:r>
+        <w:rPr>
+          <w:bCs/>
+          <w:sz w:val="28"/>
+          <w:szCs w:val="28"/>
+        </w:rPr>
+        <w:tab/>
+      </w:r>
+      <w:r>
+        <w:rPr>
+          <w:bCs/>
+          <w:sz w:val="28"/>
+          <w:szCs w:val="28"/>
+        </w:rPr>
+        <w:t>1.80</w:t>
+      </w:r>
+      <w:r>
+        <w:rPr>
+          <w:bCs/>
+          <w:sz w:val="28"/>
+          <w:szCs w:val="28"/>
+        </w:rPr>
+        <w:t xml:space="preserve"> EUR</w:t>
+      </w:r>
+    </w:p>
+    <w:p>
+      <w:pPr>
+        <w:numPr>
+          <w:ilvl w:val="0"/>
+          <w:numId w:val="10"/>
+        </w:numPr>
+        <w:tabs>
+          <w:tab w:val="right" w:leader="dot" w:pos="8505"/>
+        </w:tabs>
+        <w:spacing w:line="360" w:lineRule="auto"/>
+        <w:ind w:left="714" w:hanging="357"/>
+        <w:rPr>
+          <w:bCs/>
+          <w:sz w:val="28"/>
+          <w:szCs w:val="28"/>
+        </w:rPr>
+      </w:pPr>
+      <w:r>
+        <w:rPr>
+          <w:bCs/>
+          <w:sz w:val="28"/>
+          <w:szCs w:val="28"/>
+        </w:rPr>
+        <w:t xml:space="preserve">Cherry Juice </w:t>
+      </w:r>
+      <w:r>
+        <w:rPr>
+          <w:bCs/>
+          <w:sz w:val="28"/>
+          <w:szCs w:val="28"/>
+        </w:rPr>
+        <w:tab/>
+      </w:r>
+      <w:r>
+        <w:rPr>
+          <w:bCs/>
+          <w:sz w:val="28"/>
+          <w:szCs w:val="28"/>
+        </w:rPr>
+        <w:t>1.80</w:t>
+      </w:r>
+      <w:r>
+        <w:rPr>
+          <w:bCs/>
+          <w:sz w:val="28"/>
+          <w:szCs w:val="28"/>
+        </w:rPr>
+        <w:t xml:space="preserve"> EUR</w:t>
+      </w:r>
+    </w:p>
+    <w:p>
+      <w:pPr>
+        <w:numPr>
+          <w:ilvl w:val="0"/>
+          <w:numId w:val="10"/>
+        </w:numPr>
+        <w:tabs>
+          <w:tab w:val="right" w:leader="dot" w:pos="8505"/>
+        </w:tabs>
+        <w:spacing w:line="360" w:lineRule="auto"/>
+        <w:ind w:left="714" w:hanging="357"/>
+        <w:rPr>
+          <w:bCs/>
+          <w:sz w:val="28"/>
+          <w:szCs w:val="28"/>
+        </w:rPr>
+      </w:pPr>
+      <w:r>
+        <w:rPr>
+          <w:bCs/>
+          <w:sz w:val="28"/>
+          <w:szCs w:val="28"/>
+        </w:rPr>
+        <w:t xml:space="preserve">Lemon Juice </w:t>
+      </w:r>
+      <w:r>
+        <w:rPr>
+          <w:bCs/>
+          <w:sz w:val="28"/>
+          <w:szCs w:val="28"/>
+        </w:rPr>
+        <w:tab/>
+      </w:r>
+      <w:r>
+        <w:rPr>
+          <w:bCs/>
+          <w:sz w:val="28"/>
+          <w:szCs w:val="28"/>
+        </w:rPr>
+        <w:t>1.50</w:t>
+      </w:r>
+      <w:r>
+        <w:rPr>
+          <w:bCs/>
+          <w:sz w:val="28"/>
+          <w:szCs w:val="28"/>
+        </w:rPr>
+        <w:t xml:space="preserve"> EUR</w:t>
+      </w:r>
+    </w:p>
+    <w:p>
+      <w:pPr>
+        <w:numPr>
+          <w:ilvl w:val="0"/>
+          <w:numId w:val="10"/>
+        </w:numPr>
+        <w:tabs>
+          <w:tab w:val="right" w:leader="dot" w:pos="8505"/>
+        </w:tabs>
+        <w:spacing w:line="360" w:lineRule="auto"/>
+        <w:ind w:left="714" w:hanging="357"/>
+        <w:rPr>
+          <w:bCs/>
+          <w:sz w:val="28"/>
+          <w:szCs w:val="28"/>
+        </w:rPr>
+      </w:pPr>
+      <w:r>
+        <w:rPr>
+          <w:bCs/>
+          <w:sz w:val="28"/>
+          <w:szCs w:val="28"/>
+        </w:rPr>
+        <w:t xml:space="preserve">Lime Juice </w:t>
+      </w:r>
+      <w:r>
+        <w:rPr>
+          <w:bCs/>
+          <w:sz w:val="28"/>
+          <w:szCs w:val="28"/>
+        </w:rPr>
+        <w:tab/>
+      </w:r>
+      <w:r>
+        <w:rPr>
+          <w:bCs/>
+          <w:sz w:val="28"/>
+          <w:szCs w:val="28"/>
+        </w:rPr>
+        <w:t>1.50</w:t>
+      </w:r>
+      <w:r>
+        <w:rPr>
+          <w:bCs/>
+          <w:sz w:val="28"/>
+          <w:szCs w:val="28"/>
+        </w:rPr>
+        <w:t xml:space="preserve"> EUR</w:t>
+      </w:r>
+    </w:p>
+    <w:p>
+      <w:pPr>
+        <w:numPr>
+          <w:ilvl w:val="0"/>
+          <w:numId w:val="10"/>
+        </w:numPr>
+        <w:tabs>
+          <w:tab w:val="right" w:leader="dot" w:pos="8505"/>
+        </w:tabs>
+        <w:spacing w:line="360" w:lineRule="auto"/>
+        <w:ind w:left="714" w:hanging="357"/>
+        <w:rPr>
+          <w:bCs/>
+          <w:sz w:val="28"/>
+          <w:szCs w:val="28"/>
+        </w:rPr>
+      </w:pPr>
+      <w:r>
+        <w:rPr>
+          <w:bCs/>
+          <w:sz w:val="28"/>
+          <w:szCs w:val="28"/>
+        </w:rPr>
+        <w:t xml:space="preserve">Tropical Mix </w:t>
+      </w:r>
+      <w:r>
+        <w:rPr>
+          <w:bCs/>
+          <w:sz w:val="28"/>
+          <w:szCs w:val="28"/>
+        </w:rPr>
+        <w:tab/>
+      </w:r>
+      <w:r>
+        <w:rPr>
+          <w:bCs/>
+          <w:sz w:val="28"/>
+          <w:szCs w:val="28"/>
+        </w:rPr>
+        <w:t>1.90</w:t>
+      </w:r>
+      <w:r>
+        <w:rPr>
+          <w:bCs/>
+          <w:sz w:val="28"/>
+          <w:szCs w:val="28"/>
+        </w:rPr>
+        <w:t xml:space="preserve"> EUR</w:t>
+      </w:r>
+    </w:p>
+    <w:p>
+      <w:pPr>
+        <w:numPr>
+          <w:ilvl w:val="0"/>
+          <w:numId w:val="10"/>
+        </w:numPr>
+        <w:tabs>
+          <w:tab w:val="right" w:leader="dot" w:pos="8505"/>
+        </w:tabs>
+        <w:spacing w:line="360" w:lineRule="auto"/>
+        <w:ind w:left="714" w:hanging="357"/>
+        <w:rPr>
+          <w:bCs/>
+          <w:sz w:val="28"/>
+          <w:szCs w:val="28"/>
+        </w:rPr>
+      </w:pPr>
+      <w:r>
+        <w:rPr>
+          <w:bCs/>
+          <w:sz w:val="28"/>
+          <w:szCs w:val="28"/>
+        </w:rPr>
+        <w:t xml:space="preserve">Citrus Mix </w:t>
+      </w:r>
+      <w:r>
+        <w:rPr>
+          <w:bCs/>
+          <w:sz w:val="28"/>
+          <w:szCs w:val="28"/>
+        </w:rPr>
+        <w:tab/>
+      </w:r>
+      <w:r>
+        <w:rPr>
+          <w:bCs/>
+          <w:sz w:val="28"/>
+          <w:szCs w:val="28"/>
+        </w:rPr>
+        <w:t>1.80</w:t>
+      </w:r>
+      <w:r>
+        <w:rPr>
+          <w:bCs/>
+          <w:sz w:val="28"/>
+          <w:szCs w:val="28"/>
+        </w:rPr>
+        <w:t xml:space="preserve"> EUR</w:t>
+      </w:r>
+    </w:p>
+    <w:p>
+      <w:pPr>
+        <w:numPr>
+          <w:ilvl w:val="0"/>
+          <w:numId w:val="10"/>
+        </w:numPr>
+        <w:tabs>
+          <w:tab w:val="right" w:leader="dot" w:pos="8505"/>
+        </w:tabs>
+        <w:spacing w:line="360" w:lineRule="auto"/>
+        <w:ind w:left="714" w:hanging="357"/>
+        <w:rPr>
+          <w:bCs/>
+          <w:sz w:val="28"/>
+          <w:szCs w:val="28"/>
+        </w:rPr>
+      </w:pPr>
+      <w:r>
+        <w:rPr>
+          <w:bCs/>
+          <w:sz w:val="28"/>
+          <w:szCs w:val="28"/>
+        </w:rPr>
+        <w:t xml:space="preserve">Breakfast Blend </w:t>
+      </w:r>
+      <w:r>
+        <w:rPr>
+          <w:bCs/>
+          <w:sz w:val="28"/>
+          <w:szCs w:val="28"/>
+        </w:rPr>
+        <w:tab/>
+      </w:r>
+      <w:r>
+        <w:rPr>
+          <w:bCs/>
+          <w:sz w:val="28"/>
+          <w:szCs w:val="28"/>
+        </w:rPr>
+        <w:t>1.80</w:t>
+      </w:r>
+      <w:r>
+        <w:rPr>
+          <w:bCs/>
+          <w:sz w:val="28"/>
+          <w:szCs w:val="28"/>
+        </w:rPr>
+        <w:t xml:space="preserve"> EUR</w:t>
+      </w:r>
+    </w:p>
+    <w:p>
+      <w:pPr>
+        <w:rPr>
+          <w:bCs/>
+          <w:sz w:val="28"/>
+          <w:szCs w:val="28"/>
+        </w:rPr>
+      </w:pPr>
+      <w:r>
+        <w:rPr>
+          <w:bCs/>
+          <w:sz w:val="28"/>
+          <w:szCs w:val="28"/>
+        </w:rPr>
+        <w:br w:type="page"/>
+      </w:r>
+    </w:p>
+    <w:p>
+      <w:pPr>
+        <w:spacing w:line="360" w:lineRule="auto"/>
+        <w:rPr>
+          <w:b/>
+          <w:bCs/>
+          <w:sz w:val="40"/>
+          <w:szCs w:val="40"/>
+        </w:rPr>
+      </w:pPr>
+      <w:r>
         <w:rPr>
           <w:rFonts w:ascii="Segoe UI Emoji" w:hAnsi="Segoe UI Emoji" w:cs="Segoe UI Emoji"/>
           <w:b/>
           <w:bCs/>
           <w:sz w:val="40"/>
           <w:szCs w:val="40"/>
-          <w:lang w:val="cs-CZ"/>
+        </w:rPr>
+        <w:t>☕️</w:t>
+      </w:r>
+      <w:r>
+        <w:rPr>
+          <w:b/>
+          <w:bCs/>
+          <w:sz w:val="40"/>
+          <w:szCs w:val="40"/>
+        </w:rPr>
+        <w:t xml:space="preserve"> Coffe</w:t>
+      </w:r>
+      <w:r>
+        <w:rPr>
+          <w:b/>
+          <w:bCs/>
+          <w:sz w:val="40"/>
+          <w:szCs w:val="40"/>
+        </w:rPr>
+        <w:t>e</w:t>
+      </w:r>
+    </w:p>
+    <w:p>
+      <w:pPr>
+        <w:numPr>
+          <w:ilvl w:val="0"/>
+          <w:numId w:val="12"/>
+        </w:numPr>
+        <w:tabs>
+          <w:tab w:val="right" w:leader="dot" w:pos="8505"/>
+        </w:tabs>
+        <w:spacing w:line="360" w:lineRule="auto"/>
+        <w:ind w:left="714" w:hanging="357"/>
+        <w:rPr>
+          <w:sz w:val="28"/>
+          <w:szCs w:val="28"/>
+        </w:rPr>
+      </w:pPr>
+      <w:r>
+        <w:rPr>
+          <w:sz w:val="28"/>
+          <w:szCs w:val="28"/>
+        </w:rPr>
+        <w:t xml:space="preserve">Espresso </w:t>
+      </w:r>
+      <w:r>
+        <w:rPr>
+          <w:sz w:val="28"/>
+          <w:szCs w:val="28"/>
+        </w:rPr>
+        <w:tab/>
+      </w:r>
+      <w:r>
+        <w:rPr>
+          <w:sz w:val="28"/>
+          <w:szCs w:val="28"/>
+        </w:rPr>
+        <w:t>1.40</w:t>
+      </w:r>
+      <w:r>
+        <w:rPr>
+          <w:sz w:val="28"/>
+          <w:szCs w:val="28"/>
+        </w:rPr>
+        <w:t xml:space="preserve"> EUR</w:t>
+      </w:r>
+    </w:p>
+    <w:p>
+      <w:pPr>
+        <w:numPr>
+          <w:ilvl w:val="0"/>
+          <w:numId w:val="12"/>
+        </w:numPr>
+        <w:tabs>
+          <w:tab w:val="right" w:leader="dot" w:pos="8505"/>
+        </w:tabs>
+        <w:spacing w:line="360" w:lineRule="auto"/>
+        <w:ind w:left="714" w:hanging="357"/>
+        <w:rPr>
+          <w:sz w:val="28"/>
+          <w:szCs w:val="28"/>
+        </w:rPr>
+      </w:pPr>
+      <w:r>
+        <w:rPr>
+          <w:sz w:val="28"/>
+          <w:szCs w:val="28"/>
+        </w:rPr>
+        <w:t xml:space="preserve">Double Espresso </w:t>
+      </w:r>
+      <w:r>
+        <w:rPr>
+          <w:sz w:val="28"/>
+          <w:szCs w:val="28"/>
+        </w:rPr>
+        <w:tab/>
+      </w:r>
+      <w:r>
+        <w:rPr>
+          <w:sz w:val="28"/>
+          <w:szCs w:val="28"/>
+        </w:rPr>
+        <w:t>1.90</w:t>
+      </w:r>
+      <w:r>
+        <w:rPr>
+          <w:sz w:val="28"/>
+          <w:szCs w:val="28"/>
+        </w:rPr>
+        <w:t xml:space="preserve"> EUR</w:t>
+      </w:r>
+    </w:p>
+    <w:p>
+      <w:pPr>
+        <w:numPr>
+          <w:ilvl w:val="0"/>
+          <w:numId w:val="12"/>
+        </w:numPr>
+        <w:tabs>
+          <w:tab w:val="right" w:leader="dot" w:pos="8505"/>
+        </w:tabs>
+        <w:spacing w:line="360" w:lineRule="auto"/>
+        <w:ind w:left="714" w:hanging="357"/>
+        <w:rPr>
+          <w:sz w:val="28"/>
+          <w:szCs w:val="28"/>
+        </w:rPr>
+      </w:pPr>
+      <w:r>
+        <w:rPr>
+          <w:sz w:val="28"/>
+          <w:szCs w:val="28"/>
+        </w:rPr>
+        <w:t xml:space="preserve">Americano </w:t>
+      </w:r>
+      <w:r>
+        <w:rPr>
+          <w:sz w:val="28"/>
+          <w:szCs w:val="28"/>
+        </w:rPr>
+        <w:tab/>
+      </w:r>
+      <w:r>
+        <w:rPr>
+          <w:sz w:val="28"/>
+          <w:szCs w:val="28"/>
+        </w:rPr>
+        <w:t>1.60</w:t>
+      </w:r>
+      <w:r>
+        <w:rPr>
+          <w:sz w:val="28"/>
+          <w:szCs w:val="28"/>
+        </w:rPr>
+        <w:t xml:space="preserve"> EUR </w:t>
+      </w:r>
+    </w:p>
+    <w:p>
+      <w:pPr>
+        <w:numPr>
+          <w:ilvl w:val="0"/>
+          <w:numId w:val="12"/>
+        </w:numPr>
+        <w:tabs>
+          <w:tab w:val="right" w:leader="dot" w:pos="8505"/>
+        </w:tabs>
+        <w:spacing w:line="360" w:lineRule="auto"/>
+        <w:ind w:left="714" w:hanging="357"/>
+        <w:rPr>
+          <w:sz w:val="28"/>
+          <w:szCs w:val="28"/>
+        </w:rPr>
+      </w:pPr>
+      <w:r>
+        <w:rPr>
+          <w:sz w:val="28"/>
+          <w:szCs w:val="28"/>
+        </w:rPr>
+        <w:t xml:space="preserve">Cappuccino </w:t>
+      </w:r>
+      <w:r>
+        <w:rPr>
+          <w:sz w:val="28"/>
+          <w:szCs w:val="28"/>
+        </w:rPr>
+        <w:tab/>
+      </w:r>
+      <w:r>
+        <w:rPr>
+          <w:sz w:val="28"/>
+          <w:szCs w:val="28"/>
+        </w:rPr>
+        <w:t>1.90</w:t>
+      </w:r>
+      <w:r>
+        <w:rPr>
+          <w:sz w:val="28"/>
+          <w:szCs w:val="28"/>
+        </w:rPr>
+        <w:t xml:space="preserve"> EUR</w:t>
+      </w:r>
+    </w:p>
+    <w:p>
+      <w:pPr>
+        <w:numPr>
+          <w:ilvl w:val="0"/>
+          <w:numId w:val="12"/>
+        </w:numPr>
+        <w:tabs>
+          <w:tab w:val="right" w:leader="dot" w:pos="8505"/>
+        </w:tabs>
+        <w:spacing w:line="360" w:lineRule="auto"/>
+        <w:ind w:left="714" w:hanging="357"/>
+        <w:rPr>
+          <w:sz w:val="28"/>
+          <w:szCs w:val="28"/>
+        </w:rPr>
+      </w:pPr>
+      <w:r>
+        <w:rPr>
+          <w:sz w:val="28"/>
+          <w:szCs w:val="28"/>
+        </w:rPr>
+        <w:t xml:space="preserve">Caffè Latte </w:t>
+      </w:r>
+      <w:r>
+        <w:rPr>
+          <w:sz w:val="28"/>
+          <w:szCs w:val="28"/>
+        </w:rPr>
+        <w:tab/>
+      </w:r>
+      <w:r>
+        <w:rPr>
+          <w:sz w:val="28"/>
+          <w:szCs w:val="28"/>
+        </w:rPr>
+        <w:t>2.10</w:t>
+      </w:r>
+      <w:r>
+        <w:rPr>
+          <w:sz w:val="28"/>
+          <w:szCs w:val="28"/>
+        </w:rPr>
+        <w:t xml:space="preserve"> EUR</w:t>
+      </w:r>
+    </w:p>
+    <w:p>
+      <w:pPr>
+        <w:numPr>
+          <w:ilvl w:val="0"/>
+          <w:numId w:val="12"/>
+        </w:numPr>
+        <w:tabs>
+          <w:tab w:val="right" w:leader="dot" w:pos="8505"/>
+        </w:tabs>
+        <w:spacing w:line="360" w:lineRule="auto"/>
+        <w:ind w:left="714" w:hanging="357"/>
+        <w:rPr>
+          <w:sz w:val="28"/>
+          <w:szCs w:val="28"/>
+        </w:rPr>
+      </w:pPr>
+      <w:r>
+        <w:rPr>
+          <w:sz w:val="28"/>
+          <w:szCs w:val="28"/>
+        </w:rPr>
+        <w:t xml:space="preserve">Flat White </w:t>
+      </w:r>
+      <w:r>
+        <w:rPr>
+          <w:sz w:val="28"/>
+          <w:szCs w:val="28"/>
+        </w:rPr>
+        <w:tab/>
+      </w:r>
+      <w:r>
+        <w:rPr>
+          <w:sz w:val="28"/>
+          <w:szCs w:val="28"/>
+        </w:rPr>
+        <w:t>2.30</w:t>
+      </w:r>
+      <w:r>
+        <w:rPr>
+          <w:sz w:val="28"/>
+          <w:szCs w:val="28"/>
+        </w:rPr>
+        <w:t xml:space="preserve"> EUR</w:t>
+      </w:r>
+    </w:p>
+    <w:p>
+      <w:pPr>
+        <w:numPr>
+          <w:ilvl w:val="0"/>
+          <w:numId w:val="12"/>
+        </w:numPr>
+        <w:tabs>
+          <w:tab w:val="right" w:leader="dot" w:pos="8505"/>
+        </w:tabs>
+        <w:spacing w:line="360" w:lineRule="auto"/>
+        <w:ind w:left="714" w:hanging="357"/>
+        <w:rPr>
+          <w:sz w:val="28"/>
+          <w:szCs w:val="28"/>
+        </w:rPr>
+      </w:pPr>
+      <w:r>
+        <w:rPr>
+          <w:sz w:val="28"/>
+          <w:szCs w:val="28"/>
+        </w:rPr>
+        <w:t xml:space="preserve">Mocha </w:t>
+      </w:r>
+      <w:r>
+        <w:rPr>
+          <w:sz w:val="28"/>
+          <w:szCs w:val="28"/>
+        </w:rPr>
+        <w:tab/>
+      </w:r>
+      <w:r>
+        <w:rPr>
+          <w:sz w:val="28"/>
+          <w:szCs w:val="28"/>
+        </w:rPr>
+        <w:t>2.40</w:t>
+      </w:r>
+      <w:r>
+        <w:rPr>
+          <w:sz w:val="28"/>
+          <w:szCs w:val="28"/>
+        </w:rPr>
+        <w:t xml:space="preserve"> EUR</w:t>
+      </w:r>
+    </w:p>
+    <w:p>
+      <w:pPr>
+        <w:numPr>
+          <w:ilvl w:val="0"/>
+          <w:numId w:val="12"/>
+        </w:numPr>
+        <w:tabs>
+          <w:tab w:val="right" w:leader="dot" w:pos="8505"/>
+        </w:tabs>
+        <w:spacing w:line="360" w:lineRule="auto"/>
+        <w:ind w:left="714" w:hanging="357"/>
+        <w:rPr>
+          <w:sz w:val="28"/>
+          <w:szCs w:val="28"/>
+        </w:rPr>
+      </w:pPr>
+      <w:r>
+        <w:rPr>
+          <w:sz w:val="28"/>
+          <w:szCs w:val="28"/>
+        </w:rPr>
+        <w:t xml:space="preserve">Iced Latte </w:t>
+      </w:r>
+      <w:r>
+        <w:rPr>
+          <w:sz w:val="28"/>
+          <w:szCs w:val="28"/>
+        </w:rPr>
+        <w:tab/>
+      </w:r>
+      <w:r>
+        <w:rPr>
+          <w:sz w:val="28"/>
+          <w:szCs w:val="28"/>
+        </w:rPr>
+        <w:t>2.20</w:t>
+      </w:r>
+      <w:r>
+        <w:rPr>
+          <w:sz w:val="28"/>
+          <w:szCs w:val="28"/>
+        </w:rPr>
+        <w:t xml:space="preserve"> EUR</w:t>
+      </w:r>
+    </w:p>
+    <w:p>
+      <w:pPr>
+        <w:numPr>
+          <w:ilvl w:val="0"/>
+          <w:numId w:val="12"/>
+        </w:numPr>
+        <w:tabs>
+          <w:tab w:val="right" w:leader="dot" w:pos="8505"/>
+        </w:tabs>
+        <w:spacing w:line="360" w:lineRule="auto"/>
+        <w:ind w:left="714" w:hanging="357"/>
+        <w:rPr>
+          <w:sz w:val="28"/>
+          <w:szCs w:val="28"/>
+        </w:rPr>
+      </w:pPr>
+      <w:r>
+        <w:rPr>
+          <w:sz w:val="28"/>
+          <w:szCs w:val="28"/>
+        </w:rPr>
+        <w:t xml:space="preserve">Macchiato </w:t>
+      </w:r>
+      <w:r>
+        <w:rPr>
+          <w:sz w:val="28"/>
+          <w:szCs w:val="28"/>
+        </w:rPr>
+        <w:tab/>
+      </w:r>
+      <w:r>
+        <w:rPr>
+          <w:sz w:val="28"/>
+          <w:szCs w:val="28"/>
+        </w:rPr>
+        <w:t>1.70</w:t>
+      </w:r>
+      <w:r>
+        <w:rPr>
+          <w:sz w:val="28"/>
+          <w:szCs w:val="28"/>
+        </w:rPr>
+        <w:t xml:space="preserve"> EUR</w:t>
+      </w:r>
+    </w:p>
+    <w:p>
+      <w:pPr>
+        <w:numPr>
+          <w:ilvl w:val="0"/>
+          <w:numId w:val="12"/>
+        </w:numPr>
+        <w:tabs>
+          <w:tab w:val="right" w:leader="dot" w:pos="8505"/>
+        </w:tabs>
+        <w:spacing w:line="360" w:lineRule="auto"/>
+        <w:ind w:left="714" w:hanging="357"/>
+        <w:rPr>
+          <w:sz w:val="28"/>
+          <w:szCs w:val="28"/>
+        </w:rPr>
+      </w:pPr>
+      <w:r>
+        <w:rPr>
+          <w:sz w:val="28"/>
+          <w:szCs w:val="28"/>
+        </w:rPr>
+        <w:t xml:space="preserve">Cortado </w:t>
+      </w:r>
+      <w:r>
+        <w:rPr>
+          <w:sz w:val="28"/>
+          <w:szCs w:val="28"/>
+        </w:rPr>
+        <w:tab/>
+      </w:r>
+      <w:r>
+        <w:rPr>
+          <w:sz w:val="28"/>
+          <w:szCs w:val="28"/>
+        </w:rPr>
+        <w:t>1.80</w:t>
+      </w:r>
+      <w:r>
+        <w:rPr>
+          <w:sz w:val="28"/>
+          <w:szCs w:val="28"/>
+        </w:rPr>
+        <w:t xml:space="preserve"> EUR</w:t>
+      </w:r>
+    </w:p>
+    <w:p>
+      <w:pPr>
+        <w:numPr>
+          <w:ilvl w:val="0"/>
+          <w:numId w:val="12"/>
+        </w:numPr>
+        <w:tabs>
+          <w:tab w:val="right" w:leader="dot" w:pos="8505"/>
+        </w:tabs>
+        <w:spacing w:line="360" w:lineRule="auto"/>
+        <w:ind w:left="714" w:hanging="357"/>
+        <w:rPr>
+          <w:sz w:val="28"/>
+          <w:szCs w:val="28"/>
+        </w:rPr>
+      </w:pPr>
+      <w:r>
+        <w:rPr>
+          <w:sz w:val="28"/>
+          <w:szCs w:val="28"/>
+        </w:rPr>
+        <w:t xml:space="preserve">Decaf Coffee </w:t>
+      </w:r>
+      <w:r>
+        <w:rPr>
+          <w:sz w:val="28"/>
+          <w:szCs w:val="28"/>
+        </w:rPr>
+        <w:tab/>
+      </w:r>
+      <w:r>
+        <w:rPr>
+          <w:sz w:val="28"/>
+          <w:szCs w:val="28"/>
+        </w:rPr>
+        <w:t>1.60</w:t>
+      </w:r>
+      <w:r>
+        <w:rPr>
+          <w:sz w:val="28"/>
+          <w:szCs w:val="28"/>
+        </w:rPr>
+        <w:t xml:space="preserve"> EUR</w:t>
+      </w:r>
+    </w:p>
+    <w:p>
+      <w:pPr>
+        <w:rPr>
+          <w:sz w:val="28"/>
+          <w:szCs w:val="28"/>
+        </w:rPr>
+      </w:pPr>
+      <w:r>
+        <w:rPr>
+          <w:sz w:val="28"/>
+          <w:szCs w:val="28"/>
+        </w:rPr>
+        <w:br w:type="page"/>
+      </w:r>
+    </w:p>
+    <w:p>
+      <w:pPr>
+        <w:spacing w:line="360" w:lineRule="auto"/>
+        <w:rPr>
+          <w:b/>
+          <w:bCs/>
+          <w:sz w:val="40"/>
+          <w:szCs w:val="40"/>
         </w:rPr>
       </w:pPr>
       <w:r>
@@ -108,527 +1569,306 @@
           <w:bCs/>
           <w:sz w:val="40"/>
           <w:szCs w:val="40"/>
-          <w:lang w:val="cs-CZ"/>
-        </w:rPr>
-        <w:drawing>
-          <wp:inline distT="0" distB="0" distL="0" distR="0" wp14:anchorId="51DE5FFC" wp14:editId="5B1524CE">
-            <wp:extent cx="5620534" cy="3534268"/>
-            <wp:effectExtent l="0" t="0" r="0" b="9525"/>
-            <wp:docPr id="645450266" name="Picture 1"/>
-            <wp:cNvGraphicFramePr>
-              <a:graphicFrameLocks xmlns:a="http://schemas.openxmlformats.org/drawingml/2006/main" noChangeAspect="1"/>
-            </wp:cNvGraphicFramePr>
-            <a:graphic xmlns:a="http://schemas.openxmlformats.org/drawingml/2006/main">
-              <a:graphicData uri="http://schemas.openxmlformats.org/drawingml/2006/picture">
-                <pic:pic xmlns:pic="http://schemas.openxmlformats.org/drawingml/2006/picture">
-                  <pic:nvPicPr>
-                    <pic:cNvPr id="645450266" name=""/>
-                    <pic:cNvPicPr/>
-                  </pic:nvPicPr>
-                  <pic:blipFill>
-                    <a:blip r:embed="rId8"/>
-                    <a:stretch>
-                      <a:fillRect/>
-                    </a:stretch>
-                  </pic:blipFill>
-                  <pic:spPr>
-                    <a:xfrm>
-                      <a:off x="0" y="0"/>
-                      <a:ext cx="5620534" cy="3534268"/>
-                    </a:xfrm>
-                    <a:prstGeom prst="rect">
-                      <a:avLst/>
-                    </a:prstGeom>
-                  </pic:spPr>
-                </pic:pic>
-              </a:graphicData>
-            </a:graphic>
-          </wp:inline>
-        </w:drawing>
+        </w:rPr>
+        <w:t>🥫</w:t>
+      </w:r>
+      <w:r>
+        <w:rPr>
+          <w:b/>
+          <w:bCs/>
+          <w:sz w:val="40"/>
+          <w:szCs w:val="40"/>
+        </w:rPr>
+        <w:t xml:space="preserve"> Sodas</w:t>
       </w:r>
     </w:p>
     <w:p>
       <w:pPr>
-        <w:rPr>
-          <w:rFonts w:ascii="Segoe UI Emoji" w:hAnsi="Segoe UI Emoji" w:cs="Segoe UI Emoji"/>
-          <w:b/>
-          <w:bCs/>
-          <w:sz w:val="40"/>
-          <w:szCs w:val="40"/>
+        <w:numPr>
+          <w:ilvl w:val="0"/>
+          <w:numId w:val="13"/>
+        </w:numPr>
+        <w:tabs>
+          <w:tab w:val="right" w:leader="dot" w:pos="8505"/>
+        </w:tabs>
+        <w:spacing w:line="360" w:lineRule="auto"/>
+        <w:ind w:left="714" w:hanging="357"/>
+        <w:rPr>
+          <w:sz w:val="28"/>
+          <w:szCs w:val="28"/>
           <w:lang w:val="cs-CZ"/>
         </w:rPr>
       </w:pPr>
+      <w:r>
+        <w:rPr>
+          <w:sz w:val="28"/>
+          <w:szCs w:val="28"/>
+          <w:lang w:val="cs-CZ"/>
+        </w:rPr>
+        <w:t>Coca</w:t>
+      </w:r>
+      <w:r>
+        <w:rPr>
+          <w:sz w:val="28"/>
+          <w:szCs w:val="28"/>
+          <w:lang w:val="cs-CZ"/>
+        </w:rPr>
+        <w:noBreakHyphen/>
+        <w:t xml:space="preserve">Cola </w:t>
+      </w:r>
+      <w:r>
+        <w:rPr>
+          <w:sz w:val="28"/>
+          <w:szCs w:val="28"/>
+          <w:lang w:val="cs-CZ"/>
+        </w:rPr>
+        <w:tab/>
+      </w:r>
+      <w:r>
+        <w:rPr>
+          <w:sz w:val="28"/>
+          <w:szCs w:val="28"/>
+          <w:lang w:val="cs-CZ"/>
+        </w:rPr>
+        <w:t>1.80</w:t>
+      </w:r>
+      <w:r>
+        <w:rPr>
+          <w:sz w:val="28"/>
+          <w:szCs w:val="28"/>
+          <w:lang w:val="cs-CZ"/>
+        </w:rPr>
+        <w:t xml:space="preserve"> EUR</w:t>
+      </w:r>
     </w:p>
     <w:p>
       <w:pPr>
-        <w:rPr>
-          <w:rFonts w:ascii="Segoe UI Emoji" w:hAnsi="Segoe UI Emoji" w:cs="Segoe UI Emoji"/>
-          <w:b/>
-          <w:bCs/>
-          <w:sz w:val="40"/>
-          <w:szCs w:val="40"/>
+        <w:numPr>
+          <w:ilvl w:val="0"/>
+          <w:numId w:val="13"/>
+        </w:numPr>
+        <w:tabs>
+          <w:tab w:val="right" w:leader="dot" w:pos="8505"/>
+        </w:tabs>
+        <w:spacing w:line="360" w:lineRule="auto"/>
+        <w:ind w:left="714" w:hanging="357"/>
+        <w:rPr>
+          <w:sz w:val="28"/>
+          <w:szCs w:val="28"/>
           <w:lang w:val="cs-CZ"/>
         </w:rPr>
       </w:pPr>
       <w:r>
         <w:rPr>
-          <w:rFonts w:ascii="Segoe UI Emoji" w:hAnsi="Segoe UI Emoji" w:cs="Segoe UI Emoji"/>
-          <w:b/>
-          <w:bCs/>
-          <w:sz w:val="40"/>
-          <w:szCs w:val="40"/>
+          <w:sz w:val="28"/>
+          <w:szCs w:val="28"/>
           <w:lang w:val="cs-CZ"/>
         </w:rPr>
-        <w:lastRenderedPageBreak/>
-        <w:drawing>
-          <wp:inline distT="0" distB="0" distL="0" distR="0" wp14:anchorId="3B39344A" wp14:editId="1C97CD02">
-            <wp:extent cx="5153744" cy="3858163"/>
-            <wp:effectExtent l="0" t="0" r="8890" b="9525"/>
-            <wp:docPr id="1558188709" name="Picture 1"/>
-            <wp:cNvGraphicFramePr>
-              <a:graphicFrameLocks xmlns:a="http://schemas.openxmlformats.org/drawingml/2006/main" noChangeAspect="1"/>
-            </wp:cNvGraphicFramePr>
-            <a:graphic xmlns:a="http://schemas.openxmlformats.org/drawingml/2006/main">
-              <a:graphicData uri="http://schemas.openxmlformats.org/drawingml/2006/picture">
-                <pic:pic xmlns:pic="http://schemas.openxmlformats.org/drawingml/2006/picture">
-                  <pic:nvPicPr>
-                    <pic:cNvPr id="1558188709" name=""/>
-                    <pic:cNvPicPr/>
-                  </pic:nvPicPr>
-                  <pic:blipFill>
-                    <a:blip r:embed="rId9"/>
-                    <a:stretch>
-                      <a:fillRect/>
-                    </a:stretch>
-                  </pic:blipFill>
-                  <pic:spPr>
-                    <a:xfrm>
-                      <a:off x="0" y="0"/>
-                      <a:ext cx="5153744" cy="3858163"/>
-                    </a:xfrm>
-                    <a:prstGeom prst="rect">
-                      <a:avLst/>
-                    </a:prstGeom>
-                  </pic:spPr>
-                </pic:pic>
-              </a:graphicData>
-            </a:graphic>
-          </wp:inline>
-        </w:drawing>
+        <w:t>Coca</w:t>
+      </w:r>
+      <w:r>
+        <w:rPr>
+          <w:sz w:val="28"/>
+          <w:szCs w:val="28"/>
+          <w:lang w:val="cs-CZ"/>
+        </w:rPr>
+        <w:noBreakHyphen/>
+        <w:t xml:space="preserve">Cola </w:t>
+      </w:r>
+      <w:proofErr w:type="spellStart"/>
+      <w:r>
+        <w:rPr>
+          <w:sz w:val="28"/>
+          <w:szCs w:val="28"/>
+          <w:lang w:val="cs-CZ"/>
+        </w:rPr>
+        <w:t>Zero</w:t>
+      </w:r>
+      <w:proofErr w:type="spellEnd"/>
+      <w:r>
+        <w:rPr>
+          <w:sz w:val="28"/>
+          <w:szCs w:val="28"/>
+          <w:lang w:val="cs-CZ"/>
+        </w:rPr>
+        <w:t xml:space="preserve"> </w:t>
+      </w:r>
+      <w:r>
+        <w:rPr>
+          <w:sz w:val="28"/>
+          <w:szCs w:val="28"/>
+          <w:lang w:val="cs-CZ"/>
+        </w:rPr>
+        <w:tab/>
+      </w:r>
+      <w:r>
+        <w:rPr>
+          <w:sz w:val="28"/>
+          <w:szCs w:val="28"/>
+          <w:lang w:val="cs-CZ"/>
+        </w:rPr>
+        <w:t>1.8</w:t>
+      </w:r>
+      <w:r>
+        <w:rPr>
+          <w:sz w:val="28"/>
+          <w:szCs w:val="28"/>
+          <w:lang w:val="cs-CZ"/>
+        </w:rPr>
+        <w:t>0 EUR</w:t>
       </w:r>
     </w:p>
     <w:p>
       <w:pPr>
-        <w:rPr>
-          <w:rFonts w:ascii="Segoe UI Emoji" w:hAnsi="Segoe UI Emoji" w:cs="Segoe UI Emoji"/>
-          <w:b/>
-          <w:bCs/>
-          <w:sz w:val="40"/>
-          <w:szCs w:val="40"/>
+        <w:numPr>
+          <w:ilvl w:val="0"/>
+          <w:numId w:val="13"/>
+        </w:numPr>
+        <w:tabs>
+          <w:tab w:val="right" w:leader="dot" w:pos="8505"/>
+        </w:tabs>
+        <w:spacing w:line="360" w:lineRule="auto"/>
+        <w:ind w:left="714" w:hanging="357"/>
+        <w:rPr>
+          <w:sz w:val="28"/>
+          <w:szCs w:val="28"/>
           <w:lang w:val="cs-CZ"/>
         </w:rPr>
       </w:pPr>
       <w:r>
         <w:rPr>
-          <w:rFonts w:ascii="Segoe UI Emoji" w:hAnsi="Segoe UI Emoji" w:cs="Segoe UI Emoji"/>
-          <w:b/>
-          <w:bCs/>
-          <w:sz w:val="40"/>
-          <w:szCs w:val="40"/>
+          <w:sz w:val="28"/>
+          <w:szCs w:val="28"/>
           <w:lang w:val="cs-CZ"/>
         </w:rPr>
-        <w:drawing>
-          <wp:inline distT="0" distB="0" distL="0" distR="0" wp14:anchorId="68DAF76D" wp14:editId="3352ED36">
-            <wp:extent cx="3372321" cy="4220164"/>
-            <wp:effectExtent l="0" t="0" r="0" b="9525"/>
-            <wp:docPr id="1979513361" name="Picture 1"/>
-            <wp:cNvGraphicFramePr>
-              <a:graphicFrameLocks xmlns:a="http://schemas.openxmlformats.org/drawingml/2006/main" noChangeAspect="1"/>
-            </wp:cNvGraphicFramePr>
-            <a:graphic xmlns:a="http://schemas.openxmlformats.org/drawingml/2006/main">
-              <a:graphicData uri="http://schemas.openxmlformats.org/drawingml/2006/picture">
-                <pic:pic xmlns:pic="http://schemas.openxmlformats.org/drawingml/2006/picture">
-                  <pic:nvPicPr>
-                    <pic:cNvPr id="1979513361" name=""/>
-                    <pic:cNvPicPr/>
-                  </pic:nvPicPr>
-                  <pic:blipFill>
-                    <a:blip r:embed="rId10"/>
-                    <a:stretch>
-                      <a:fillRect/>
-                    </a:stretch>
-                  </pic:blipFill>
-                  <pic:spPr>
-                    <a:xfrm>
-                      <a:off x="0" y="0"/>
-                      <a:ext cx="3372321" cy="4220164"/>
-                    </a:xfrm>
-                    <a:prstGeom prst="rect">
-                      <a:avLst/>
-                    </a:prstGeom>
-                  </pic:spPr>
-                </pic:pic>
-              </a:graphicData>
-            </a:graphic>
-          </wp:inline>
-        </w:drawing>
+        <w:t xml:space="preserve">Fanta Orange </w:t>
+      </w:r>
+      <w:r>
+        <w:rPr>
+          <w:sz w:val="28"/>
+          <w:szCs w:val="28"/>
+          <w:lang w:val="cs-CZ"/>
+        </w:rPr>
+        <w:tab/>
+      </w:r>
+      <w:r>
+        <w:rPr>
+          <w:sz w:val="28"/>
+          <w:szCs w:val="28"/>
+          <w:lang w:val="cs-CZ"/>
+        </w:rPr>
+        <w:t>1.7</w:t>
+      </w:r>
+      <w:r>
+        <w:rPr>
+          <w:sz w:val="28"/>
+          <w:szCs w:val="28"/>
+          <w:lang w:val="cs-CZ"/>
+        </w:rPr>
+        <w:t>0 EUR</w:t>
       </w:r>
     </w:p>
     <w:p>
       <w:pPr>
-        <w:rPr>
-          <w:rFonts w:ascii="Segoe UI Emoji" w:hAnsi="Segoe UI Emoji" w:cs="Segoe UI Emoji"/>
-          <w:b/>
-          <w:bCs/>
-          <w:sz w:val="40"/>
-          <w:szCs w:val="40"/>
+        <w:numPr>
+          <w:ilvl w:val="0"/>
+          <w:numId w:val="13"/>
+        </w:numPr>
+        <w:tabs>
+          <w:tab w:val="right" w:leader="dot" w:pos="8505"/>
+        </w:tabs>
+        <w:spacing w:line="360" w:lineRule="auto"/>
+        <w:ind w:left="714" w:hanging="357"/>
+        <w:rPr>
+          <w:sz w:val="28"/>
+          <w:szCs w:val="28"/>
           <w:lang w:val="cs-CZ"/>
         </w:rPr>
       </w:pPr>
       <w:r>
         <w:rPr>
-          <w:rFonts w:ascii="Segoe UI Emoji" w:hAnsi="Segoe UI Emoji" w:cs="Segoe UI Emoji"/>
-          <w:b/>
-          <w:bCs/>
-          <w:sz w:val="40"/>
-          <w:szCs w:val="40"/>
+          <w:sz w:val="28"/>
+          <w:szCs w:val="28"/>
           <w:lang w:val="cs-CZ"/>
         </w:rPr>
-        <w:lastRenderedPageBreak/>
-        <w:drawing>
-          <wp:inline distT="0" distB="0" distL="0" distR="0" wp14:anchorId="61176286" wp14:editId="592B87FF">
-            <wp:extent cx="4753638" cy="4706007"/>
-            <wp:effectExtent l="0" t="0" r="8890" b="0"/>
-            <wp:docPr id="1445636400" name="Picture 1"/>
-            <wp:cNvGraphicFramePr>
-              <a:graphicFrameLocks xmlns:a="http://schemas.openxmlformats.org/drawingml/2006/main" noChangeAspect="1"/>
-            </wp:cNvGraphicFramePr>
-            <a:graphic xmlns:a="http://schemas.openxmlformats.org/drawingml/2006/main">
-              <a:graphicData uri="http://schemas.openxmlformats.org/drawingml/2006/picture">
-                <pic:pic xmlns:pic="http://schemas.openxmlformats.org/drawingml/2006/picture">
-                  <pic:nvPicPr>
-                    <pic:cNvPr id="1445636400" name=""/>
-                    <pic:cNvPicPr/>
-                  </pic:nvPicPr>
-                  <pic:blipFill>
-                    <a:blip r:embed="rId11"/>
-                    <a:stretch>
-                      <a:fillRect/>
-                    </a:stretch>
-                  </pic:blipFill>
-                  <pic:spPr>
-                    <a:xfrm>
-                      <a:off x="0" y="0"/>
-                      <a:ext cx="4753638" cy="4706007"/>
-                    </a:xfrm>
-                    <a:prstGeom prst="rect">
-                      <a:avLst/>
-                    </a:prstGeom>
-                  </pic:spPr>
-                </pic:pic>
-              </a:graphicData>
-            </a:graphic>
-          </wp:inline>
-        </w:drawing>
+        <w:t>Fanta Lemon</w:t>
+      </w:r>
+      <w:r>
+        <w:rPr>
+          <w:sz w:val="28"/>
+          <w:szCs w:val="28"/>
+          <w:lang w:val="cs-CZ"/>
+        </w:rPr>
+        <w:tab/>
+      </w:r>
+      <w:r>
+        <w:rPr>
+          <w:sz w:val="28"/>
+          <w:szCs w:val="28"/>
+          <w:lang w:val="cs-CZ"/>
+        </w:rPr>
+        <w:t>1.7</w:t>
+      </w:r>
+      <w:r>
+        <w:rPr>
+          <w:sz w:val="28"/>
+          <w:szCs w:val="28"/>
+          <w:lang w:val="cs-CZ"/>
+        </w:rPr>
+        <w:t>0 EUR</w:t>
       </w:r>
     </w:p>
     <w:p>
       <w:pPr>
-        <w:rPr>
-          <w:rFonts w:ascii="Segoe UI Emoji" w:hAnsi="Segoe UI Emoji" w:cs="Segoe UI Emoji"/>
-          <w:b/>
-          <w:bCs/>
-          <w:sz w:val="40"/>
-          <w:szCs w:val="40"/>
+        <w:numPr>
+          <w:ilvl w:val="0"/>
+          <w:numId w:val="13"/>
+        </w:numPr>
+        <w:tabs>
+          <w:tab w:val="right" w:leader="dot" w:pos="8505"/>
+        </w:tabs>
+        <w:spacing w:line="360" w:lineRule="auto"/>
+        <w:ind w:left="714" w:hanging="357"/>
+        <w:rPr>
+          <w:sz w:val="28"/>
+          <w:szCs w:val="28"/>
           <w:lang w:val="cs-CZ"/>
         </w:rPr>
       </w:pPr>
       <w:r>
         <w:rPr>
-          <w:rFonts w:ascii="Segoe UI Emoji" w:hAnsi="Segoe UI Emoji" w:cs="Segoe UI Emoji"/>
-          <w:b/>
-          <w:bCs/>
-          <w:sz w:val="40"/>
-          <w:szCs w:val="40"/>
+          <w:sz w:val="28"/>
+          <w:szCs w:val="28"/>
           <w:lang w:val="cs-CZ"/>
         </w:rPr>
-        <w:lastRenderedPageBreak/>
-        <w:drawing>
-          <wp:inline distT="0" distB="0" distL="0" distR="0" wp14:anchorId="5557E572" wp14:editId="280A2D5E">
-            <wp:extent cx="3248478" cy="3562847"/>
-            <wp:effectExtent l="0" t="0" r="9525" b="0"/>
-            <wp:docPr id="2082637014" name="Picture 1"/>
-            <wp:cNvGraphicFramePr>
-              <a:graphicFrameLocks xmlns:a="http://schemas.openxmlformats.org/drawingml/2006/main" noChangeAspect="1"/>
-            </wp:cNvGraphicFramePr>
-            <a:graphic xmlns:a="http://schemas.openxmlformats.org/drawingml/2006/main">
-              <a:graphicData uri="http://schemas.openxmlformats.org/drawingml/2006/picture">
-                <pic:pic xmlns:pic="http://schemas.openxmlformats.org/drawingml/2006/picture">
-                  <pic:nvPicPr>
-                    <pic:cNvPr id="2082637014" name=""/>
-                    <pic:cNvPicPr/>
-                  </pic:nvPicPr>
-                  <pic:blipFill>
-                    <a:blip r:embed="rId12"/>
-                    <a:stretch>
-                      <a:fillRect/>
-                    </a:stretch>
-                  </pic:blipFill>
-                  <pic:spPr>
-                    <a:xfrm>
-                      <a:off x="0" y="0"/>
-                      <a:ext cx="3248478" cy="3562847"/>
-                    </a:xfrm>
-                    <a:prstGeom prst="rect">
-                      <a:avLst/>
-                    </a:prstGeom>
-                  </pic:spPr>
-                </pic:pic>
-              </a:graphicData>
-            </a:graphic>
-          </wp:inline>
-        </w:drawing>
-      </w:r>
-    </w:p>
-    <w:p>
-      <w:pPr>
-        <w:rPr>
-          <w:rFonts w:ascii="Segoe UI Emoji" w:hAnsi="Segoe UI Emoji" w:cs="Segoe UI Emoji"/>
-          <w:b/>
-          <w:bCs/>
-          <w:sz w:val="40"/>
-          <w:szCs w:val="40"/>
+        <w:t xml:space="preserve">Sprite </w:t>
+      </w:r>
+      <w:r>
+        <w:rPr>
+          <w:sz w:val="28"/>
+          <w:szCs w:val="28"/>
           <w:lang w:val="cs-CZ"/>
         </w:rPr>
-      </w:pPr>
-    </w:p>
-    <w:p>
-      <w:pPr>
-        <w:rPr>
-          <w:rFonts w:ascii="Segoe UI Emoji" w:hAnsi="Segoe UI Emoji" w:cs="Segoe UI Emoji"/>
-          <w:b/>
-          <w:bCs/>
-          <w:sz w:val="40"/>
-          <w:szCs w:val="40"/>
+        <w:tab/>
+      </w:r>
+      <w:r>
+        <w:rPr>
+          <w:sz w:val="28"/>
+          <w:szCs w:val="28"/>
           <w:lang w:val="cs-CZ"/>
         </w:rPr>
-      </w:pPr>
-      <w:r>
-        <w:rPr>
-          <w:rFonts w:ascii="Segoe UI Emoji" w:hAnsi="Segoe UI Emoji" w:cs="Segoe UI Emoji"/>
-          <w:b/>
-          <w:bCs/>
-          <w:sz w:val="40"/>
-          <w:szCs w:val="40"/>
+        <w:t>1.7</w:t>
+      </w:r>
+      <w:r>
+        <w:rPr>
+          <w:sz w:val="28"/>
+          <w:szCs w:val="28"/>
           <w:lang w:val="cs-CZ"/>
         </w:rPr>
-        <w:drawing>
-          <wp:inline distT="0" distB="0" distL="0" distR="0" wp14:anchorId="5E4D5155" wp14:editId="573600CC">
-            <wp:extent cx="3639058" cy="2343477"/>
-            <wp:effectExtent l="0" t="0" r="0" b="0"/>
-            <wp:docPr id="4952249" name="Picture 1"/>
-            <wp:cNvGraphicFramePr>
-              <a:graphicFrameLocks xmlns:a="http://schemas.openxmlformats.org/drawingml/2006/main" noChangeAspect="1"/>
-            </wp:cNvGraphicFramePr>
-            <a:graphic xmlns:a="http://schemas.openxmlformats.org/drawingml/2006/main">
-              <a:graphicData uri="http://schemas.openxmlformats.org/drawingml/2006/picture">
-                <pic:pic xmlns:pic="http://schemas.openxmlformats.org/drawingml/2006/picture">
-                  <pic:nvPicPr>
-                    <pic:cNvPr id="4952249" name=""/>
-                    <pic:cNvPicPr/>
-                  </pic:nvPicPr>
-                  <pic:blipFill>
-                    <a:blip r:embed="rId13"/>
-                    <a:stretch>
-                      <a:fillRect/>
-                    </a:stretch>
-                  </pic:blipFill>
-                  <pic:spPr>
-                    <a:xfrm>
-                      <a:off x="0" y="0"/>
-                      <a:ext cx="3639058" cy="2343477"/>
-                    </a:xfrm>
-                    <a:prstGeom prst="rect">
-                      <a:avLst/>
-                    </a:prstGeom>
-                  </pic:spPr>
-                </pic:pic>
-              </a:graphicData>
-            </a:graphic>
-          </wp:inline>
-        </w:drawing>
-      </w:r>
-    </w:p>
-    <w:p>
-      <w:pPr>
-        <w:rPr>
-          <w:rFonts w:ascii="Aptos" w:hAnsi="Aptos" w:cs="Segoe UI Emoji"/>
-          <w:b/>
-          <w:bCs/>
-          <w:sz w:val="40"/>
-          <w:szCs w:val="40"/>
-          <w:lang w:val="cs-CZ"/>
-        </w:rPr>
-      </w:pPr>
-      <w:r>
-        <w:rPr>
-          <w:rFonts w:ascii="Segoe UI Emoji" w:hAnsi="Segoe UI Emoji" w:cs="Segoe UI Emoji"/>
-          <w:b/>
-          <w:bCs/>
-          <w:sz w:val="40"/>
-          <w:szCs w:val="40"/>
-          <w:lang w:val="cs-CZ"/>
-        </w:rPr>
-        <w:t>🍽️</w:t>
-      </w:r>
-      <w:r>
-        <w:rPr>
-          <w:rFonts w:ascii="Aptos" w:hAnsi="Aptos" w:cs="Segoe UI Emoji"/>
-          <w:b/>
-          <w:bCs/>
-          <w:sz w:val="40"/>
-          <w:szCs w:val="40"/>
-          <w:lang w:val="cs-CZ"/>
-        </w:rPr>
-        <w:t xml:space="preserve"> Hot Meals</w:t>
-      </w:r>
-    </w:p>
-    <w:p>
-      <w:pPr>
-        <w:rPr>
-          <w:rFonts w:ascii="Aptos" w:hAnsi="Aptos" w:cs="Segoe UI Emoji"/>
-          <w:b/>
-          <w:bCs/>
-          <w:sz w:val="40"/>
-          <w:szCs w:val="40"/>
-          <w:lang w:val="cs-CZ"/>
-        </w:rPr>
-      </w:pPr>
-    </w:p>
-    <w:p>
-      <w:pPr>
-        <w:rPr>
-          <w:rFonts w:ascii="Aptos" w:hAnsi="Aptos"/>
-        </w:rPr>
-      </w:pPr>
-      <w:r>
-        <w:rPr>
-          <w:rFonts w:ascii="Aptos" w:hAnsi="Aptos"/>
-        </w:rPr>
-        <w:t xml:space="preserve">Beef Goulash with Dumplings </w:t>
-      </w:r>
-      <w:r>
-        <w:rPr>
-          <w:rFonts w:ascii="Aptos" w:hAnsi="Aptos"/>
-        </w:rPr>
-        <w:tab/>
-      </w:r>
-      <w:r>
-        <w:rPr>
-          <w:rFonts w:ascii="Aptos" w:hAnsi="Aptos"/>
-        </w:rPr>
-        <w:tab/>
-      </w:r>
-      <w:r>
-        <w:rPr>
-          <w:rFonts w:ascii="Aptos" w:hAnsi="Aptos"/>
-        </w:rPr>
-        <w:tab/>
-      </w:r>
-      <w:r>
-        <w:rPr>
-          <w:rFonts w:ascii="Aptos" w:hAnsi="Aptos"/>
-        </w:rPr>
-        <w:t>€6.90</w:t>
-      </w:r>
-    </w:p>
-    <w:p>
-      <w:pPr>
-        <w:rPr>
-          <w:rFonts w:ascii="Aptos" w:hAnsi="Aptos"/>
-        </w:rPr>
-      </w:pPr>
-    </w:p>
-    <w:p>
-      <w:pPr>
-        <w:rPr>
-          <w:rFonts w:ascii="Aptos" w:hAnsi="Aptos"/>
-        </w:rPr>
-      </w:pPr>
-      <w:r>
-        <w:rPr>
-          <w:rFonts w:ascii="Aptos" w:hAnsi="Aptos"/>
-        </w:rPr>
-        <w:t>Chicken Schnitzel</w:t>
-      </w:r>
-      <w:r>
-        <w:rPr>
-          <w:rFonts w:ascii="Aptos" w:hAnsi="Aptos"/>
-        </w:rPr>
-        <w:tab/>
-      </w:r>
-      <w:r>
-        <w:rPr>
-          <w:rFonts w:ascii="Aptos" w:hAnsi="Aptos"/>
-        </w:rPr>
-        <w:tab/>
-      </w:r>
-      <w:r>
-        <w:rPr>
-          <w:rFonts w:ascii="Aptos" w:hAnsi="Aptos"/>
-        </w:rPr>
-        <w:tab/>
-      </w:r>
-      <w:r>
-        <w:rPr>
-          <w:rFonts w:ascii="Aptos" w:hAnsi="Aptos"/>
-        </w:rPr>
-        <w:tab/>
-      </w:r>
-      <w:r>
-        <w:rPr>
-          <w:rFonts w:ascii="Aptos" w:hAnsi="Aptos"/>
-        </w:rPr>
-        <w:tab/>
-      </w:r>
-      <w:r>
-        <w:rPr>
-          <w:rFonts w:ascii="Aptos" w:hAnsi="Aptos"/>
-        </w:rPr>
-        <w:t>€6.50</w:t>
-      </w:r>
-    </w:p>
-    <w:p>
-      <w:pPr>
-        <w:rPr>
-          <w:rFonts w:ascii="Aptos" w:hAnsi="Aptos"/>
-        </w:rPr>
-      </w:pPr>
-    </w:p>
-    <w:p>
-      <w:pPr>
-        <w:rPr>
-          <w:rFonts w:ascii="Aptos" w:hAnsi="Aptos"/>
-          <w:lang w:val="cs-CZ"/>
-        </w:rPr>
-      </w:pPr>
-      <w:r>
-        <w:rPr>
-          <w:rFonts w:ascii="Aptos" w:hAnsi="Aptos"/>
-        </w:rPr>
-        <w:t>Grilled Salmon</w:t>
-      </w:r>
-    </w:p>
-    <w:p>
-      <w:pPr>
-        <w:rPr>
-          <w:sz w:val="40"/>
-          <w:szCs w:val="40"/>
-        </w:rPr>
-      </w:pPr>
+        <w:t>0 EUR</w:t>
+      </w:r>
     </w:p>
     <w:sectPr>
-      <w:headerReference w:type="default" r:id="rId14"/>
       <w:pgSz w:w="12240" w:h="15840"/>
       <w:pgMar w:top="1440" w:right="1440" w:bottom="1440" w:left="1440" w:header="720" w:footer="720" w:gutter="0"/>
       <w:cols w:space="720"/>
@@ -676,12 +1916,6 @@
 </w:footnotes>
 </file>
 
-<file path=word/header1.xml><?xml version="1.0" encoding="utf-8"?>
-<w:hdr xmlns:wpc="http://schemas.microsoft.com/office/word/2010/wordprocessingCanvas" xmlns:cx="http://schemas.microsoft.com/office/drawing/2014/chartex" xmlns:cx1="http://schemas.microsoft.com/office/drawing/2015/9/8/chartex" xmlns:cx2="http://schemas.microsoft.com/office/drawing/2015/10/21/chartex" xmlns:cx3="http://schemas.microsoft.com/office/drawing/2016/5/9/chartex" xmlns:cx4="http://schemas.microsoft.com/office/drawing/2016/5/10/chartex" xmlns:cx5="http://schemas.microsoft.com/office/drawing/2016/5/11/chartex" xmlns:cx6="http://schemas.microsoft.com/office/drawing/2016/5/12/chartex" xmlns:cx7="http://schemas.microsoft.com/office/drawing/2016/5/13/chartex" xmlns:cx8="http://schemas.microsoft.com/office/drawing/2016/5/14/chartex" xmlns:mc="http://schemas.openxmlformats.org/markup-compatibility/2006" xmlns:aink="http://schemas.microsoft.com/office/drawing/2016/ink" xmlns:am3d="http://schemas.microsoft.com/office/drawing/2017/model3d" xmlns:o="urn:schemas-microsoft-com:office:office" xmlns:oel="http://schemas.microsoft.com/office/2019/extlst" xmlns:r="http://schemas.openxmlformats.org/officeDocument/2006/relationships" xmlns:m="http://schemas.openxmlformats.org/officeDocument/2006/math" xmlns:v="urn:schemas-microsoft-com:vml" xmlns:wp14="http://schemas.microsoft.com/office/word/2010/wordprocessingDrawing" xmlns:wp="http://schemas.openxmlformats.org/drawingml/2006/wordprocessingDrawing" xmlns:w10="urn:schemas-microsoft-com:office:word" xmlns:w="http://schemas.openxmlformats.org/wordprocessingml/2006/main" xmlns:w14="http://schemas.microsoft.com/office/word/2010/wordml" xmlns:w15="http://schemas.microsoft.com/office/word/2012/wordml" xmlns:w16cex="http://schemas.microsoft.com/office/word/2018/wordml/cex" xmlns:w16cid="http://schemas.microsoft.com/office/word/2016/wordml/cid" xmlns:w16="http://schemas.microsoft.com/office/word/2018/wordml" xmlns:w16du="http://schemas.microsoft.com/office/word/2023/wordml/word16du" xmlns:w16sdtdh="http://schemas.microsoft.com/office/word/2020/wordml/sdtdatahash" xmlns:w16sdtfl="http://schemas.microsoft.com/office/word/2024/wordml/sdtformatlock" xmlns:w16se="http://schemas.microsoft.com/office/word/2015/wordml/symex" xmlns:wpg="http://schemas.microsoft.com/office/word/2010/wordprocessingGroup" xmlns:wpi="http://schemas.microsoft.com/office/word/2010/wordprocessingInk" xmlns:wne="http://schemas.microsoft.com/office/word/2006/wordml" xmlns:wps="http://schemas.microsoft.com/office/word/2010/wordprocessingShape" mc:Ignorable="w14 w15 w16se w16cid w16 w16cex w16sdtdh w16sdtfl w16du wp14">
-  <w:p/>
-</w:hdr>
-</file>
-
 <file path=word/numbering.xml><?xml version="1.0" encoding="utf-8"?>
 <w:numbering xmlns:wpc="http://schemas.microsoft.com/office/word/2010/wordprocessingCanvas" xmlns:cx="http://schemas.microsoft.com/office/drawing/2014/chartex" xmlns:cx1="http://schemas.microsoft.com/office/drawing/2015/9/8/chartex" xmlns:cx2="http://schemas.microsoft.com/office/drawing/2015/10/21/chartex" xmlns:cx3="http://schemas.microsoft.com/office/drawing/2016/5/9/chartex" xmlns:cx4="http://schemas.microsoft.com/office/drawing/2016/5/10/chartex" xmlns:cx5="http://schemas.microsoft.com/office/drawing/2016/5/11/chartex" xmlns:cx6="http://schemas.microsoft.com/office/drawing/2016/5/12/chartex" xmlns:cx7="http://schemas.microsoft.com/office/drawing/2016/5/13/chartex" xmlns:cx8="http://schemas.microsoft.com/office/drawing/2016/5/14/chartex" xmlns:mc="http://schemas.openxmlformats.org/markup-compatibility/2006" xmlns:aink="http://schemas.microsoft.com/office/drawing/2016/ink" xmlns:am3d="http://schemas.microsoft.com/office/drawing/2017/model3d" xmlns:o="urn:schemas-microsoft-com:office:office" xmlns:oel="http://schemas.microsoft.com/office/2019/extlst" xmlns:r="http://schemas.openxmlformats.org/officeDocument/2006/relationships" xmlns:m="http://schemas.openxmlformats.org/officeDocument/2006/math" xmlns:v="urn:schemas-microsoft-com:vml" xmlns:wp14="http://schemas.microsoft.com/office/word/2010/wordprocessingDrawing" xmlns:wp="http://schemas.openxmlformats.org/drawingml/2006/wordprocessingDrawing" xmlns:w10="urn:schemas-microsoft-com:office:word" xmlns:w="http://schemas.openxmlformats.org/wordprocessingml/2006/main" xmlns:w14="http://schemas.microsoft.com/office/word/2010/wordml" xmlns:w15="http://schemas.microsoft.com/office/word/2012/wordml" xmlns:w16cex="http://schemas.microsoft.com/office/word/2018/wordml/cex" xmlns:w16cid="http://schemas.microsoft.com/office/word/2016/wordml/cid" xmlns:w16="http://schemas.microsoft.com/office/word/2018/wordml" xmlns:w16du="http://schemas.microsoft.com/office/word/2023/wordml/word16du" xmlns:w16sdtdh="http://schemas.microsoft.com/office/word/2020/wordml/sdtdatahash" xmlns:w16sdtfl="http://schemas.microsoft.com/office/word/2024/wordml/sdtformatlock" xmlns:w16se="http://schemas.microsoft.com/office/word/2015/wordml/symex" xmlns:wpg="http://schemas.microsoft.com/office/word/2010/wordprocessingGroup" xmlns:wpi="http://schemas.microsoft.com/office/word/2010/wordprocessingInk" xmlns:wne="http://schemas.microsoft.com/office/word/2006/wordml" xmlns:wps="http://schemas.microsoft.com/office/word/2010/wordprocessingShape" mc:Ignorable="w14 w15 w16se w16cid w16 w16cex w16sdtdh w16sdtfl w16du wp14">
   <w:abstractNum w:abstractNumId="0" w15:restartNumberingAfterBreak="0">
@@ -834,6 +2068,155 @@
     </w:lvl>
   </w:abstractNum>
   <w:abstractNum w:abstractNumId="1" w15:restartNumberingAfterBreak="0">
+    <w:nsid w:val="041717DE"/>
+    <w:multiLevelType w:val="multilevel"/>
+    <w:tmpl w:val="9072D772"/>
+    <w:lvl w:ilvl="0">
+      <w:start w:val="1"/>
+      <w:numFmt w:val="bullet"/>
+      <w:lvlText w:val=""/>
+      <w:lvlJc w:val="left"/>
+      <w:pPr>
+        <w:tabs>
+          <w:tab w:val="num" w:pos="720"/>
+        </w:tabs>
+        <w:ind w:left="720" w:hanging="360"/>
+      </w:pPr>
+      <w:rPr>
+        <w:rFonts w:ascii="Symbol" w:hAnsi="Symbol" w:hint="default"/>
+        <w:sz w:val="20"/>
+      </w:rPr>
+    </w:lvl>
+    <w:lvl w:ilvl="1" w:tentative="1">
+      <w:start w:val="1"/>
+      <w:numFmt w:val="bullet"/>
+      <w:lvlText w:val="o"/>
+      <w:lvlJc w:val="left"/>
+      <w:pPr>
+        <w:tabs>
+          <w:tab w:val="num" w:pos="1440"/>
+        </w:tabs>
+        <w:ind w:left="1440" w:hanging="360"/>
+      </w:pPr>
+      <w:rPr>
+        <w:rFonts w:ascii="Courier New" w:hAnsi="Courier New" w:hint="default"/>
+        <w:sz w:val="20"/>
+      </w:rPr>
+    </w:lvl>
+    <w:lvl w:ilvl="2" w:tentative="1">
+      <w:start w:val="1"/>
+      <w:numFmt w:val="bullet"/>
+      <w:lvlText w:val=""/>
+      <w:lvlJc w:val="left"/>
+      <w:pPr>
+        <w:tabs>
+          <w:tab w:val="num" w:pos="2160"/>
+        </w:tabs>
+        <w:ind w:left="2160" w:hanging="360"/>
+      </w:pPr>
+      <w:rPr>
+        <w:rFonts w:ascii="Wingdings" w:hAnsi="Wingdings" w:hint="default"/>
+        <w:sz w:val="20"/>
+      </w:rPr>
+    </w:lvl>
+    <w:lvl w:ilvl="3" w:tentative="1">
+      <w:start w:val="1"/>
+      <w:numFmt w:val="bullet"/>
+      <w:lvlText w:val=""/>
+      <w:lvlJc w:val="left"/>
+      <w:pPr>
+        <w:tabs>
+          <w:tab w:val="num" w:pos="2880"/>
+        </w:tabs>
+        <w:ind w:left="2880" w:hanging="360"/>
+      </w:pPr>
+      <w:rPr>
+        <w:rFonts w:ascii="Wingdings" w:hAnsi="Wingdings" w:hint="default"/>
+        <w:sz w:val="20"/>
+      </w:rPr>
+    </w:lvl>
+    <w:lvl w:ilvl="4" w:tentative="1">
+      <w:start w:val="1"/>
+      <w:numFmt w:val="bullet"/>
+      <w:lvlText w:val=""/>
+      <w:lvlJc w:val="left"/>
+      <w:pPr>
+        <w:tabs>
+          <w:tab w:val="num" w:pos="3600"/>
+        </w:tabs>
+        <w:ind w:left="3600" w:hanging="360"/>
+      </w:pPr>
+      <w:rPr>
+        <w:rFonts w:ascii="Wingdings" w:hAnsi="Wingdings" w:hint="default"/>
+        <w:sz w:val="20"/>
+      </w:rPr>
+    </w:lvl>
+    <w:lvl w:ilvl="5" w:tentative="1">
+      <w:start w:val="1"/>
+      <w:numFmt w:val="bullet"/>
+      <w:lvlText w:val=""/>
+      <w:lvlJc w:val="left"/>
+      <w:pPr>
+        <w:tabs>
+          <w:tab w:val="num" w:pos="4320"/>
+        </w:tabs>
+        <w:ind w:left="4320" w:hanging="360"/>
+      </w:pPr>
+      <w:rPr>
+        <w:rFonts w:ascii="Wingdings" w:hAnsi="Wingdings" w:hint="default"/>
+        <w:sz w:val="20"/>
+      </w:rPr>
+    </w:lvl>
+    <w:lvl w:ilvl="6" w:tentative="1">
+      <w:start w:val="1"/>
+      <w:numFmt w:val="bullet"/>
+      <w:lvlText w:val=""/>
+      <w:lvlJc w:val="left"/>
+      <w:pPr>
+        <w:tabs>
+          <w:tab w:val="num" w:pos="5040"/>
+        </w:tabs>
+        <w:ind w:left="5040" w:hanging="360"/>
+      </w:pPr>
+      <w:rPr>
+        <w:rFonts w:ascii="Wingdings" w:hAnsi="Wingdings" w:hint="default"/>
+        <w:sz w:val="20"/>
+      </w:rPr>
+    </w:lvl>
+    <w:lvl w:ilvl="7" w:tentative="1">
+      <w:start w:val="1"/>
+      <w:numFmt w:val="bullet"/>
+      <w:lvlText w:val=""/>
+      <w:lvlJc w:val="left"/>
+      <w:pPr>
+        <w:tabs>
+          <w:tab w:val="num" w:pos="5760"/>
+        </w:tabs>
+        <w:ind w:left="5760" w:hanging="360"/>
+      </w:pPr>
+      <w:rPr>
+        <w:rFonts w:ascii="Wingdings" w:hAnsi="Wingdings" w:hint="default"/>
+        <w:sz w:val="20"/>
+      </w:rPr>
+    </w:lvl>
+    <w:lvl w:ilvl="8" w:tentative="1">
+      <w:start w:val="1"/>
+      <w:numFmt w:val="bullet"/>
+      <w:lvlText w:val=""/>
+      <w:lvlJc w:val="left"/>
+      <w:pPr>
+        <w:tabs>
+          <w:tab w:val="num" w:pos="6480"/>
+        </w:tabs>
+        <w:ind w:left="6480" w:hanging="360"/>
+      </w:pPr>
+      <w:rPr>
+        <w:rFonts w:ascii="Wingdings" w:hAnsi="Wingdings" w:hint="default"/>
+        <w:sz w:val="20"/>
+      </w:rPr>
+    </w:lvl>
+  </w:abstractNum>
+  <w:abstractNum w:abstractNumId="2" w15:restartNumberingAfterBreak="0">
     <w:nsid w:val="16126B07"/>
     <w:multiLevelType w:val="hybridMultilevel"/>
     <w:tmpl w:val="51EC4E08"/>
@@ -946,7 +2329,7 @@
       </w:rPr>
     </w:lvl>
   </w:abstractNum>
-  <w:abstractNum w:abstractNumId="2" w15:restartNumberingAfterBreak="0">
+  <w:abstractNum w:abstractNumId="3" w15:restartNumberingAfterBreak="0">
     <w:nsid w:val="1C3A0C5A"/>
     <w:multiLevelType w:val="multilevel"/>
     <w:tmpl w:val="05A29176"/>
@@ -1095,7 +2478,7 @@
       </w:rPr>
     </w:lvl>
   </w:abstractNum>
-  <w:abstractNum w:abstractNumId="3" w15:restartNumberingAfterBreak="0">
+  <w:abstractNum w:abstractNumId="4" w15:restartNumberingAfterBreak="0">
     <w:nsid w:val="28044A38"/>
     <w:multiLevelType w:val="multilevel"/>
     <w:tmpl w:val="36EE9DAE"/>
@@ -1244,7 +2627,7 @@
       </w:rPr>
     </w:lvl>
   </w:abstractNum>
-  <w:abstractNum w:abstractNumId="4" w15:restartNumberingAfterBreak="0">
+  <w:abstractNum w:abstractNumId="5" w15:restartNumberingAfterBreak="0">
     <w:nsid w:val="2D3F77D8"/>
     <w:multiLevelType w:val="multilevel"/>
     <w:tmpl w:val="DCB48A3C"/>
@@ -1393,7 +2776,7 @@
       </w:rPr>
     </w:lvl>
   </w:abstractNum>
-  <w:abstractNum w:abstractNumId="5" w15:restartNumberingAfterBreak="0">
+  <w:abstractNum w:abstractNumId="6" w15:restartNumberingAfterBreak="0">
     <w:nsid w:val="3B50350C"/>
     <w:multiLevelType w:val="multilevel"/>
     <w:tmpl w:val="7E12DDE4"/>
@@ -1542,7 +2925,7 @@
       </w:rPr>
     </w:lvl>
   </w:abstractNum>
-  <w:abstractNum w:abstractNumId="6" w15:restartNumberingAfterBreak="0">
+  <w:abstractNum w:abstractNumId="7" w15:restartNumberingAfterBreak="0">
     <w:nsid w:val="4DF31846"/>
     <w:multiLevelType w:val="multilevel"/>
     <w:tmpl w:val="D9F8BCF0"/>
@@ -1691,7 +3074,7 @@
       </w:rPr>
     </w:lvl>
   </w:abstractNum>
-  <w:abstractNum w:abstractNumId="7" w15:restartNumberingAfterBreak="0">
+  <w:abstractNum w:abstractNumId="8" w15:restartNumberingAfterBreak="0">
     <w:nsid w:val="587013BA"/>
     <w:multiLevelType w:val="hybridMultilevel"/>
     <w:tmpl w:val="EE6417C4"/>
@@ -1777,7 +3160,156 @@
       </w:pPr>
     </w:lvl>
   </w:abstractNum>
-  <w:abstractNum w:abstractNumId="8" w15:restartNumberingAfterBreak="0">
+  <w:abstractNum w:abstractNumId="9" w15:restartNumberingAfterBreak="0">
+    <w:nsid w:val="64891BAC"/>
+    <w:multiLevelType w:val="multilevel"/>
+    <w:tmpl w:val="71FEB86E"/>
+    <w:lvl w:ilvl="0">
+      <w:start w:val="1"/>
+      <w:numFmt w:val="bullet"/>
+      <w:lvlText w:val=""/>
+      <w:lvlJc w:val="left"/>
+      <w:pPr>
+        <w:tabs>
+          <w:tab w:val="num" w:pos="720"/>
+        </w:tabs>
+        <w:ind w:left="720" w:hanging="360"/>
+      </w:pPr>
+      <w:rPr>
+        <w:rFonts w:ascii="Symbol" w:hAnsi="Symbol" w:hint="default"/>
+        <w:sz w:val="20"/>
+      </w:rPr>
+    </w:lvl>
+    <w:lvl w:ilvl="1" w:tentative="1">
+      <w:start w:val="1"/>
+      <w:numFmt w:val="bullet"/>
+      <w:lvlText w:val="o"/>
+      <w:lvlJc w:val="left"/>
+      <w:pPr>
+        <w:tabs>
+          <w:tab w:val="num" w:pos="1440"/>
+        </w:tabs>
+        <w:ind w:left="1440" w:hanging="360"/>
+      </w:pPr>
+      <w:rPr>
+        <w:rFonts w:ascii="Courier New" w:hAnsi="Courier New" w:hint="default"/>
+        <w:sz w:val="20"/>
+      </w:rPr>
+    </w:lvl>
+    <w:lvl w:ilvl="2" w:tentative="1">
+      <w:start w:val="1"/>
+      <w:numFmt w:val="bullet"/>
+      <w:lvlText w:val=""/>
+      <w:lvlJc w:val="left"/>
+      <w:pPr>
+        <w:tabs>
+          <w:tab w:val="num" w:pos="2160"/>
+        </w:tabs>
+        <w:ind w:left="2160" w:hanging="360"/>
+      </w:pPr>
+      <w:rPr>
+        <w:rFonts w:ascii="Wingdings" w:hAnsi="Wingdings" w:hint="default"/>
+        <w:sz w:val="20"/>
+      </w:rPr>
+    </w:lvl>
+    <w:lvl w:ilvl="3" w:tentative="1">
+      <w:start w:val="1"/>
+      <w:numFmt w:val="bullet"/>
+      <w:lvlText w:val=""/>
+      <w:lvlJc w:val="left"/>
+      <w:pPr>
+        <w:tabs>
+          <w:tab w:val="num" w:pos="2880"/>
+        </w:tabs>
+        <w:ind w:left="2880" w:hanging="360"/>
+      </w:pPr>
+      <w:rPr>
+        <w:rFonts w:ascii="Wingdings" w:hAnsi="Wingdings" w:hint="default"/>
+        <w:sz w:val="20"/>
+      </w:rPr>
+    </w:lvl>
+    <w:lvl w:ilvl="4" w:tentative="1">
+      <w:start w:val="1"/>
+      <w:numFmt w:val="bullet"/>
+      <w:lvlText w:val=""/>
+      <w:lvlJc w:val="left"/>
+      <w:pPr>
+        <w:tabs>
+          <w:tab w:val="num" w:pos="3600"/>
+        </w:tabs>
+        <w:ind w:left="3600" w:hanging="360"/>
+      </w:pPr>
+      <w:rPr>
+        <w:rFonts w:ascii="Wingdings" w:hAnsi="Wingdings" w:hint="default"/>
+        <w:sz w:val="20"/>
+      </w:rPr>
+    </w:lvl>
+    <w:lvl w:ilvl="5" w:tentative="1">
+      <w:start w:val="1"/>
+      <w:numFmt w:val="bullet"/>
+      <w:lvlText w:val=""/>
+      <w:lvlJc w:val="left"/>
+      <w:pPr>
+        <w:tabs>
+          <w:tab w:val="num" w:pos="4320"/>
+        </w:tabs>
+        <w:ind w:left="4320" w:hanging="360"/>
+      </w:pPr>
+      <w:rPr>
+        <w:rFonts w:ascii="Wingdings" w:hAnsi="Wingdings" w:hint="default"/>
+        <w:sz w:val="20"/>
+      </w:rPr>
+    </w:lvl>
+    <w:lvl w:ilvl="6" w:tentative="1">
+      <w:start w:val="1"/>
+      <w:numFmt w:val="bullet"/>
+      <w:lvlText w:val=""/>
+      <w:lvlJc w:val="left"/>
+      <w:pPr>
+        <w:tabs>
+          <w:tab w:val="num" w:pos="5040"/>
+        </w:tabs>
+        <w:ind w:left="5040" w:hanging="360"/>
+      </w:pPr>
+      <w:rPr>
+        <w:rFonts w:ascii="Wingdings" w:hAnsi="Wingdings" w:hint="default"/>
+        <w:sz w:val="20"/>
+      </w:rPr>
+    </w:lvl>
+    <w:lvl w:ilvl="7" w:tentative="1">
+      <w:start w:val="1"/>
+      <w:numFmt w:val="bullet"/>
+      <w:lvlText w:val=""/>
+      <w:lvlJc w:val="left"/>
+      <w:pPr>
+        <w:tabs>
+          <w:tab w:val="num" w:pos="5760"/>
+        </w:tabs>
+        <w:ind w:left="5760" w:hanging="360"/>
+      </w:pPr>
+      <w:rPr>
+        <w:rFonts w:ascii="Wingdings" w:hAnsi="Wingdings" w:hint="default"/>
+        <w:sz w:val="20"/>
+      </w:rPr>
+    </w:lvl>
+    <w:lvl w:ilvl="8" w:tentative="1">
+      <w:start w:val="1"/>
+      <w:numFmt w:val="bullet"/>
+      <w:lvlText w:val=""/>
+      <w:lvlJc w:val="left"/>
+      <w:pPr>
+        <w:tabs>
+          <w:tab w:val="num" w:pos="6480"/>
+        </w:tabs>
+        <w:ind w:left="6480" w:hanging="360"/>
+      </w:pPr>
+      <w:rPr>
+        <w:rFonts w:ascii="Wingdings" w:hAnsi="Wingdings" w:hint="default"/>
+        <w:sz w:val="20"/>
+      </w:rPr>
+    </w:lvl>
+  </w:abstractNum>
+  <w:abstractNum w:abstractNumId="10" w15:restartNumberingAfterBreak="0">
     <w:nsid w:val="662A2542"/>
     <w:multiLevelType w:val="multilevel"/>
     <w:tmpl w:val="3FC61C46"/>
@@ -1926,32 +3458,342 @@
       </w:rPr>
     </w:lvl>
   </w:abstractNum>
+  <w:abstractNum w:abstractNumId="11" w15:restartNumberingAfterBreak="0">
+    <w:nsid w:val="79725511"/>
+    <w:multiLevelType w:val="multilevel"/>
+    <w:tmpl w:val="6BD2CCF8"/>
+    <w:lvl w:ilvl="0">
+      <w:start w:val="1"/>
+      <w:numFmt w:val="bullet"/>
+      <w:lvlText w:val=""/>
+      <w:lvlJc w:val="left"/>
+      <w:pPr>
+        <w:tabs>
+          <w:tab w:val="num" w:pos="720"/>
+        </w:tabs>
+        <w:ind w:left="720" w:hanging="360"/>
+      </w:pPr>
+      <w:rPr>
+        <w:rFonts w:ascii="Symbol" w:hAnsi="Symbol" w:hint="default"/>
+        <w:sz w:val="20"/>
+      </w:rPr>
+    </w:lvl>
+    <w:lvl w:ilvl="1" w:tentative="1">
+      <w:start w:val="1"/>
+      <w:numFmt w:val="bullet"/>
+      <w:lvlText w:val="o"/>
+      <w:lvlJc w:val="left"/>
+      <w:pPr>
+        <w:tabs>
+          <w:tab w:val="num" w:pos="1440"/>
+        </w:tabs>
+        <w:ind w:left="1440" w:hanging="360"/>
+      </w:pPr>
+      <w:rPr>
+        <w:rFonts w:ascii="Courier New" w:hAnsi="Courier New" w:hint="default"/>
+        <w:sz w:val="20"/>
+      </w:rPr>
+    </w:lvl>
+    <w:lvl w:ilvl="2" w:tentative="1">
+      <w:start w:val="1"/>
+      <w:numFmt w:val="bullet"/>
+      <w:lvlText w:val=""/>
+      <w:lvlJc w:val="left"/>
+      <w:pPr>
+        <w:tabs>
+          <w:tab w:val="num" w:pos="2160"/>
+        </w:tabs>
+        <w:ind w:left="2160" w:hanging="360"/>
+      </w:pPr>
+      <w:rPr>
+        <w:rFonts w:ascii="Wingdings" w:hAnsi="Wingdings" w:hint="default"/>
+        <w:sz w:val="20"/>
+      </w:rPr>
+    </w:lvl>
+    <w:lvl w:ilvl="3" w:tentative="1">
+      <w:start w:val="1"/>
+      <w:numFmt w:val="bullet"/>
+      <w:lvlText w:val=""/>
+      <w:lvlJc w:val="left"/>
+      <w:pPr>
+        <w:tabs>
+          <w:tab w:val="num" w:pos="2880"/>
+        </w:tabs>
+        <w:ind w:left="2880" w:hanging="360"/>
+      </w:pPr>
+      <w:rPr>
+        <w:rFonts w:ascii="Wingdings" w:hAnsi="Wingdings" w:hint="default"/>
+        <w:sz w:val="20"/>
+      </w:rPr>
+    </w:lvl>
+    <w:lvl w:ilvl="4" w:tentative="1">
+      <w:start w:val="1"/>
+      <w:numFmt w:val="bullet"/>
+      <w:lvlText w:val=""/>
+      <w:lvlJc w:val="left"/>
+      <w:pPr>
+        <w:tabs>
+          <w:tab w:val="num" w:pos="3600"/>
+        </w:tabs>
+        <w:ind w:left="3600" w:hanging="360"/>
+      </w:pPr>
+      <w:rPr>
+        <w:rFonts w:ascii="Wingdings" w:hAnsi="Wingdings" w:hint="default"/>
+        <w:sz w:val="20"/>
+      </w:rPr>
+    </w:lvl>
+    <w:lvl w:ilvl="5" w:tentative="1">
+      <w:start w:val="1"/>
+      <w:numFmt w:val="bullet"/>
+      <w:lvlText w:val=""/>
+      <w:lvlJc w:val="left"/>
+      <w:pPr>
+        <w:tabs>
+          <w:tab w:val="num" w:pos="4320"/>
+        </w:tabs>
+        <w:ind w:left="4320" w:hanging="360"/>
+      </w:pPr>
+      <w:rPr>
+        <w:rFonts w:ascii="Wingdings" w:hAnsi="Wingdings" w:hint="default"/>
+        <w:sz w:val="20"/>
+      </w:rPr>
+    </w:lvl>
+    <w:lvl w:ilvl="6" w:tentative="1">
+      <w:start w:val="1"/>
+      <w:numFmt w:val="bullet"/>
+      <w:lvlText w:val=""/>
+      <w:lvlJc w:val="left"/>
+      <w:pPr>
+        <w:tabs>
+          <w:tab w:val="num" w:pos="5040"/>
+        </w:tabs>
+        <w:ind w:left="5040" w:hanging="360"/>
+      </w:pPr>
+      <w:rPr>
+        <w:rFonts w:ascii="Wingdings" w:hAnsi="Wingdings" w:hint="default"/>
+        <w:sz w:val="20"/>
+      </w:rPr>
+    </w:lvl>
+    <w:lvl w:ilvl="7" w:tentative="1">
+      <w:start w:val="1"/>
+      <w:numFmt w:val="bullet"/>
+      <w:lvlText w:val=""/>
+      <w:lvlJc w:val="left"/>
+      <w:pPr>
+        <w:tabs>
+          <w:tab w:val="num" w:pos="5760"/>
+        </w:tabs>
+        <w:ind w:left="5760" w:hanging="360"/>
+      </w:pPr>
+      <w:rPr>
+        <w:rFonts w:ascii="Wingdings" w:hAnsi="Wingdings" w:hint="default"/>
+        <w:sz w:val="20"/>
+      </w:rPr>
+    </w:lvl>
+    <w:lvl w:ilvl="8" w:tentative="1">
+      <w:start w:val="1"/>
+      <w:numFmt w:val="bullet"/>
+      <w:lvlText w:val=""/>
+      <w:lvlJc w:val="left"/>
+      <w:pPr>
+        <w:tabs>
+          <w:tab w:val="num" w:pos="6480"/>
+        </w:tabs>
+        <w:ind w:left="6480" w:hanging="360"/>
+      </w:pPr>
+      <w:rPr>
+        <w:rFonts w:ascii="Wingdings" w:hAnsi="Wingdings" w:hint="default"/>
+        <w:sz w:val="20"/>
+      </w:rPr>
+    </w:lvl>
+  </w:abstractNum>
+  <w:abstractNum w:abstractNumId="12" w15:restartNumberingAfterBreak="0">
+    <w:nsid w:val="7B5F2E66"/>
+    <w:multiLevelType w:val="multilevel"/>
+    <w:tmpl w:val="55DA07D0"/>
+    <w:lvl w:ilvl="0">
+      <w:start w:val="1"/>
+      <w:numFmt w:val="bullet"/>
+      <w:lvlText w:val=""/>
+      <w:lvlJc w:val="left"/>
+      <w:pPr>
+        <w:tabs>
+          <w:tab w:val="num" w:pos="720"/>
+        </w:tabs>
+        <w:ind w:left="720" w:hanging="360"/>
+      </w:pPr>
+      <w:rPr>
+        <w:rFonts w:ascii="Symbol" w:hAnsi="Symbol" w:hint="default"/>
+        <w:sz w:val="20"/>
+      </w:rPr>
+    </w:lvl>
+    <w:lvl w:ilvl="1" w:tentative="1">
+      <w:start w:val="1"/>
+      <w:numFmt w:val="bullet"/>
+      <w:lvlText w:val="o"/>
+      <w:lvlJc w:val="left"/>
+      <w:pPr>
+        <w:tabs>
+          <w:tab w:val="num" w:pos="1440"/>
+        </w:tabs>
+        <w:ind w:left="1440" w:hanging="360"/>
+      </w:pPr>
+      <w:rPr>
+        <w:rFonts w:ascii="Courier New" w:hAnsi="Courier New" w:hint="default"/>
+        <w:sz w:val="20"/>
+      </w:rPr>
+    </w:lvl>
+    <w:lvl w:ilvl="2" w:tentative="1">
+      <w:start w:val="1"/>
+      <w:numFmt w:val="bullet"/>
+      <w:lvlText w:val=""/>
+      <w:lvlJc w:val="left"/>
+      <w:pPr>
+        <w:tabs>
+          <w:tab w:val="num" w:pos="2160"/>
+        </w:tabs>
+        <w:ind w:left="2160" w:hanging="360"/>
+      </w:pPr>
+      <w:rPr>
+        <w:rFonts w:ascii="Wingdings" w:hAnsi="Wingdings" w:hint="default"/>
+        <w:sz w:val="20"/>
+      </w:rPr>
+    </w:lvl>
+    <w:lvl w:ilvl="3" w:tentative="1">
+      <w:start w:val="1"/>
+      <w:numFmt w:val="bullet"/>
+      <w:lvlText w:val=""/>
+      <w:lvlJc w:val="left"/>
+      <w:pPr>
+        <w:tabs>
+          <w:tab w:val="num" w:pos="2880"/>
+        </w:tabs>
+        <w:ind w:left="2880" w:hanging="360"/>
+      </w:pPr>
+      <w:rPr>
+        <w:rFonts w:ascii="Wingdings" w:hAnsi="Wingdings" w:hint="default"/>
+        <w:sz w:val="20"/>
+      </w:rPr>
+    </w:lvl>
+    <w:lvl w:ilvl="4" w:tentative="1">
+      <w:start w:val="1"/>
+      <w:numFmt w:val="bullet"/>
+      <w:lvlText w:val=""/>
+      <w:lvlJc w:val="left"/>
+      <w:pPr>
+        <w:tabs>
+          <w:tab w:val="num" w:pos="3600"/>
+        </w:tabs>
+        <w:ind w:left="3600" w:hanging="360"/>
+      </w:pPr>
+      <w:rPr>
+        <w:rFonts w:ascii="Wingdings" w:hAnsi="Wingdings" w:hint="default"/>
+        <w:sz w:val="20"/>
+      </w:rPr>
+    </w:lvl>
+    <w:lvl w:ilvl="5" w:tentative="1">
+      <w:start w:val="1"/>
+      <w:numFmt w:val="bullet"/>
+      <w:lvlText w:val=""/>
+      <w:lvlJc w:val="left"/>
+      <w:pPr>
+        <w:tabs>
+          <w:tab w:val="num" w:pos="4320"/>
+        </w:tabs>
+        <w:ind w:left="4320" w:hanging="360"/>
+      </w:pPr>
+      <w:rPr>
+        <w:rFonts w:ascii="Wingdings" w:hAnsi="Wingdings" w:hint="default"/>
+        <w:sz w:val="20"/>
+      </w:rPr>
+    </w:lvl>
+    <w:lvl w:ilvl="6" w:tentative="1">
+      <w:start w:val="1"/>
+      <w:numFmt w:val="bullet"/>
+      <w:lvlText w:val=""/>
+      <w:lvlJc w:val="left"/>
+      <w:pPr>
+        <w:tabs>
+          <w:tab w:val="num" w:pos="5040"/>
+        </w:tabs>
+        <w:ind w:left="5040" w:hanging="360"/>
+      </w:pPr>
+      <w:rPr>
+        <w:rFonts w:ascii="Wingdings" w:hAnsi="Wingdings" w:hint="default"/>
+        <w:sz w:val="20"/>
+      </w:rPr>
+    </w:lvl>
+    <w:lvl w:ilvl="7" w:tentative="1">
+      <w:start w:val="1"/>
+      <w:numFmt w:val="bullet"/>
+      <w:lvlText w:val=""/>
+      <w:lvlJc w:val="left"/>
+      <w:pPr>
+        <w:tabs>
+          <w:tab w:val="num" w:pos="5760"/>
+        </w:tabs>
+        <w:ind w:left="5760" w:hanging="360"/>
+      </w:pPr>
+      <w:rPr>
+        <w:rFonts w:ascii="Wingdings" w:hAnsi="Wingdings" w:hint="default"/>
+        <w:sz w:val="20"/>
+      </w:rPr>
+    </w:lvl>
+    <w:lvl w:ilvl="8" w:tentative="1">
+      <w:start w:val="1"/>
+      <w:numFmt w:val="bullet"/>
+      <w:lvlText w:val=""/>
+      <w:lvlJc w:val="left"/>
+      <w:pPr>
+        <w:tabs>
+          <w:tab w:val="num" w:pos="6480"/>
+        </w:tabs>
+        <w:ind w:left="6480" w:hanging="360"/>
+      </w:pPr>
+      <w:rPr>
+        <w:rFonts w:ascii="Wingdings" w:hAnsi="Wingdings" w:hint="default"/>
+        <w:sz w:val="20"/>
+      </w:rPr>
+    </w:lvl>
+  </w:abstractNum>
   <w:num w:numId="1" w16cid:durableId="100147962">
-    <w:abstractNumId w:val="1"/>
+    <w:abstractNumId w:val="2"/>
   </w:num>
   <w:num w:numId="2" w16cid:durableId="485517411">
-    <w:abstractNumId w:val="7"/>
+    <w:abstractNumId w:val="8"/>
   </w:num>
   <w:num w:numId="3" w16cid:durableId="374814780">
-    <w:abstractNumId w:val="8"/>
+    <w:abstractNumId w:val="10"/>
   </w:num>
   <w:num w:numId="4" w16cid:durableId="1183739492">
-    <w:abstractNumId w:val="3"/>
+    <w:abstractNumId w:val="4"/>
   </w:num>
   <w:num w:numId="5" w16cid:durableId="1723013851">
-    <w:abstractNumId w:val="6"/>
+    <w:abstractNumId w:val="7"/>
   </w:num>
   <w:num w:numId="6" w16cid:durableId="1673684526">
     <w:abstractNumId w:val="0"/>
   </w:num>
   <w:num w:numId="7" w16cid:durableId="56708285">
+    <w:abstractNumId w:val="6"/>
+  </w:num>
+  <w:num w:numId="8" w16cid:durableId="1129854572">
     <w:abstractNumId w:val="5"/>
   </w:num>
-  <w:num w:numId="8" w16cid:durableId="1129854572">
-    <w:abstractNumId w:val="4"/>
+  <w:num w:numId="9" w16cid:durableId="1999385700">
+    <w:abstractNumId w:val="3"/>
   </w:num>
-  <w:num w:numId="9" w16cid:durableId="1999385700">
-    <w:abstractNumId w:val="2"/>
+  <w:num w:numId="10" w16cid:durableId="1855528944">
+    <w:abstractNumId w:val="9"/>
+  </w:num>
+  <w:num w:numId="11" w16cid:durableId="2090301892">
+    <w:abstractNumId w:val="12"/>
+  </w:num>
+  <w:num w:numId="12" w16cid:durableId="1982152134">
+    <w:abstractNumId w:val="1"/>
+  </w:num>
+  <w:num w:numId="13" w16cid:durableId="1953899344">
+    <w:abstractNumId w:val="11"/>
   </w:num>
 </w:numbering>
 </file>
@@ -2352,6 +4194,9 @@
   <w:style w:type="paragraph" w:default="1" w:styleId="Normal">
     <w:name w:val="Normal"/>
     <w:qFormat/>
+    <w:rPr>
+      <w:lang w:val="en-GB"/>
+    </w:rPr>
   </w:style>
   <w:style w:type="paragraph" w:styleId="Heading1">
     <w:name w:val="heading 1"/>
@@ -2878,6 +4723,26 @@
       <w:u w:val="single"/>
     </w:rPr>
   </w:style>
+  <w:style w:type="paragraph" w:styleId="TOCHeading">
+    <w:name w:val="TOC Heading"/>
+    <w:basedOn w:val="Heading1"/>
+    <w:next w:val="Normal"/>
+    <w:uiPriority w:val="39"/>
+    <w:unhideWhenUsed/>
+    <w:qFormat/>
+    <w:rsid w:val="00EA5856"/>
+    <w:pPr>
+      <w:spacing w:before="240" w:after="0" w:line="259" w:lineRule="auto"/>
+      <w:outlineLvl w:val="9"/>
+    </w:pPr>
+    <w:rPr>
+      <w:kern w:val="0"/>
+      <w:sz w:val="32"/>
+      <w:szCs w:val="32"/>
+      <w:lang w:val="cs-CZ" w:eastAsia="cs-CZ"/>
+      <w14:ligatures w14:val="none"/>
+    </w:rPr>
+  </w:style>
 </w:styles>
 </file>
 
@@ -3174,4 +5039,16 @@
     </a:ext>
   </a:extLst>
 </a:theme>
+</file>
+
+<file path=customXml/item1.xml><?xml version="1.0" encoding="utf-8"?>
+<b:Sources xmlns:b="http://schemas.openxmlformats.org/officeDocument/2006/bibliography" xmlns="http://schemas.openxmlformats.org/officeDocument/2006/bibliography" SelectedStyle="\APASixthEditionOfficeOnline.xsl" StyleName="APA" Version="6"/>
+</file>
+
+<file path=customXml/itemProps1.xml><?xml version="1.0" encoding="utf-8"?>
+<ds:datastoreItem xmlns:ds="http://schemas.openxmlformats.org/officeDocument/2006/customXml" ds:itemID="{FC0CEC37-A536-4666-A9B1-DEF6B9B0BC32}">
+  <ds:schemaRefs>
+    <ds:schemaRef ds:uri="http://schemas.openxmlformats.org/officeDocument/2006/bibliography"/>
+  </ds:schemaRefs>
+</ds:datastoreItem>
 </file>
</xml_diff>

<commit_message>
updated dining car menu
</commit_message>
<xml_diff>
--- a/documents/dining-car-menu.docx
+++ b/documents/dining-car-menu.docx
@@ -9,57 +9,30 @@
           <w:b/>
         </w:rPr>
       </w:pPr>
-      <w:r>
-        <w:rPr>
-          <w:b/>
-        </w:rPr>
-        <w:drawing>
-          <wp:inline distT="0" distB="0" distL="0" distR="0" wp14:anchorId="1645BF68" wp14:editId="3ED21FCB">
-            <wp:extent cx="5114949" cy="5114949"/>
-            <wp:effectExtent l="0" t="0" r="0" b="0"/>
-            <wp:docPr id="1132558173" name="Picture 1"/>
-            <wp:cNvGraphicFramePr>
-              <a:graphicFrameLocks xmlns:a="http://schemas.openxmlformats.org/drawingml/2006/main" noChangeAspect="1"/>
-            </wp:cNvGraphicFramePr>
-            <a:graphic xmlns:a="http://schemas.openxmlformats.org/drawingml/2006/main">
-              <a:graphicData uri="http://schemas.openxmlformats.org/drawingml/2006/picture">
-                <pic:pic xmlns:pic="http://schemas.openxmlformats.org/drawingml/2006/picture">
-                  <pic:nvPicPr>
-                    <pic:cNvPr id="1132558173" name="Picture 1"/>
-                    <pic:cNvPicPr/>
-                  </pic:nvPicPr>
-                  <pic:blipFill>
-                    <a:blip r:embed="rId8">
-                      <a:extLst>
-                        <a:ext uri="{28A0092B-C50C-407E-A947-70E740481C1C}">
-                          <a14:useLocalDpi xmlns:a14="http://schemas.microsoft.com/office/drawing/2010/main" val="0"/>
-                        </a:ext>
-                      </a:extLst>
-                    </a:blip>
-                    <a:stretch>
-                      <a:fillRect/>
-                    </a:stretch>
-                  </pic:blipFill>
-                  <pic:spPr>
-                    <a:xfrm>
-                      <a:off x="0" y="0"/>
-                      <a:ext cx="5114949" cy="5114949"/>
-                    </a:xfrm>
-                    <a:prstGeom prst="rect">
-                      <a:avLst/>
-                    </a:prstGeom>
-                  </pic:spPr>
-                </pic:pic>
-              </a:graphicData>
-            </a:graphic>
-          </wp:inline>
-        </w:drawing>
-      </w:r>
     </w:p>
     <w:p>
       <w:pPr>
         <w:jc w:val="center"/>
       </w:pPr>
+    </w:p>
+    <w:p>
+      <w:pPr>
+        <w:jc w:val="center"/>
+        <w:rPr>
+          <w:b/>
+          <w:sz w:val="400"/>
+          <w:szCs w:val="400"/>
+        </w:rPr>
+      </w:pPr>
+      <w:r>
+        <w:rPr>
+          <w:b/>
+          <w:color w:val="FF0000"/>
+          <w:sz w:val="400"/>
+          <w:szCs w:val="400"/>
+        </w:rPr>
+        <w:t>SRT</w:t>
+      </w:r>
     </w:p>
     <w:p>
       <w:pPr>
@@ -76,8 +49,7 @@
           <w:sz w:val="72"/>
           <w:szCs w:val="72"/>
         </w:rPr>
-        <w:lastRenderedPageBreak/>
-        <w:t>SRT Dining Car Menu</w:t>
+        <w:t>Dining Car Menu</w:t>
       </w:r>
     </w:p>
     <w:p>
@@ -114,6 +86,7 @@
           <w:sz w:val="40"/>
           <w:szCs w:val="40"/>
         </w:rPr>
+        <w:lastRenderedPageBreak/>
         <w:t>🧃</w:t>
       </w:r>
       <w:r>
@@ -123,7 +96,17 @@
           <w:sz w:val="40"/>
           <w:szCs w:val="40"/>
         </w:rPr>
-        <w:t xml:space="preserve"> Juices</w:t>
+        <w:t xml:space="preserve"> </w:t>
+      </w:r>
+      <w:r>
+        <w:rPr>
+          <w:b/>
+          <w:bCs/>
+          <w:color w:val="4C94D8" w:themeColor="text2" w:themeTint="80"/>
+          <w:sz w:val="40"/>
+          <w:szCs w:val="40"/>
+        </w:rPr>
+        <w:t>Juices</w:t>
       </w:r>
     </w:p>
     <w:p>
@@ -1021,6 +1004,7 @@
           <w:sz w:val="40"/>
           <w:szCs w:val="40"/>
         </w:rPr>
+        <w:lastRenderedPageBreak/>
         <w:t>☕️</w:t>
       </w:r>
       <w:r>
@@ -1030,12 +1014,23 @@
           <w:sz w:val="40"/>
           <w:szCs w:val="40"/>
         </w:rPr>
-        <w:t xml:space="preserve"> Coffe</w:t>
+        <w:t xml:space="preserve"> </w:t>
       </w:r>
       <w:r>
         <w:rPr>
           <w:b/>
           <w:bCs/>
+          <w:color w:val="4C94D8" w:themeColor="text2" w:themeTint="80"/>
+          <w:sz w:val="40"/>
+          <w:szCs w:val="40"/>
+        </w:rPr>
+        <w:t>Coffe</w:t>
+      </w:r>
+      <w:r>
+        <w:rPr>
+          <w:b/>
+          <w:bCs/>
+          <w:color w:val="4C94D8" w:themeColor="text2" w:themeTint="80"/>
           <w:sz w:val="40"/>
           <w:szCs w:val="40"/>
         </w:rPr>
@@ -1570,6 +1565,7 @@
           <w:sz w:val="40"/>
           <w:szCs w:val="40"/>
         </w:rPr>
+        <w:lastRenderedPageBreak/>
         <w:t>🥫</w:t>
       </w:r>
       <w:r>
@@ -1579,7 +1575,17 @@
           <w:sz w:val="40"/>
           <w:szCs w:val="40"/>
         </w:rPr>
-        <w:t xml:space="preserve"> Sodas</w:t>
+        <w:t xml:space="preserve"> </w:t>
+      </w:r>
+      <w:r>
+        <w:rPr>
+          <w:b/>
+          <w:bCs/>
+          <w:color w:val="4C94D8" w:themeColor="text2" w:themeTint="80"/>
+          <w:sz w:val="40"/>
+          <w:szCs w:val="40"/>
+        </w:rPr>
+        <w:t>Sodas</w:t>
       </w:r>
     </w:p>
     <w:p>
@@ -1673,25 +1679,7 @@
           <w:lang w:val="cs-CZ"/>
         </w:rPr>
         <w:noBreakHyphen/>
-        <w:t xml:space="preserve">Cola </w:t>
-      </w:r>
-      <w:proofErr w:type="spellStart"/>
-      <w:r>
-        <w:rPr>
-          <w:sz w:val="28"/>
-          <w:szCs w:val="28"/>
-          <w:lang w:val="cs-CZ"/>
-        </w:rPr>
-        <w:t>Zero</w:t>
-      </w:r>
-      <w:proofErr w:type="spellEnd"/>
-      <w:r>
-        <w:rPr>
-          <w:sz w:val="28"/>
-          <w:szCs w:val="28"/>
-          <w:lang w:val="cs-CZ"/>
-        </w:rPr>
-        <w:t xml:space="preserve"> </w:t>
+        <w:t xml:space="preserve">Cola Zero </w:t>
       </w:r>
       <w:r>
         <w:rPr>
@@ -1866,6 +1854,111 @@
           <w:lang w:val="cs-CZ"/>
         </w:rPr>
         <w:t>0 EUR</w:t>
+      </w:r>
+    </w:p>
+    <w:p>
+      <w:pPr>
+        <w:numPr>
+          <w:ilvl w:val="0"/>
+          <w:numId w:val="13"/>
+        </w:numPr>
+        <w:tabs>
+          <w:tab w:val="right" w:leader="dot" w:pos="8505"/>
+        </w:tabs>
+        <w:spacing w:line="360" w:lineRule="auto"/>
+        <w:ind w:left="714" w:hanging="357"/>
+        <w:rPr>
+          <w:sz w:val="28"/>
+          <w:szCs w:val="28"/>
+          <w:lang w:val="cs-CZ"/>
+        </w:rPr>
+      </w:pPr>
+      <w:r>
+        <w:rPr>
+          <w:sz w:val="28"/>
+          <w:szCs w:val="28"/>
+          <w:lang w:val="cs-CZ"/>
+        </w:rPr>
+        <w:t>7up</w:t>
+      </w:r>
+      <w:r>
+        <w:rPr>
+          <w:sz w:val="28"/>
+          <w:szCs w:val="28"/>
+          <w:lang w:val="cs-CZ"/>
+        </w:rPr>
+        <w:tab/>
+        <w:t>1.40 EUR</w:t>
+      </w:r>
+    </w:p>
+    <w:p>
+      <w:pPr>
+        <w:numPr>
+          <w:ilvl w:val="0"/>
+          <w:numId w:val="13"/>
+        </w:numPr>
+        <w:tabs>
+          <w:tab w:val="right" w:leader="dot" w:pos="8505"/>
+        </w:tabs>
+        <w:spacing w:line="360" w:lineRule="auto"/>
+        <w:ind w:left="714" w:hanging="357"/>
+        <w:rPr>
+          <w:sz w:val="28"/>
+          <w:szCs w:val="28"/>
+          <w:lang w:val="cs-CZ"/>
+        </w:rPr>
+      </w:pPr>
+      <w:r>
+        <w:rPr>
+          <w:sz w:val="28"/>
+          <w:szCs w:val="28"/>
+          <w:lang w:val="cs-CZ"/>
+        </w:rPr>
+        <w:t>Lipton Green Tea</w:t>
+      </w:r>
+      <w:r>
+        <w:rPr>
+          <w:sz w:val="28"/>
+          <w:szCs w:val="28"/>
+          <w:lang w:val="cs-CZ"/>
+        </w:rPr>
+        <w:tab/>
+        <w:t>1.40 EUR</w:t>
+      </w:r>
+    </w:p>
+    <w:p>
+      <w:pPr>
+        <w:numPr>
+          <w:ilvl w:val="0"/>
+          <w:numId w:val="13"/>
+        </w:numPr>
+        <w:tabs>
+          <w:tab w:val="right" w:leader="dot" w:pos="8505"/>
+        </w:tabs>
+        <w:spacing w:line="360" w:lineRule="auto"/>
+        <w:ind w:left="714" w:hanging="357"/>
+        <w:rPr>
+          <w:sz w:val="28"/>
+          <w:szCs w:val="28"/>
+          <w:lang w:val="cs-CZ"/>
+        </w:rPr>
+      </w:pPr>
+      <w:r>
+        <w:rPr>
+          <w:sz w:val="28"/>
+          <w:szCs w:val="28"/>
+          <w:lang w:val="cs-CZ"/>
+        </w:rPr>
+        <w:t>Lipton Lemon Tea</w:t>
+      </w:r>
+      <w:r>
+        <w:rPr>
+          <w:sz w:val="28"/>
+          <w:szCs w:val="28"/>
+          <w:lang w:val="cs-CZ"/>
+        </w:rPr>
+        <w:tab/>
+        <w:t>0.80 EUR</w:t>
       </w:r>
     </w:p>
     <w:sectPr>
@@ -4398,6 +4491,7 @@
   <w:style w:type="character" w:default="1" w:styleId="DefaultParagraphFont">
     <w:name w:val="Default Paragraph Font"/>
     <w:uiPriority w:val="1"/>
+    <w:semiHidden/>
     <w:unhideWhenUsed/>
   </w:style>
   <w:style w:type="table" w:default="1" w:styleId="TableNormal">

</xml_diff>

<commit_message>
updated dining car menu, removed dining car htm web page and its files
</commit_message>
<xml_diff>
--- a/documents/dining-car-menu.docx
+++ b/documents/dining-car-menu.docx
@@ -111,6 +111,10 @@
     </w:p>
     <w:p>
       <w:pPr>
+        <w:tabs>
+          <w:tab w:val="right" w:leader="dot" w:pos="8505"/>
+        </w:tabs>
+        <w:spacing w:line="360" w:lineRule="auto"/>
         <w:rPr>
           <w:b/>
           <w:bCs/>
@@ -121,15 +125,10 @@
     </w:p>
     <w:p>
       <w:pPr>
-        <w:numPr>
-          <w:ilvl w:val="0"/>
-          <w:numId w:val="10"/>
-        </w:numPr>
         <w:tabs>
           <w:tab w:val="right" w:leader="dot" w:pos="8505"/>
         </w:tabs>
         <w:spacing w:line="360" w:lineRule="auto"/>
-        <w:ind w:left="714" w:hanging="357"/>
         <w:rPr>
           <w:bCs/>
           <w:sz w:val="28"/>
@@ -171,15 +170,10 @@
     </w:p>
     <w:p>
       <w:pPr>
-        <w:numPr>
-          <w:ilvl w:val="0"/>
-          <w:numId w:val="10"/>
-        </w:numPr>
         <w:tabs>
           <w:tab w:val="right" w:leader="dot" w:pos="8505"/>
         </w:tabs>
         <w:spacing w:line="360" w:lineRule="auto"/>
-        <w:ind w:left="714" w:hanging="357"/>
         <w:rPr>
           <w:bCs/>
           <w:sz w:val="28"/>
@@ -221,15 +215,10 @@
     </w:p>
     <w:p>
       <w:pPr>
-        <w:numPr>
-          <w:ilvl w:val="0"/>
-          <w:numId w:val="10"/>
-        </w:numPr>
         <w:tabs>
           <w:tab w:val="right" w:leader="dot" w:pos="8505"/>
         </w:tabs>
         <w:spacing w:line="360" w:lineRule="auto"/>
-        <w:ind w:left="714" w:hanging="357"/>
         <w:rPr>
           <w:bCs/>
           <w:sz w:val="28"/>
@@ -271,15 +260,10 @@
     </w:p>
     <w:p>
       <w:pPr>
-        <w:numPr>
-          <w:ilvl w:val="0"/>
-          <w:numId w:val="10"/>
-        </w:numPr>
         <w:tabs>
           <w:tab w:val="right" w:leader="dot" w:pos="8505"/>
         </w:tabs>
         <w:spacing w:line="360" w:lineRule="auto"/>
-        <w:ind w:left="714" w:hanging="357"/>
         <w:rPr>
           <w:bCs/>
           <w:sz w:val="28"/>
@@ -321,15 +305,10 @@
     </w:p>
     <w:p>
       <w:pPr>
-        <w:numPr>
-          <w:ilvl w:val="0"/>
-          <w:numId w:val="10"/>
-        </w:numPr>
         <w:tabs>
           <w:tab w:val="right" w:leader="dot" w:pos="8505"/>
         </w:tabs>
         <w:spacing w:line="360" w:lineRule="auto"/>
-        <w:ind w:left="714" w:hanging="357"/>
         <w:rPr>
           <w:bCs/>
           <w:sz w:val="28"/>
@@ -371,15 +350,10 @@
     </w:p>
     <w:p>
       <w:pPr>
-        <w:numPr>
-          <w:ilvl w:val="0"/>
-          <w:numId w:val="10"/>
-        </w:numPr>
         <w:tabs>
           <w:tab w:val="right" w:leader="dot" w:pos="8505"/>
         </w:tabs>
         <w:spacing w:line="360" w:lineRule="auto"/>
-        <w:ind w:left="714" w:hanging="357"/>
         <w:rPr>
           <w:bCs/>
           <w:sz w:val="28"/>
@@ -421,15 +395,10 @@
     </w:p>
     <w:p>
       <w:pPr>
-        <w:numPr>
-          <w:ilvl w:val="0"/>
-          <w:numId w:val="10"/>
-        </w:numPr>
         <w:tabs>
           <w:tab w:val="right" w:leader="dot" w:pos="8505"/>
         </w:tabs>
         <w:spacing w:line="360" w:lineRule="auto"/>
-        <w:ind w:left="714" w:hanging="357"/>
         <w:rPr>
           <w:bCs/>
           <w:sz w:val="28"/>
@@ -471,15 +440,10 @@
     </w:p>
     <w:p>
       <w:pPr>
-        <w:numPr>
-          <w:ilvl w:val="0"/>
-          <w:numId w:val="10"/>
-        </w:numPr>
         <w:tabs>
           <w:tab w:val="right" w:leader="dot" w:pos="8505"/>
         </w:tabs>
         <w:spacing w:line="360" w:lineRule="auto"/>
-        <w:ind w:left="714" w:hanging="357"/>
         <w:rPr>
           <w:bCs/>
           <w:sz w:val="28"/>
@@ -521,15 +485,10 @@
     </w:p>
     <w:p>
       <w:pPr>
-        <w:numPr>
-          <w:ilvl w:val="0"/>
-          <w:numId w:val="10"/>
-        </w:numPr>
         <w:tabs>
           <w:tab w:val="right" w:leader="dot" w:pos="8505"/>
         </w:tabs>
         <w:spacing w:line="360" w:lineRule="auto"/>
-        <w:ind w:left="714" w:hanging="357"/>
         <w:rPr>
           <w:bCs/>
           <w:sz w:val="28"/>
@@ -571,15 +530,10 @@
     </w:p>
     <w:p>
       <w:pPr>
-        <w:numPr>
-          <w:ilvl w:val="0"/>
-          <w:numId w:val="10"/>
-        </w:numPr>
         <w:tabs>
           <w:tab w:val="right" w:leader="dot" w:pos="8505"/>
         </w:tabs>
         <w:spacing w:line="360" w:lineRule="auto"/>
-        <w:ind w:left="714" w:hanging="357"/>
         <w:rPr>
           <w:bCs/>
           <w:sz w:val="28"/>
@@ -621,15 +575,10 @@
     </w:p>
     <w:p>
       <w:pPr>
-        <w:numPr>
-          <w:ilvl w:val="0"/>
-          <w:numId w:val="10"/>
-        </w:numPr>
         <w:tabs>
           <w:tab w:val="right" w:leader="dot" w:pos="8505"/>
         </w:tabs>
         <w:spacing w:line="360" w:lineRule="auto"/>
-        <w:ind w:left="714" w:hanging="357"/>
         <w:rPr>
           <w:bCs/>
           <w:sz w:val="28"/>
@@ -671,15 +620,10 @@
     </w:p>
     <w:p>
       <w:pPr>
-        <w:numPr>
-          <w:ilvl w:val="0"/>
-          <w:numId w:val="10"/>
-        </w:numPr>
         <w:tabs>
           <w:tab w:val="right" w:leader="dot" w:pos="8505"/>
         </w:tabs>
         <w:spacing w:line="360" w:lineRule="auto"/>
-        <w:ind w:left="714" w:hanging="357"/>
         <w:rPr>
           <w:bCs/>
           <w:sz w:val="28"/>
@@ -721,15 +665,10 @@
     </w:p>
     <w:p>
       <w:pPr>
-        <w:numPr>
-          <w:ilvl w:val="0"/>
-          <w:numId w:val="10"/>
-        </w:numPr>
         <w:tabs>
           <w:tab w:val="right" w:leader="dot" w:pos="8505"/>
         </w:tabs>
         <w:spacing w:line="360" w:lineRule="auto"/>
-        <w:ind w:left="714" w:hanging="357"/>
         <w:rPr>
           <w:bCs/>
           <w:sz w:val="28"/>
@@ -771,15 +710,10 @@
     </w:p>
     <w:p>
       <w:pPr>
-        <w:numPr>
-          <w:ilvl w:val="0"/>
-          <w:numId w:val="10"/>
-        </w:numPr>
         <w:tabs>
           <w:tab w:val="right" w:leader="dot" w:pos="8505"/>
         </w:tabs>
         <w:spacing w:line="360" w:lineRule="auto"/>
-        <w:ind w:left="714" w:hanging="357"/>
         <w:rPr>
           <w:bCs/>
           <w:sz w:val="28"/>
@@ -821,15 +755,10 @@
     </w:p>
     <w:p>
       <w:pPr>
-        <w:numPr>
-          <w:ilvl w:val="0"/>
-          <w:numId w:val="10"/>
-        </w:numPr>
         <w:tabs>
           <w:tab w:val="right" w:leader="dot" w:pos="8505"/>
         </w:tabs>
         <w:spacing w:line="360" w:lineRule="auto"/>
-        <w:ind w:left="714" w:hanging="357"/>
         <w:rPr>
           <w:bCs/>
           <w:sz w:val="28"/>
@@ -871,15 +800,10 @@
     </w:p>
     <w:p>
       <w:pPr>
-        <w:numPr>
-          <w:ilvl w:val="0"/>
-          <w:numId w:val="10"/>
-        </w:numPr>
         <w:tabs>
           <w:tab w:val="right" w:leader="dot" w:pos="8505"/>
         </w:tabs>
         <w:spacing w:line="360" w:lineRule="auto"/>
-        <w:ind w:left="714" w:hanging="357"/>
         <w:rPr>
           <w:bCs/>
           <w:sz w:val="28"/>
@@ -921,15 +845,10 @@
     </w:p>
     <w:p>
       <w:pPr>
-        <w:numPr>
-          <w:ilvl w:val="0"/>
-          <w:numId w:val="10"/>
-        </w:numPr>
         <w:tabs>
           <w:tab w:val="right" w:leader="dot" w:pos="8505"/>
         </w:tabs>
         <w:spacing w:line="360" w:lineRule="auto"/>
-        <w:ind w:left="714" w:hanging="357"/>
         <w:rPr>
           <w:bCs/>
           <w:sz w:val="28"/>
@@ -1039,15 +958,10 @@
     </w:p>
     <w:p>
       <w:pPr>
-        <w:numPr>
-          <w:ilvl w:val="0"/>
-          <w:numId w:val="12"/>
-        </w:numPr>
         <w:tabs>
           <w:tab w:val="right" w:leader="dot" w:pos="8505"/>
         </w:tabs>
         <w:spacing w:line="360" w:lineRule="auto"/>
-        <w:ind w:left="714" w:hanging="357"/>
         <w:rPr>
           <w:sz w:val="28"/>
           <w:szCs w:val="28"/>
@@ -1084,15 +998,10 @@
     </w:p>
     <w:p>
       <w:pPr>
-        <w:numPr>
-          <w:ilvl w:val="0"/>
-          <w:numId w:val="12"/>
-        </w:numPr>
         <w:tabs>
           <w:tab w:val="right" w:leader="dot" w:pos="8505"/>
         </w:tabs>
         <w:spacing w:line="360" w:lineRule="auto"/>
-        <w:ind w:left="714" w:hanging="357"/>
         <w:rPr>
           <w:sz w:val="28"/>
           <w:szCs w:val="28"/>
@@ -1129,15 +1038,10 @@
     </w:p>
     <w:p>
       <w:pPr>
-        <w:numPr>
-          <w:ilvl w:val="0"/>
-          <w:numId w:val="12"/>
-        </w:numPr>
         <w:tabs>
           <w:tab w:val="right" w:leader="dot" w:pos="8505"/>
         </w:tabs>
         <w:spacing w:line="360" w:lineRule="auto"/>
-        <w:ind w:left="714" w:hanging="357"/>
         <w:rPr>
           <w:sz w:val="28"/>
           <w:szCs w:val="28"/>
@@ -1174,15 +1078,10 @@
     </w:p>
     <w:p>
       <w:pPr>
-        <w:numPr>
-          <w:ilvl w:val="0"/>
-          <w:numId w:val="12"/>
-        </w:numPr>
         <w:tabs>
           <w:tab w:val="right" w:leader="dot" w:pos="8505"/>
         </w:tabs>
         <w:spacing w:line="360" w:lineRule="auto"/>
-        <w:ind w:left="714" w:hanging="357"/>
         <w:rPr>
           <w:sz w:val="28"/>
           <w:szCs w:val="28"/>
@@ -1219,15 +1118,10 @@
     </w:p>
     <w:p>
       <w:pPr>
-        <w:numPr>
-          <w:ilvl w:val="0"/>
-          <w:numId w:val="12"/>
-        </w:numPr>
         <w:tabs>
           <w:tab w:val="right" w:leader="dot" w:pos="8505"/>
         </w:tabs>
         <w:spacing w:line="360" w:lineRule="auto"/>
-        <w:ind w:left="714" w:hanging="357"/>
         <w:rPr>
           <w:sz w:val="28"/>
           <w:szCs w:val="28"/>
@@ -1264,15 +1158,10 @@
     </w:p>
     <w:p>
       <w:pPr>
-        <w:numPr>
-          <w:ilvl w:val="0"/>
-          <w:numId w:val="12"/>
-        </w:numPr>
         <w:tabs>
           <w:tab w:val="right" w:leader="dot" w:pos="8505"/>
         </w:tabs>
         <w:spacing w:line="360" w:lineRule="auto"/>
-        <w:ind w:left="714" w:hanging="357"/>
         <w:rPr>
           <w:sz w:val="28"/>
           <w:szCs w:val="28"/>
@@ -1309,15 +1198,10 @@
     </w:p>
     <w:p>
       <w:pPr>
-        <w:numPr>
-          <w:ilvl w:val="0"/>
-          <w:numId w:val="12"/>
-        </w:numPr>
         <w:tabs>
           <w:tab w:val="right" w:leader="dot" w:pos="8505"/>
         </w:tabs>
         <w:spacing w:line="360" w:lineRule="auto"/>
-        <w:ind w:left="714" w:hanging="357"/>
         <w:rPr>
           <w:sz w:val="28"/>
           <w:szCs w:val="28"/>
@@ -1354,15 +1238,10 @@
     </w:p>
     <w:p>
       <w:pPr>
-        <w:numPr>
-          <w:ilvl w:val="0"/>
-          <w:numId w:val="12"/>
-        </w:numPr>
         <w:tabs>
           <w:tab w:val="right" w:leader="dot" w:pos="8505"/>
         </w:tabs>
         <w:spacing w:line="360" w:lineRule="auto"/>
-        <w:ind w:left="714" w:hanging="357"/>
         <w:rPr>
           <w:sz w:val="28"/>
           <w:szCs w:val="28"/>
@@ -1399,15 +1278,10 @@
     </w:p>
     <w:p>
       <w:pPr>
-        <w:numPr>
-          <w:ilvl w:val="0"/>
-          <w:numId w:val="12"/>
-        </w:numPr>
         <w:tabs>
           <w:tab w:val="right" w:leader="dot" w:pos="8505"/>
         </w:tabs>
         <w:spacing w:line="360" w:lineRule="auto"/>
-        <w:ind w:left="714" w:hanging="357"/>
         <w:rPr>
           <w:sz w:val="28"/>
           <w:szCs w:val="28"/>
@@ -1444,15 +1318,10 @@
     </w:p>
     <w:p>
       <w:pPr>
-        <w:numPr>
-          <w:ilvl w:val="0"/>
-          <w:numId w:val="12"/>
-        </w:numPr>
         <w:tabs>
           <w:tab w:val="right" w:leader="dot" w:pos="8505"/>
         </w:tabs>
         <w:spacing w:line="360" w:lineRule="auto"/>
-        <w:ind w:left="714" w:hanging="357"/>
         <w:rPr>
           <w:sz w:val="28"/>
           <w:szCs w:val="28"/>
@@ -1489,15 +1358,10 @@
     </w:p>
     <w:p>
       <w:pPr>
-        <w:numPr>
-          <w:ilvl w:val="0"/>
-          <w:numId w:val="12"/>
-        </w:numPr>
         <w:tabs>
           <w:tab w:val="right" w:leader="dot" w:pos="8505"/>
         </w:tabs>
         <w:spacing w:line="360" w:lineRule="auto"/>
-        <w:ind w:left="714" w:hanging="357"/>
         <w:rPr>
           <w:sz w:val="28"/>
           <w:szCs w:val="28"/>
@@ -1531,14 +1395,6 @@
         </w:rPr>
         <w:t xml:space="preserve"> EUR</w:t>
       </w:r>
-    </w:p>
-    <w:p>
-      <w:pPr>
-        <w:rPr>
-          <w:sz w:val="28"/>
-          <w:szCs w:val="28"/>
-        </w:rPr>
-      </w:pPr>
       <w:r>
         <w:rPr>
           <w:sz w:val="28"/>
@@ -1590,26 +1446,19 @@
     </w:p>
     <w:p>
       <w:pPr>
-        <w:numPr>
-          <w:ilvl w:val="0"/>
-          <w:numId w:val="13"/>
-        </w:numPr>
         <w:tabs>
           <w:tab w:val="right" w:leader="dot" w:pos="8505"/>
         </w:tabs>
         <w:spacing w:line="360" w:lineRule="auto"/>
-        <w:ind w:left="714" w:hanging="357"/>
-        <w:rPr>
-          <w:sz w:val="28"/>
-          <w:szCs w:val="28"/>
-          <w:lang w:val="cs-CZ"/>
-        </w:rPr>
-      </w:pPr>
-      <w:r>
-        <w:rPr>
-          <w:sz w:val="28"/>
-          <w:szCs w:val="28"/>
-          <w:lang w:val="cs-CZ"/>
+        <w:rPr>
+          <w:sz w:val="28"/>
+          <w:szCs w:val="28"/>
+        </w:rPr>
+      </w:pPr>
+      <w:r>
+        <w:rPr>
+          <w:sz w:val="28"/>
+          <w:szCs w:val="28"/>
         </w:rPr>
         <w:t>Coca</w:t>
       </w:r>
@@ -1617,7 +1466,6 @@
         <w:rPr>
           <w:sz w:val="28"/>
           <w:szCs w:val="28"/>
-          <w:lang w:val="cs-CZ"/>
         </w:rPr>
         <w:noBreakHyphen/>
         <w:t xml:space="preserve">Cola </w:t>
@@ -1626,7 +1474,6 @@
         <w:rPr>
           <w:sz w:val="28"/>
           <w:szCs w:val="28"/>
-          <w:lang w:val="cs-CZ"/>
         </w:rPr>
         <w:tab/>
       </w:r>
@@ -1634,7 +1481,6 @@
         <w:rPr>
           <w:sz w:val="28"/>
           <w:szCs w:val="28"/>
-          <w:lang w:val="cs-CZ"/>
         </w:rPr>
         <w:t>1.80</w:t>
       </w:r>
@@ -1642,33 +1488,25 @@
         <w:rPr>
           <w:sz w:val="28"/>
           <w:szCs w:val="28"/>
-          <w:lang w:val="cs-CZ"/>
         </w:rPr>
         <w:t xml:space="preserve"> EUR</w:t>
       </w:r>
     </w:p>
     <w:p>
       <w:pPr>
-        <w:numPr>
-          <w:ilvl w:val="0"/>
-          <w:numId w:val="13"/>
-        </w:numPr>
         <w:tabs>
           <w:tab w:val="right" w:leader="dot" w:pos="8505"/>
         </w:tabs>
         <w:spacing w:line="360" w:lineRule="auto"/>
-        <w:ind w:left="714" w:hanging="357"/>
-        <w:rPr>
-          <w:sz w:val="28"/>
-          <w:szCs w:val="28"/>
-          <w:lang w:val="cs-CZ"/>
-        </w:rPr>
-      </w:pPr>
-      <w:r>
-        <w:rPr>
-          <w:sz w:val="28"/>
-          <w:szCs w:val="28"/>
-          <w:lang w:val="cs-CZ"/>
+        <w:rPr>
+          <w:sz w:val="28"/>
+          <w:szCs w:val="28"/>
+        </w:rPr>
+      </w:pPr>
+      <w:r>
+        <w:rPr>
+          <w:sz w:val="28"/>
+          <w:szCs w:val="28"/>
         </w:rPr>
         <w:t>Coca</w:t>
       </w:r>
@@ -1676,7 +1514,6 @@
         <w:rPr>
           <w:sz w:val="28"/>
           <w:szCs w:val="28"/>
-          <w:lang w:val="cs-CZ"/>
         </w:rPr>
         <w:noBreakHyphen/>
         <w:t xml:space="preserve">Cola Zero </w:t>
@@ -1685,7 +1522,6 @@
         <w:rPr>
           <w:sz w:val="28"/>
           <w:szCs w:val="28"/>
-          <w:lang w:val="cs-CZ"/>
         </w:rPr>
         <w:tab/>
       </w:r>
@@ -1693,7 +1529,6 @@
         <w:rPr>
           <w:sz w:val="28"/>
           <w:szCs w:val="28"/>
-          <w:lang w:val="cs-CZ"/>
         </w:rPr>
         <w:t>1.8</w:t>
       </w:r>
@@ -1701,33 +1536,25 @@
         <w:rPr>
           <w:sz w:val="28"/>
           <w:szCs w:val="28"/>
-          <w:lang w:val="cs-CZ"/>
         </w:rPr>
         <w:t>0 EUR</w:t>
       </w:r>
     </w:p>
     <w:p>
       <w:pPr>
-        <w:numPr>
-          <w:ilvl w:val="0"/>
-          <w:numId w:val="13"/>
-        </w:numPr>
         <w:tabs>
           <w:tab w:val="right" w:leader="dot" w:pos="8505"/>
         </w:tabs>
         <w:spacing w:line="360" w:lineRule="auto"/>
-        <w:ind w:left="714" w:hanging="357"/>
-        <w:rPr>
-          <w:sz w:val="28"/>
-          <w:szCs w:val="28"/>
-          <w:lang w:val="cs-CZ"/>
-        </w:rPr>
-      </w:pPr>
-      <w:r>
-        <w:rPr>
-          <w:sz w:val="28"/>
-          <w:szCs w:val="28"/>
-          <w:lang w:val="cs-CZ"/>
+        <w:rPr>
+          <w:sz w:val="28"/>
+          <w:szCs w:val="28"/>
+        </w:rPr>
+      </w:pPr>
+      <w:r>
+        <w:rPr>
+          <w:sz w:val="28"/>
+          <w:szCs w:val="28"/>
         </w:rPr>
         <w:t xml:space="preserve">Fanta Orange </w:t>
       </w:r>
@@ -1735,7 +1562,6 @@
         <w:rPr>
           <w:sz w:val="28"/>
           <w:szCs w:val="28"/>
-          <w:lang w:val="cs-CZ"/>
         </w:rPr>
         <w:tab/>
       </w:r>
@@ -1743,7 +1569,6 @@
         <w:rPr>
           <w:sz w:val="28"/>
           <w:szCs w:val="28"/>
-          <w:lang w:val="cs-CZ"/>
         </w:rPr>
         <w:t>1.7</w:t>
       </w:r>
@@ -1751,33 +1576,25 @@
         <w:rPr>
           <w:sz w:val="28"/>
           <w:szCs w:val="28"/>
-          <w:lang w:val="cs-CZ"/>
         </w:rPr>
         <w:t>0 EUR</w:t>
       </w:r>
     </w:p>
     <w:p>
       <w:pPr>
-        <w:numPr>
-          <w:ilvl w:val="0"/>
-          <w:numId w:val="13"/>
-        </w:numPr>
         <w:tabs>
           <w:tab w:val="right" w:leader="dot" w:pos="8505"/>
         </w:tabs>
         <w:spacing w:line="360" w:lineRule="auto"/>
-        <w:ind w:left="714" w:hanging="357"/>
-        <w:rPr>
-          <w:sz w:val="28"/>
-          <w:szCs w:val="28"/>
-          <w:lang w:val="cs-CZ"/>
-        </w:rPr>
-      </w:pPr>
-      <w:r>
-        <w:rPr>
-          <w:sz w:val="28"/>
-          <w:szCs w:val="28"/>
-          <w:lang w:val="cs-CZ"/>
+        <w:rPr>
+          <w:sz w:val="28"/>
+          <w:szCs w:val="28"/>
+        </w:rPr>
+      </w:pPr>
+      <w:r>
+        <w:rPr>
+          <w:sz w:val="28"/>
+          <w:szCs w:val="28"/>
         </w:rPr>
         <w:t>Fanta Lemon</w:t>
       </w:r>
@@ -1785,7 +1602,6 @@
         <w:rPr>
           <w:sz w:val="28"/>
           <w:szCs w:val="28"/>
-          <w:lang w:val="cs-CZ"/>
         </w:rPr>
         <w:tab/>
       </w:r>
@@ -1793,7 +1609,6 @@
         <w:rPr>
           <w:sz w:val="28"/>
           <w:szCs w:val="28"/>
-          <w:lang w:val="cs-CZ"/>
         </w:rPr>
         <w:t>1.7</w:t>
       </w:r>
@@ -1801,33 +1616,25 @@
         <w:rPr>
           <w:sz w:val="28"/>
           <w:szCs w:val="28"/>
-          <w:lang w:val="cs-CZ"/>
         </w:rPr>
         <w:t>0 EUR</w:t>
       </w:r>
     </w:p>
     <w:p>
       <w:pPr>
-        <w:numPr>
-          <w:ilvl w:val="0"/>
-          <w:numId w:val="13"/>
-        </w:numPr>
         <w:tabs>
           <w:tab w:val="right" w:leader="dot" w:pos="8505"/>
         </w:tabs>
         <w:spacing w:line="360" w:lineRule="auto"/>
-        <w:ind w:left="714" w:hanging="357"/>
-        <w:rPr>
-          <w:sz w:val="28"/>
-          <w:szCs w:val="28"/>
-          <w:lang w:val="cs-CZ"/>
-        </w:rPr>
-      </w:pPr>
-      <w:r>
-        <w:rPr>
-          <w:sz w:val="28"/>
-          <w:szCs w:val="28"/>
-          <w:lang w:val="cs-CZ"/>
+        <w:rPr>
+          <w:sz w:val="28"/>
+          <w:szCs w:val="28"/>
+        </w:rPr>
+      </w:pPr>
+      <w:r>
+        <w:rPr>
+          <w:sz w:val="28"/>
+          <w:szCs w:val="28"/>
         </w:rPr>
         <w:t xml:space="preserve">Sprite </w:t>
       </w:r>
@@ -1835,7 +1642,6 @@
         <w:rPr>
           <w:sz w:val="28"/>
           <w:szCs w:val="28"/>
-          <w:lang w:val="cs-CZ"/>
         </w:rPr>
         <w:tab/>
       </w:r>
@@ -1843,7 +1649,6 @@
         <w:rPr>
           <w:sz w:val="28"/>
           <w:szCs w:val="28"/>
-          <w:lang w:val="cs-CZ"/>
         </w:rPr>
         <w:t>1.7</w:t>
       </w:r>
@@ -1851,33 +1656,25 @@
         <w:rPr>
           <w:sz w:val="28"/>
           <w:szCs w:val="28"/>
-          <w:lang w:val="cs-CZ"/>
         </w:rPr>
         <w:t>0 EUR</w:t>
       </w:r>
     </w:p>
     <w:p>
       <w:pPr>
-        <w:numPr>
-          <w:ilvl w:val="0"/>
-          <w:numId w:val="13"/>
-        </w:numPr>
         <w:tabs>
           <w:tab w:val="right" w:leader="dot" w:pos="8505"/>
         </w:tabs>
         <w:spacing w:line="360" w:lineRule="auto"/>
-        <w:ind w:left="714" w:hanging="357"/>
-        <w:rPr>
-          <w:sz w:val="28"/>
-          <w:szCs w:val="28"/>
-          <w:lang w:val="cs-CZ"/>
-        </w:rPr>
-      </w:pPr>
-      <w:r>
-        <w:rPr>
-          <w:sz w:val="28"/>
-          <w:szCs w:val="28"/>
-          <w:lang w:val="cs-CZ"/>
+        <w:rPr>
+          <w:sz w:val="28"/>
+          <w:szCs w:val="28"/>
+        </w:rPr>
+      </w:pPr>
+      <w:r>
+        <w:rPr>
+          <w:sz w:val="28"/>
+          <w:szCs w:val="28"/>
         </w:rPr>
         <w:t>7up</w:t>
       </w:r>
@@ -1885,7 +1682,6 @@
         <w:rPr>
           <w:sz w:val="28"/>
           <w:szCs w:val="28"/>
-          <w:lang w:val="cs-CZ"/>
         </w:rPr>
         <w:tab/>
         <w:t>1.40 EUR</w:t>
@@ -1893,26 +1689,19 @@
     </w:p>
     <w:p>
       <w:pPr>
-        <w:numPr>
-          <w:ilvl w:val="0"/>
-          <w:numId w:val="13"/>
-        </w:numPr>
         <w:tabs>
           <w:tab w:val="right" w:leader="dot" w:pos="8505"/>
         </w:tabs>
         <w:spacing w:line="360" w:lineRule="auto"/>
-        <w:ind w:left="714" w:hanging="357"/>
-        <w:rPr>
-          <w:sz w:val="28"/>
-          <w:szCs w:val="28"/>
-          <w:lang w:val="cs-CZ"/>
-        </w:rPr>
-      </w:pPr>
-      <w:r>
-        <w:rPr>
-          <w:sz w:val="28"/>
-          <w:szCs w:val="28"/>
-          <w:lang w:val="cs-CZ"/>
+        <w:rPr>
+          <w:sz w:val="28"/>
+          <w:szCs w:val="28"/>
+        </w:rPr>
+      </w:pPr>
+      <w:r>
+        <w:rPr>
+          <w:sz w:val="28"/>
+          <w:szCs w:val="28"/>
         </w:rPr>
         <w:t>Lipton Green Tea</w:t>
       </w:r>
@@ -1920,7 +1709,6 @@
         <w:rPr>
           <w:sz w:val="28"/>
           <w:szCs w:val="28"/>
-          <w:lang w:val="cs-CZ"/>
         </w:rPr>
         <w:tab/>
         <w:t>1.40 EUR</w:t>
@@ -1928,26 +1716,19 @@
     </w:p>
     <w:p>
       <w:pPr>
-        <w:numPr>
-          <w:ilvl w:val="0"/>
-          <w:numId w:val="13"/>
-        </w:numPr>
         <w:tabs>
           <w:tab w:val="right" w:leader="dot" w:pos="8505"/>
         </w:tabs>
         <w:spacing w:line="360" w:lineRule="auto"/>
-        <w:ind w:left="714" w:hanging="357"/>
-        <w:rPr>
-          <w:sz w:val="28"/>
-          <w:szCs w:val="28"/>
-          <w:lang w:val="cs-CZ"/>
-        </w:rPr>
-      </w:pPr>
-      <w:r>
-        <w:rPr>
-          <w:sz w:val="28"/>
-          <w:szCs w:val="28"/>
-          <w:lang w:val="cs-CZ"/>
+        <w:rPr>
+          <w:sz w:val="28"/>
+          <w:szCs w:val="28"/>
+        </w:rPr>
+      </w:pPr>
+      <w:r>
+        <w:rPr>
+          <w:sz w:val="28"/>
+          <w:szCs w:val="28"/>
         </w:rPr>
         <w:t>Lipton Lemon Tea</w:t>
       </w:r>
@@ -1955,11 +1736,681 @@
         <w:rPr>
           <w:sz w:val="28"/>
           <w:szCs w:val="28"/>
-          <w:lang w:val="cs-CZ"/>
         </w:rPr>
         <w:tab/>
         <w:t>0.80 EUR</w:t>
       </w:r>
+    </w:p>
+    <w:p>
+      <w:pPr>
+        <w:rPr>
+          <w:sz w:val="28"/>
+          <w:szCs w:val="28"/>
+        </w:rPr>
+      </w:pPr>
+      <w:r>
+        <w:rPr>
+          <w:sz w:val="28"/>
+          <w:szCs w:val="28"/>
+        </w:rPr>
+        <w:br w:type="page"/>
+      </w:r>
+    </w:p>
+    <w:p>
+      <w:pPr>
+        <w:tabs>
+          <w:tab w:val="right" w:leader="dot" w:pos="8505"/>
+        </w:tabs>
+        <w:spacing w:line="360" w:lineRule="auto"/>
+        <w:rPr>
+          <w:color w:val="0070C0"/>
+          <w:sz w:val="40"/>
+          <w:szCs w:val="40"/>
+        </w:rPr>
+      </w:pPr>
+      <w:r>
+        <w:rPr>
+          <mc:AlternateContent>
+            <mc:Choice Requires="w16se"/>
+            <mc:Fallback>
+              <w:rFonts w:ascii="Segoe UI Emoji" w:eastAsia="Segoe UI Emoji" w:hAnsi="Segoe UI Emoji" w:cs="Segoe UI Emoji"/>
+            </mc:Fallback>
+          </mc:AlternateContent>
+          <w:sz w:val="40"/>
+          <w:szCs w:val="40"/>
+        </w:rPr>
+        <w:lastRenderedPageBreak/>
+        <mc:AlternateContent>
+          <mc:Choice Requires="w16se">
+            <w16se:symEx w16se:font="Segoe UI Emoji" w16se:char="1F36A"/>
+          </mc:Choice>
+          <mc:Fallback>
+            <w:t>🍪</w:t>
+          </mc:Fallback>
+        </mc:AlternateContent>
+      </w:r>
+      <w:r>
+        <w:rPr>
+          <w:sz w:val="40"/>
+          <w:szCs w:val="40"/>
+        </w:rPr>
+        <w:t xml:space="preserve"> </w:t>
+      </w:r>
+      <w:r>
+        <w:rPr>
+          <w:color w:val="0070C0"/>
+          <w:sz w:val="40"/>
+          <w:szCs w:val="40"/>
+        </w:rPr>
+        <w:t>Snacks</w:t>
+      </w:r>
+    </w:p>
+    <w:p>
+      <w:pPr>
+        <w:tabs>
+          <w:tab w:val="right" w:leader="dot" w:pos="8505"/>
+        </w:tabs>
+        <w:spacing w:line="360" w:lineRule="auto"/>
+        <w:rPr>
+          <w:color w:val="0070C0"/>
+          <w:sz w:val="40"/>
+          <w:szCs w:val="40"/>
+        </w:rPr>
+      </w:pPr>
+      <w:r>
+        <w:rPr>
+          <w:sz w:val="28"/>
+          <w:szCs w:val="28"/>
+        </w:rPr>
+        <w:t xml:space="preserve">Lays </w:t>
+      </w:r>
+    </w:p>
+    <w:p>
+      <w:pPr>
+        <w:rPr>
+          <w:sz w:val="28"/>
+          <w:szCs w:val="28"/>
+        </w:rPr>
+      </w:pPr>
+      <w:r>
+        <w:rPr>
+          <w:sz w:val="28"/>
+          <w:szCs w:val="28"/>
+        </w:rPr>
+        <w:br w:type="page"/>
+      </w:r>
+    </w:p>
+    <w:p>
+      <w:pPr>
+        <w:tabs>
+          <w:tab w:val="right" w:leader="dot" w:pos="8505"/>
+        </w:tabs>
+        <w:spacing w:line="360" w:lineRule="auto"/>
+        <w:rPr>
+          <w:b/>
+          <w:bCs/>
+          <w:sz w:val="28"/>
+          <w:szCs w:val="28"/>
+        </w:rPr>
+      </w:pPr>
+      <w:r>
+        <w:rPr>
+          <w:rFonts w:ascii="Segoe UI Emoji" w:hAnsi="Segoe UI Emoji" w:cs="Segoe UI Emoji"/>
+          <w:b/>
+          <w:bCs/>
+          <w:sz w:val="40"/>
+          <w:szCs w:val="40"/>
+        </w:rPr>
+        <w:lastRenderedPageBreak/>
+        <w:t>🍰</w:t>
+      </w:r>
+      <w:r>
+        <w:rPr>
+          <w:b/>
+          <w:bCs/>
+          <w:sz w:val="40"/>
+          <w:szCs w:val="40"/>
+        </w:rPr>
+        <w:t xml:space="preserve"> </w:t>
+      </w:r>
+      <w:r>
+        <w:rPr>
+          <w:b/>
+          <w:bCs/>
+          <w:color w:val="0070C0"/>
+          <w:sz w:val="40"/>
+          <w:szCs w:val="40"/>
+        </w:rPr>
+        <w:t>Cakes</w:t>
+      </w:r>
+    </w:p>
+    <w:p>
+      <w:pPr>
+        <w:tabs>
+          <w:tab w:val="right" w:leader="dot" w:pos="8505"/>
+        </w:tabs>
+        <w:spacing w:line="360" w:lineRule="auto"/>
+        <w:rPr>
+          <w:b/>
+          <w:bCs/>
+          <w:sz w:val="28"/>
+          <w:szCs w:val="28"/>
+        </w:rPr>
+      </w:pPr>
+      <w:r>
+        <w:rPr>
+          <w:sz w:val="28"/>
+          <w:szCs w:val="28"/>
+        </w:rPr>
+        <w:t xml:space="preserve">Chocolate Cake </w:t>
+      </w:r>
+      <w:r>
+        <w:rPr>
+          <w:sz w:val="28"/>
+          <w:szCs w:val="28"/>
+        </w:rPr>
+        <w:tab/>
+      </w:r>
+      <w:r>
+        <w:rPr>
+          <w:sz w:val="28"/>
+          <w:szCs w:val="28"/>
+        </w:rPr>
+        <w:t>0.50 EUR</w:t>
+      </w:r>
+    </w:p>
+    <w:p>
+      <w:pPr>
+        <w:tabs>
+          <w:tab w:val="right" w:leader="dot" w:pos="8505"/>
+        </w:tabs>
+        <w:spacing w:line="360" w:lineRule="auto"/>
+        <w:rPr>
+          <w:sz w:val="28"/>
+          <w:szCs w:val="28"/>
+        </w:rPr>
+      </w:pPr>
+      <w:r>
+        <w:rPr>
+          <w:sz w:val="28"/>
+          <w:szCs w:val="28"/>
+        </w:rPr>
+        <w:t>Apples Cake</w:t>
+      </w:r>
+      <w:r>
+        <w:rPr>
+          <w:sz w:val="28"/>
+          <w:szCs w:val="28"/>
+        </w:rPr>
+        <w:tab/>
+        <w:t>0.50 EUR</w:t>
+      </w:r>
+    </w:p>
+    <w:p>
+      <w:pPr>
+        <w:rPr>
+          <w:sz w:val="28"/>
+          <w:szCs w:val="28"/>
+        </w:rPr>
+      </w:pPr>
+      <w:r>
+        <w:rPr>
+          <w:sz w:val="28"/>
+          <w:szCs w:val="28"/>
+        </w:rPr>
+        <w:br w:type="page"/>
+      </w:r>
+    </w:p>
+    <w:p>
+      <w:pPr>
+        <w:tabs>
+          <w:tab w:val="right" w:leader="dot" w:pos="8505"/>
+        </w:tabs>
+        <w:spacing w:line="360" w:lineRule="auto"/>
+        <w:rPr>
+          <w:color w:val="0070C0"/>
+          <w:sz w:val="40"/>
+          <w:szCs w:val="40"/>
+          <w:lang w:val="cs-CZ"/>
+        </w:rPr>
+      </w:pPr>
+      <w:r>
+        <w:rPr>
+          <mc:AlternateContent>
+            <mc:Choice Requires="w16se"/>
+            <mc:Fallback>
+              <w:rFonts w:ascii="Segoe UI Emoji" w:eastAsia="Segoe UI Emoji" w:hAnsi="Segoe UI Emoji" w:cs="Segoe UI Emoji"/>
+            </mc:Fallback>
+          </mc:AlternateContent>
+          <w:sz w:val="40"/>
+          <w:szCs w:val="40"/>
+          <w:lang w:val="cs-CZ"/>
+        </w:rPr>
+        <w:lastRenderedPageBreak/>
+        <mc:AlternateContent>
+          <mc:Choice Requires="w16se">
+            <w16se:symEx w16se:font="Segoe UI Emoji" w16se:char="1F366"/>
+          </mc:Choice>
+          <mc:Fallback>
+            <w:t>🍦</w:t>
+          </mc:Fallback>
+        </mc:AlternateContent>
+      </w:r>
+      <w:proofErr w:type="spellStart"/>
+      <w:r>
+        <w:rPr>
+          <w:color w:val="0070C0"/>
+          <w:sz w:val="40"/>
+          <w:szCs w:val="40"/>
+          <w:lang w:val="cs-CZ"/>
+        </w:rPr>
+        <w:t>Ice</w:t>
+      </w:r>
+      <w:proofErr w:type="spellEnd"/>
+      <w:r>
+        <w:rPr>
+          <w:color w:val="0070C0"/>
+          <w:sz w:val="40"/>
+          <w:szCs w:val="40"/>
+          <w:lang w:val="cs-CZ"/>
+        </w:rPr>
+        <w:t xml:space="preserve"> </w:t>
+      </w:r>
+      <w:proofErr w:type="spellStart"/>
+      <w:r>
+        <w:rPr>
+          <w:color w:val="0070C0"/>
+          <w:sz w:val="40"/>
+          <w:szCs w:val="40"/>
+          <w:lang w:val="cs-CZ"/>
+        </w:rPr>
+        <w:t>Creams</w:t>
+      </w:r>
+      <w:proofErr w:type="spellEnd"/>
+    </w:p>
+    <w:p>
+      <w:pPr>
+        <w:tabs>
+          <w:tab w:val="right" w:leader="dot" w:pos="8505"/>
+        </w:tabs>
+        <w:spacing w:line="360" w:lineRule="auto"/>
+        <w:rPr>
+          <w:color w:val="0070C0"/>
+          <w:sz w:val="40"/>
+          <w:szCs w:val="40"/>
+          <w:lang w:val="cs-CZ"/>
+        </w:rPr>
+      </w:pPr>
+      <w:proofErr w:type="spellStart"/>
+      <w:r>
+        <w:rPr>
+          <w:sz w:val="28"/>
+          <w:szCs w:val="28"/>
+          <w:lang w:val="cs-CZ"/>
+        </w:rPr>
+        <w:t>Häagen-Dazs</w:t>
+      </w:r>
+      <w:proofErr w:type="spellEnd"/>
+      <w:r>
+        <w:rPr>
+          <w:sz w:val="28"/>
+          <w:szCs w:val="28"/>
+          <w:lang w:val="cs-CZ"/>
+        </w:rPr>
+        <w:t xml:space="preserve"> </w:t>
+      </w:r>
+      <w:proofErr w:type="spellStart"/>
+      <w:r>
+        <w:rPr>
+          <w:sz w:val="28"/>
+          <w:szCs w:val="28"/>
+          <w:lang w:val="cs-CZ"/>
+        </w:rPr>
+        <w:t>Salted</w:t>
+      </w:r>
+      <w:proofErr w:type="spellEnd"/>
+      <w:r>
+        <w:rPr>
+          <w:sz w:val="28"/>
+          <w:szCs w:val="28"/>
+          <w:lang w:val="cs-CZ"/>
+        </w:rPr>
+        <w:t xml:space="preserve"> </w:t>
+      </w:r>
+      <w:proofErr w:type="spellStart"/>
+      <w:r>
+        <w:rPr>
+          <w:sz w:val="28"/>
+          <w:szCs w:val="28"/>
+          <w:lang w:val="cs-CZ"/>
+        </w:rPr>
+        <w:t>Caramel</w:t>
+      </w:r>
+      <w:proofErr w:type="spellEnd"/>
+      <w:r>
+        <w:rPr>
+          <w:sz w:val="28"/>
+          <w:szCs w:val="28"/>
+          <w:lang w:val="cs-CZ"/>
+        </w:rPr>
+        <w:t xml:space="preserve"> (460 ml)</w:t>
+      </w:r>
+      <w:r>
+        <w:rPr>
+          <w:sz w:val="28"/>
+          <w:szCs w:val="28"/>
+          <w:lang w:val="cs-CZ"/>
+        </w:rPr>
+        <w:tab/>
+        <w:t>8.00 EUR</w:t>
+      </w:r>
+    </w:p>
+    <w:p>
+      <w:pPr>
+        <w:tabs>
+          <w:tab w:val="right" w:leader="dot" w:pos="8505"/>
+        </w:tabs>
+        <w:spacing w:line="360" w:lineRule="auto"/>
+        <w:rPr>
+          <w:sz w:val="28"/>
+          <w:szCs w:val="28"/>
+          <w:lang w:val="cs-CZ"/>
+        </w:rPr>
+      </w:pPr>
+      <w:proofErr w:type="spellStart"/>
+      <w:r>
+        <w:rPr>
+          <w:sz w:val="28"/>
+          <w:szCs w:val="28"/>
+          <w:lang w:val="cs-CZ"/>
+        </w:rPr>
+        <w:t>Häagen-Dazs</w:t>
+      </w:r>
+      <w:proofErr w:type="spellEnd"/>
+      <w:r>
+        <w:rPr>
+          <w:sz w:val="28"/>
+          <w:szCs w:val="28"/>
+          <w:lang w:val="cs-CZ"/>
+        </w:rPr>
+        <w:t xml:space="preserve"> </w:t>
+      </w:r>
+      <w:proofErr w:type="spellStart"/>
+      <w:r>
+        <w:rPr>
+          <w:sz w:val="28"/>
+          <w:szCs w:val="28"/>
+          <w:lang w:val="cs-CZ"/>
+        </w:rPr>
+        <w:t>Strawberies</w:t>
+      </w:r>
+      <w:proofErr w:type="spellEnd"/>
+      <w:r>
+        <w:rPr>
+          <w:sz w:val="28"/>
+          <w:szCs w:val="28"/>
+          <w:lang w:val="cs-CZ"/>
+        </w:rPr>
+        <w:t xml:space="preserve"> and </w:t>
+      </w:r>
+      <w:proofErr w:type="spellStart"/>
+      <w:r>
+        <w:rPr>
+          <w:sz w:val="28"/>
+          <w:szCs w:val="28"/>
+          <w:lang w:val="cs-CZ"/>
+        </w:rPr>
+        <w:t>Cream</w:t>
+      </w:r>
+      <w:proofErr w:type="spellEnd"/>
+      <w:r>
+        <w:rPr>
+          <w:sz w:val="28"/>
+          <w:szCs w:val="28"/>
+          <w:lang w:val="cs-CZ"/>
+        </w:rPr>
+        <w:t xml:space="preserve"> (460 ml)</w:t>
+      </w:r>
+      <w:r>
+        <w:rPr>
+          <w:sz w:val="28"/>
+          <w:szCs w:val="28"/>
+          <w:lang w:val="cs-CZ"/>
+        </w:rPr>
+        <w:tab/>
+        <w:t>8.00 EUR</w:t>
+      </w:r>
+    </w:p>
+    <w:p>
+      <w:pPr>
+        <w:tabs>
+          <w:tab w:val="right" w:leader="dot" w:pos="8505"/>
+        </w:tabs>
+        <w:spacing w:line="360" w:lineRule="auto"/>
+        <w:rPr>
+          <w:sz w:val="28"/>
+          <w:szCs w:val="28"/>
+          <w:lang w:val="cs-CZ"/>
+        </w:rPr>
+      </w:pPr>
+      <w:proofErr w:type="spellStart"/>
+      <w:r>
+        <w:rPr>
+          <w:sz w:val="28"/>
+          <w:szCs w:val="28"/>
+          <w:lang w:val="cs-CZ"/>
+        </w:rPr>
+        <w:t>Häagen-Dazs</w:t>
+      </w:r>
+      <w:proofErr w:type="spellEnd"/>
+      <w:r>
+        <w:rPr>
+          <w:sz w:val="28"/>
+          <w:szCs w:val="28"/>
+          <w:lang w:val="cs-CZ"/>
+        </w:rPr>
+        <w:t xml:space="preserve"> </w:t>
+      </w:r>
+      <w:proofErr w:type="spellStart"/>
+      <w:r>
+        <w:rPr>
+          <w:sz w:val="28"/>
+          <w:szCs w:val="28"/>
+          <w:lang w:val="cs-CZ"/>
+        </w:rPr>
+        <w:t>Vanilla</w:t>
+      </w:r>
+      <w:proofErr w:type="spellEnd"/>
+      <w:r>
+        <w:rPr>
+          <w:sz w:val="28"/>
+          <w:szCs w:val="28"/>
+          <w:lang w:val="cs-CZ"/>
+        </w:rPr>
+        <w:tab/>
+        <w:t>8.00 EUR</w:t>
+      </w:r>
+    </w:p>
+    <w:p>
+      <w:pPr>
+        <w:tabs>
+          <w:tab w:val="right" w:leader="dot" w:pos="8505"/>
+        </w:tabs>
+        <w:spacing w:line="360" w:lineRule="auto"/>
+        <w:rPr>
+          <w:sz w:val="28"/>
+          <w:szCs w:val="28"/>
+          <w:lang w:val="cs-CZ"/>
+        </w:rPr>
+      </w:pPr>
+      <w:proofErr w:type="spellStart"/>
+      <w:r>
+        <w:rPr>
+          <w:sz w:val="28"/>
+          <w:szCs w:val="28"/>
+          <w:lang w:val="cs-CZ"/>
+        </w:rPr>
+        <w:t>Häagen-Dazs</w:t>
+      </w:r>
+      <w:proofErr w:type="spellEnd"/>
+      <w:r>
+        <w:rPr>
+          <w:sz w:val="28"/>
+          <w:szCs w:val="28"/>
+          <w:lang w:val="cs-CZ"/>
+        </w:rPr>
+        <w:t xml:space="preserve"> Mango and </w:t>
+      </w:r>
+      <w:proofErr w:type="spellStart"/>
+      <w:r>
+        <w:rPr>
+          <w:sz w:val="28"/>
+          <w:szCs w:val="28"/>
+          <w:lang w:val="cs-CZ"/>
+        </w:rPr>
+        <w:t>Raspberry</w:t>
+      </w:r>
+      <w:proofErr w:type="spellEnd"/>
+      <w:r>
+        <w:rPr>
+          <w:sz w:val="28"/>
+          <w:szCs w:val="28"/>
+          <w:lang w:val="cs-CZ"/>
+        </w:rPr>
+        <w:tab/>
+        <w:t>8.00 EUR</w:t>
+      </w:r>
+    </w:p>
+    <w:p>
+      <w:pPr>
+        <w:tabs>
+          <w:tab w:val="right" w:leader="dot" w:pos="8505"/>
+        </w:tabs>
+        <w:spacing w:line="360" w:lineRule="auto"/>
+        <w:rPr>
+          <w:sz w:val="28"/>
+          <w:szCs w:val="28"/>
+          <w:lang w:val="cs-CZ"/>
+        </w:rPr>
+      </w:pPr>
+      <w:proofErr w:type="spellStart"/>
+      <w:r>
+        <w:rPr>
+          <w:sz w:val="28"/>
+          <w:szCs w:val="28"/>
+          <w:lang w:val="cs-CZ"/>
+        </w:rPr>
+        <w:t>Häagen-Dazs</w:t>
+      </w:r>
+      <w:proofErr w:type="spellEnd"/>
+      <w:r>
+        <w:rPr>
+          <w:sz w:val="28"/>
+          <w:szCs w:val="28"/>
+          <w:lang w:val="cs-CZ"/>
+        </w:rPr>
+        <w:t xml:space="preserve"> </w:t>
+      </w:r>
+      <w:proofErr w:type="spellStart"/>
+      <w:r>
+        <w:rPr>
+          <w:sz w:val="28"/>
+          <w:szCs w:val="28"/>
+          <w:lang w:val="cs-CZ"/>
+        </w:rPr>
+        <w:t>Blueberries</w:t>
+      </w:r>
+      <w:proofErr w:type="spellEnd"/>
+      <w:r>
+        <w:rPr>
+          <w:sz w:val="28"/>
+          <w:szCs w:val="28"/>
+          <w:lang w:val="cs-CZ"/>
+        </w:rPr>
+        <w:t xml:space="preserve"> and </w:t>
+      </w:r>
+      <w:proofErr w:type="spellStart"/>
+      <w:r>
+        <w:rPr>
+          <w:sz w:val="28"/>
+          <w:szCs w:val="28"/>
+          <w:lang w:val="cs-CZ"/>
+        </w:rPr>
+        <w:t>Cream</w:t>
+      </w:r>
+      <w:proofErr w:type="spellEnd"/>
+      <w:r>
+        <w:rPr>
+          <w:sz w:val="28"/>
+          <w:szCs w:val="28"/>
+          <w:lang w:val="cs-CZ"/>
+        </w:rPr>
+        <w:tab/>
+        <w:t>8.00 EUR</w:t>
+      </w:r>
+    </w:p>
+    <w:p>
+      <w:pPr>
+        <w:tabs>
+          <w:tab w:val="right" w:leader="dot" w:pos="8505"/>
+        </w:tabs>
+        <w:spacing w:line="360" w:lineRule="auto"/>
+        <w:rPr>
+          <w:sz w:val="28"/>
+          <w:szCs w:val="28"/>
+          <w:lang w:val="cs-CZ"/>
+        </w:rPr>
+      </w:pPr>
+      <w:proofErr w:type="spellStart"/>
+      <w:r>
+        <w:rPr>
+          <w:sz w:val="28"/>
+          <w:szCs w:val="28"/>
+          <w:lang w:val="cs-CZ"/>
+        </w:rPr>
+        <w:t>Häagen-Dazs</w:t>
+      </w:r>
+      <w:proofErr w:type="spellEnd"/>
+      <w:r>
+        <w:rPr>
+          <w:sz w:val="28"/>
+          <w:szCs w:val="28"/>
+          <w:lang w:val="cs-CZ"/>
+        </w:rPr>
+        <w:t xml:space="preserve"> </w:t>
+      </w:r>
+      <w:proofErr w:type="spellStart"/>
+      <w:r>
+        <w:rPr>
+          <w:sz w:val="28"/>
+          <w:szCs w:val="28"/>
+          <w:lang w:val="cs-CZ"/>
+        </w:rPr>
+        <w:t>Coffee</w:t>
+      </w:r>
+      <w:proofErr w:type="spellEnd"/>
+      <w:r>
+        <w:rPr>
+          <w:sz w:val="28"/>
+          <w:szCs w:val="28"/>
+          <w:lang w:val="cs-CZ"/>
+        </w:rPr>
+        <w:tab/>
+        <w:t>8.00 EUR</w:t>
+      </w:r>
+    </w:p>
+    <w:p>
+      <w:pPr>
+        <w:tabs>
+          <w:tab w:val="right" w:leader="dot" w:pos="8505"/>
+        </w:tabs>
+        <w:spacing w:line="360" w:lineRule="auto"/>
+        <w:rPr>
+          <w:sz w:val="28"/>
+          <w:szCs w:val="28"/>
+          <w:lang w:val="cs-CZ"/>
+        </w:rPr>
+      </w:pPr>
     </w:p>
     <w:sectPr>
       <w:pgSz w:w="12240" w:h="15840"/>
@@ -2310,6 +2761,119 @@
     </w:lvl>
   </w:abstractNum>
   <w:abstractNum w:abstractNumId="2" w15:restartNumberingAfterBreak="0">
+    <w:nsid w:val="10DA3DFC"/>
+    <w:multiLevelType w:val="hybridMultilevel"/>
+    <w:tmpl w:val="6060D7D0"/>
+    <w:lvl w:ilvl="0" w:tplc="04050001">
+      <w:start w:val="1"/>
+      <w:numFmt w:val="bullet"/>
+      <w:lvlText w:val=""/>
+      <w:lvlJc w:val="left"/>
+      <w:pPr>
+        <w:ind w:left="720" w:hanging="360"/>
+      </w:pPr>
+      <w:rPr>
+        <w:rFonts w:ascii="Symbol" w:hAnsi="Symbol" w:hint="default"/>
+      </w:rPr>
+    </w:lvl>
+    <w:lvl w:ilvl="1" w:tplc="04050003" w:tentative="1">
+      <w:start w:val="1"/>
+      <w:numFmt w:val="bullet"/>
+      <w:lvlText w:val="o"/>
+      <w:lvlJc w:val="left"/>
+      <w:pPr>
+        <w:ind w:left="1440" w:hanging="360"/>
+      </w:pPr>
+      <w:rPr>
+        <w:rFonts w:ascii="Courier New" w:hAnsi="Courier New" w:cs="Courier New" w:hint="default"/>
+      </w:rPr>
+    </w:lvl>
+    <w:lvl w:ilvl="2" w:tplc="04050005" w:tentative="1">
+      <w:start w:val="1"/>
+      <w:numFmt w:val="bullet"/>
+      <w:lvlText w:val=""/>
+      <w:lvlJc w:val="left"/>
+      <w:pPr>
+        <w:ind w:left="2160" w:hanging="360"/>
+      </w:pPr>
+      <w:rPr>
+        <w:rFonts w:ascii="Wingdings" w:hAnsi="Wingdings" w:hint="default"/>
+      </w:rPr>
+    </w:lvl>
+    <w:lvl w:ilvl="3" w:tplc="04050001" w:tentative="1">
+      <w:start w:val="1"/>
+      <w:numFmt w:val="bullet"/>
+      <w:lvlText w:val=""/>
+      <w:lvlJc w:val="left"/>
+      <w:pPr>
+        <w:ind w:left="2880" w:hanging="360"/>
+      </w:pPr>
+      <w:rPr>
+        <w:rFonts w:ascii="Symbol" w:hAnsi="Symbol" w:hint="default"/>
+      </w:rPr>
+    </w:lvl>
+    <w:lvl w:ilvl="4" w:tplc="04050003" w:tentative="1">
+      <w:start w:val="1"/>
+      <w:numFmt w:val="bullet"/>
+      <w:lvlText w:val="o"/>
+      <w:lvlJc w:val="left"/>
+      <w:pPr>
+        <w:ind w:left="3600" w:hanging="360"/>
+      </w:pPr>
+      <w:rPr>
+        <w:rFonts w:ascii="Courier New" w:hAnsi="Courier New" w:cs="Courier New" w:hint="default"/>
+      </w:rPr>
+    </w:lvl>
+    <w:lvl w:ilvl="5" w:tplc="04050005" w:tentative="1">
+      <w:start w:val="1"/>
+      <w:numFmt w:val="bullet"/>
+      <w:lvlText w:val=""/>
+      <w:lvlJc w:val="left"/>
+      <w:pPr>
+        <w:ind w:left="4320" w:hanging="360"/>
+      </w:pPr>
+      <w:rPr>
+        <w:rFonts w:ascii="Wingdings" w:hAnsi="Wingdings" w:hint="default"/>
+      </w:rPr>
+    </w:lvl>
+    <w:lvl w:ilvl="6" w:tplc="04050001" w:tentative="1">
+      <w:start w:val="1"/>
+      <w:numFmt w:val="bullet"/>
+      <w:lvlText w:val=""/>
+      <w:lvlJc w:val="left"/>
+      <w:pPr>
+        <w:ind w:left="5040" w:hanging="360"/>
+      </w:pPr>
+      <w:rPr>
+        <w:rFonts w:ascii="Symbol" w:hAnsi="Symbol" w:hint="default"/>
+      </w:rPr>
+    </w:lvl>
+    <w:lvl w:ilvl="7" w:tplc="04050003" w:tentative="1">
+      <w:start w:val="1"/>
+      <w:numFmt w:val="bullet"/>
+      <w:lvlText w:val="o"/>
+      <w:lvlJc w:val="left"/>
+      <w:pPr>
+        <w:ind w:left="5760" w:hanging="360"/>
+      </w:pPr>
+      <w:rPr>
+        <w:rFonts w:ascii="Courier New" w:hAnsi="Courier New" w:cs="Courier New" w:hint="default"/>
+      </w:rPr>
+    </w:lvl>
+    <w:lvl w:ilvl="8" w:tplc="04050005" w:tentative="1">
+      <w:start w:val="1"/>
+      <w:numFmt w:val="bullet"/>
+      <w:lvlText w:val=""/>
+      <w:lvlJc w:val="left"/>
+      <w:pPr>
+        <w:ind w:left="6480" w:hanging="360"/>
+      </w:pPr>
+      <w:rPr>
+        <w:rFonts w:ascii="Wingdings" w:hAnsi="Wingdings" w:hint="default"/>
+      </w:rPr>
+    </w:lvl>
+  </w:abstractNum>
+  <w:abstractNum w:abstractNumId="3" w15:restartNumberingAfterBreak="0">
     <w:nsid w:val="16126B07"/>
     <w:multiLevelType w:val="hybridMultilevel"/>
     <w:tmpl w:val="51EC4E08"/>
@@ -2422,7 +2986,120 @@
       </w:rPr>
     </w:lvl>
   </w:abstractNum>
-  <w:abstractNum w:abstractNumId="3" w15:restartNumberingAfterBreak="0">
+  <w:abstractNum w:abstractNumId="4" w15:restartNumberingAfterBreak="0">
+    <w:nsid w:val="162B1DB3"/>
+    <w:multiLevelType w:val="hybridMultilevel"/>
+    <w:tmpl w:val="AE2EA4C0"/>
+    <w:lvl w:ilvl="0" w:tplc="04050001">
+      <w:start w:val="1"/>
+      <w:numFmt w:val="bullet"/>
+      <w:lvlText w:val=""/>
+      <w:lvlJc w:val="left"/>
+      <w:pPr>
+        <w:ind w:left="720" w:hanging="360"/>
+      </w:pPr>
+      <w:rPr>
+        <w:rFonts w:ascii="Symbol" w:hAnsi="Symbol" w:hint="default"/>
+      </w:rPr>
+    </w:lvl>
+    <w:lvl w:ilvl="1" w:tplc="04050003" w:tentative="1">
+      <w:start w:val="1"/>
+      <w:numFmt w:val="bullet"/>
+      <w:lvlText w:val="o"/>
+      <w:lvlJc w:val="left"/>
+      <w:pPr>
+        <w:ind w:left="1440" w:hanging="360"/>
+      </w:pPr>
+      <w:rPr>
+        <w:rFonts w:ascii="Courier New" w:hAnsi="Courier New" w:cs="Courier New" w:hint="default"/>
+      </w:rPr>
+    </w:lvl>
+    <w:lvl w:ilvl="2" w:tplc="04050005" w:tentative="1">
+      <w:start w:val="1"/>
+      <w:numFmt w:val="bullet"/>
+      <w:lvlText w:val=""/>
+      <w:lvlJc w:val="left"/>
+      <w:pPr>
+        <w:ind w:left="2160" w:hanging="360"/>
+      </w:pPr>
+      <w:rPr>
+        <w:rFonts w:ascii="Wingdings" w:hAnsi="Wingdings" w:hint="default"/>
+      </w:rPr>
+    </w:lvl>
+    <w:lvl w:ilvl="3" w:tplc="04050001" w:tentative="1">
+      <w:start w:val="1"/>
+      <w:numFmt w:val="bullet"/>
+      <w:lvlText w:val=""/>
+      <w:lvlJc w:val="left"/>
+      <w:pPr>
+        <w:ind w:left="2880" w:hanging="360"/>
+      </w:pPr>
+      <w:rPr>
+        <w:rFonts w:ascii="Symbol" w:hAnsi="Symbol" w:hint="default"/>
+      </w:rPr>
+    </w:lvl>
+    <w:lvl w:ilvl="4" w:tplc="04050003" w:tentative="1">
+      <w:start w:val="1"/>
+      <w:numFmt w:val="bullet"/>
+      <w:lvlText w:val="o"/>
+      <w:lvlJc w:val="left"/>
+      <w:pPr>
+        <w:ind w:left="3600" w:hanging="360"/>
+      </w:pPr>
+      <w:rPr>
+        <w:rFonts w:ascii="Courier New" w:hAnsi="Courier New" w:cs="Courier New" w:hint="default"/>
+      </w:rPr>
+    </w:lvl>
+    <w:lvl w:ilvl="5" w:tplc="04050005" w:tentative="1">
+      <w:start w:val="1"/>
+      <w:numFmt w:val="bullet"/>
+      <w:lvlText w:val=""/>
+      <w:lvlJc w:val="left"/>
+      <w:pPr>
+        <w:ind w:left="4320" w:hanging="360"/>
+      </w:pPr>
+      <w:rPr>
+        <w:rFonts w:ascii="Wingdings" w:hAnsi="Wingdings" w:hint="default"/>
+      </w:rPr>
+    </w:lvl>
+    <w:lvl w:ilvl="6" w:tplc="04050001" w:tentative="1">
+      <w:start w:val="1"/>
+      <w:numFmt w:val="bullet"/>
+      <w:lvlText w:val=""/>
+      <w:lvlJc w:val="left"/>
+      <w:pPr>
+        <w:ind w:left="5040" w:hanging="360"/>
+      </w:pPr>
+      <w:rPr>
+        <w:rFonts w:ascii="Symbol" w:hAnsi="Symbol" w:hint="default"/>
+      </w:rPr>
+    </w:lvl>
+    <w:lvl w:ilvl="7" w:tplc="04050003" w:tentative="1">
+      <w:start w:val="1"/>
+      <w:numFmt w:val="bullet"/>
+      <w:lvlText w:val="o"/>
+      <w:lvlJc w:val="left"/>
+      <w:pPr>
+        <w:ind w:left="5760" w:hanging="360"/>
+      </w:pPr>
+      <w:rPr>
+        <w:rFonts w:ascii="Courier New" w:hAnsi="Courier New" w:cs="Courier New" w:hint="default"/>
+      </w:rPr>
+    </w:lvl>
+    <w:lvl w:ilvl="8" w:tplc="04050005" w:tentative="1">
+      <w:start w:val="1"/>
+      <w:numFmt w:val="bullet"/>
+      <w:lvlText w:val=""/>
+      <w:lvlJc w:val="left"/>
+      <w:pPr>
+        <w:ind w:left="6480" w:hanging="360"/>
+      </w:pPr>
+      <w:rPr>
+        <w:rFonts w:ascii="Wingdings" w:hAnsi="Wingdings" w:hint="default"/>
+      </w:rPr>
+    </w:lvl>
+  </w:abstractNum>
+  <w:abstractNum w:abstractNumId="5" w15:restartNumberingAfterBreak="0">
     <w:nsid w:val="1C3A0C5A"/>
     <w:multiLevelType w:val="multilevel"/>
     <w:tmpl w:val="05A29176"/>
@@ -2571,7 +3248,7 @@
       </w:rPr>
     </w:lvl>
   </w:abstractNum>
-  <w:abstractNum w:abstractNumId="4" w15:restartNumberingAfterBreak="0">
+  <w:abstractNum w:abstractNumId="6" w15:restartNumberingAfterBreak="0">
     <w:nsid w:val="28044A38"/>
     <w:multiLevelType w:val="multilevel"/>
     <w:tmpl w:val="36EE9DAE"/>
@@ -2720,7 +3397,7 @@
       </w:rPr>
     </w:lvl>
   </w:abstractNum>
-  <w:abstractNum w:abstractNumId="5" w15:restartNumberingAfterBreak="0">
+  <w:abstractNum w:abstractNumId="7" w15:restartNumberingAfterBreak="0">
     <w:nsid w:val="2D3F77D8"/>
     <w:multiLevelType w:val="multilevel"/>
     <w:tmpl w:val="DCB48A3C"/>
@@ -2869,7 +3546,7 @@
       </w:rPr>
     </w:lvl>
   </w:abstractNum>
-  <w:abstractNum w:abstractNumId="6" w15:restartNumberingAfterBreak="0">
+  <w:abstractNum w:abstractNumId="8" w15:restartNumberingAfterBreak="0">
     <w:nsid w:val="3B50350C"/>
     <w:multiLevelType w:val="multilevel"/>
     <w:tmpl w:val="7E12DDE4"/>
@@ -3018,7 +3695,233 @@
       </w:rPr>
     </w:lvl>
   </w:abstractNum>
-  <w:abstractNum w:abstractNumId="7" w15:restartNumberingAfterBreak="0">
+  <w:abstractNum w:abstractNumId="9" w15:restartNumberingAfterBreak="0">
+    <w:nsid w:val="4516228A"/>
+    <w:multiLevelType w:val="hybridMultilevel"/>
+    <w:tmpl w:val="7FF416F4"/>
+    <w:lvl w:ilvl="0" w:tplc="04050001">
+      <w:start w:val="1"/>
+      <w:numFmt w:val="bullet"/>
+      <w:lvlText w:val=""/>
+      <w:lvlJc w:val="left"/>
+      <w:pPr>
+        <w:ind w:left="720" w:hanging="360"/>
+      </w:pPr>
+      <w:rPr>
+        <w:rFonts w:ascii="Symbol" w:hAnsi="Symbol" w:hint="default"/>
+      </w:rPr>
+    </w:lvl>
+    <w:lvl w:ilvl="1" w:tplc="04050003" w:tentative="1">
+      <w:start w:val="1"/>
+      <w:numFmt w:val="bullet"/>
+      <w:lvlText w:val="o"/>
+      <w:lvlJc w:val="left"/>
+      <w:pPr>
+        <w:ind w:left="1440" w:hanging="360"/>
+      </w:pPr>
+      <w:rPr>
+        <w:rFonts w:ascii="Courier New" w:hAnsi="Courier New" w:cs="Courier New" w:hint="default"/>
+      </w:rPr>
+    </w:lvl>
+    <w:lvl w:ilvl="2" w:tplc="04050005" w:tentative="1">
+      <w:start w:val="1"/>
+      <w:numFmt w:val="bullet"/>
+      <w:lvlText w:val=""/>
+      <w:lvlJc w:val="left"/>
+      <w:pPr>
+        <w:ind w:left="2160" w:hanging="360"/>
+      </w:pPr>
+      <w:rPr>
+        <w:rFonts w:ascii="Wingdings" w:hAnsi="Wingdings" w:hint="default"/>
+      </w:rPr>
+    </w:lvl>
+    <w:lvl w:ilvl="3" w:tplc="04050001" w:tentative="1">
+      <w:start w:val="1"/>
+      <w:numFmt w:val="bullet"/>
+      <w:lvlText w:val=""/>
+      <w:lvlJc w:val="left"/>
+      <w:pPr>
+        <w:ind w:left="2880" w:hanging="360"/>
+      </w:pPr>
+      <w:rPr>
+        <w:rFonts w:ascii="Symbol" w:hAnsi="Symbol" w:hint="default"/>
+      </w:rPr>
+    </w:lvl>
+    <w:lvl w:ilvl="4" w:tplc="04050003" w:tentative="1">
+      <w:start w:val="1"/>
+      <w:numFmt w:val="bullet"/>
+      <w:lvlText w:val="o"/>
+      <w:lvlJc w:val="left"/>
+      <w:pPr>
+        <w:ind w:left="3600" w:hanging="360"/>
+      </w:pPr>
+      <w:rPr>
+        <w:rFonts w:ascii="Courier New" w:hAnsi="Courier New" w:cs="Courier New" w:hint="default"/>
+      </w:rPr>
+    </w:lvl>
+    <w:lvl w:ilvl="5" w:tplc="04050005" w:tentative="1">
+      <w:start w:val="1"/>
+      <w:numFmt w:val="bullet"/>
+      <w:lvlText w:val=""/>
+      <w:lvlJc w:val="left"/>
+      <w:pPr>
+        <w:ind w:left="4320" w:hanging="360"/>
+      </w:pPr>
+      <w:rPr>
+        <w:rFonts w:ascii="Wingdings" w:hAnsi="Wingdings" w:hint="default"/>
+      </w:rPr>
+    </w:lvl>
+    <w:lvl w:ilvl="6" w:tplc="04050001" w:tentative="1">
+      <w:start w:val="1"/>
+      <w:numFmt w:val="bullet"/>
+      <w:lvlText w:val=""/>
+      <w:lvlJc w:val="left"/>
+      <w:pPr>
+        <w:ind w:left="5040" w:hanging="360"/>
+      </w:pPr>
+      <w:rPr>
+        <w:rFonts w:ascii="Symbol" w:hAnsi="Symbol" w:hint="default"/>
+      </w:rPr>
+    </w:lvl>
+    <w:lvl w:ilvl="7" w:tplc="04050003" w:tentative="1">
+      <w:start w:val="1"/>
+      <w:numFmt w:val="bullet"/>
+      <w:lvlText w:val="o"/>
+      <w:lvlJc w:val="left"/>
+      <w:pPr>
+        <w:ind w:left="5760" w:hanging="360"/>
+      </w:pPr>
+      <w:rPr>
+        <w:rFonts w:ascii="Courier New" w:hAnsi="Courier New" w:cs="Courier New" w:hint="default"/>
+      </w:rPr>
+    </w:lvl>
+    <w:lvl w:ilvl="8" w:tplc="04050005" w:tentative="1">
+      <w:start w:val="1"/>
+      <w:numFmt w:val="bullet"/>
+      <w:lvlText w:val=""/>
+      <w:lvlJc w:val="left"/>
+      <w:pPr>
+        <w:ind w:left="6480" w:hanging="360"/>
+      </w:pPr>
+      <w:rPr>
+        <w:rFonts w:ascii="Wingdings" w:hAnsi="Wingdings" w:hint="default"/>
+      </w:rPr>
+    </w:lvl>
+  </w:abstractNum>
+  <w:abstractNum w:abstractNumId="10" w15:restartNumberingAfterBreak="0">
+    <w:nsid w:val="4B983F0B"/>
+    <w:multiLevelType w:val="hybridMultilevel"/>
+    <w:tmpl w:val="80688068"/>
+    <w:lvl w:ilvl="0" w:tplc="04050001">
+      <w:start w:val="1"/>
+      <w:numFmt w:val="bullet"/>
+      <w:lvlText w:val=""/>
+      <w:lvlJc w:val="left"/>
+      <w:pPr>
+        <w:ind w:left="720" w:hanging="360"/>
+      </w:pPr>
+      <w:rPr>
+        <w:rFonts w:ascii="Symbol" w:hAnsi="Symbol" w:hint="default"/>
+      </w:rPr>
+    </w:lvl>
+    <w:lvl w:ilvl="1" w:tplc="04050003" w:tentative="1">
+      <w:start w:val="1"/>
+      <w:numFmt w:val="bullet"/>
+      <w:lvlText w:val="o"/>
+      <w:lvlJc w:val="left"/>
+      <w:pPr>
+        <w:ind w:left="1440" w:hanging="360"/>
+      </w:pPr>
+      <w:rPr>
+        <w:rFonts w:ascii="Courier New" w:hAnsi="Courier New" w:cs="Courier New" w:hint="default"/>
+      </w:rPr>
+    </w:lvl>
+    <w:lvl w:ilvl="2" w:tplc="04050005" w:tentative="1">
+      <w:start w:val="1"/>
+      <w:numFmt w:val="bullet"/>
+      <w:lvlText w:val=""/>
+      <w:lvlJc w:val="left"/>
+      <w:pPr>
+        <w:ind w:left="2160" w:hanging="360"/>
+      </w:pPr>
+      <w:rPr>
+        <w:rFonts w:ascii="Wingdings" w:hAnsi="Wingdings" w:hint="default"/>
+      </w:rPr>
+    </w:lvl>
+    <w:lvl w:ilvl="3" w:tplc="04050001" w:tentative="1">
+      <w:start w:val="1"/>
+      <w:numFmt w:val="bullet"/>
+      <w:lvlText w:val=""/>
+      <w:lvlJc w:val="left"/>
+      <w:pPr>
+        <w:ind w:left="2880" w:hanging="360"/>
+      </w:pPr>
+      <w:rPr>
+        <w:rFonts w:ascii="Symbol" w:hAnsi="Symbol" w:hint="default"/>
+      </w:rPr>
+    </w:lvl>
+    <w:lvl w:ilvl="4" w:tplc="04050003" w:tentative="1">
+      <w:start w:val="1"/>
+      <w:numFmt w:val="bullet"/>
+      <w:lvlText w:val="o"/>
+      <w:lvlJc w:val="left"/>
+      <w:pPr>
+        <w:ind w:left="3600" w:hanging="360"/>
+      </w:pPr>
+      <w:rPr>
+        <w:rFonts w:ascii="Courier New" w:hAnsi="Courier New" w:cs="Courier New" w:hint="default"/>
+      </w:rPr>
+    </w:lvl>
+    <w:lvl w:ilvl="5" w:tplc="04050005" w:tentative="1">
+      <w:start w:val="1"/>
+      <w:numFmt w:val="bullet"/>
+      <w:lvlText w:val=""/>
+      <w:lvlJc w:val="left"/>
+      <w:pPr>
+        <w:ind w:left="4320" w:hanging="360"/>
+      </w:pPr>
+      <w:rPr>
+        <w:rFonts w:ascii="Wingdings" w:hAnsi="Wingdings" w:hint="default"/>
+      </w:rPr>
+    </w:lvl>
+    <w:lvl w:ilvl="6" w:tplc="04050001" w:tentative="1">
+      <w:start w:val="1"/>
+      <w:numFmt w:val="bullet"/>
+      <w:lvlText w:val=""/>
+      <w:lvlJc w:val="left"/>
+      <w:pPr>
+        <w:ind w:left="5040" w:hanging="360"/>
+      </w:pPr>
+      <w:rPr>
+        <w:rFonts w:ascii="Symbol" w:hAnsi="Symbol" w:hint="default"/>
+      </w:rPr>
+    </w:lvl>
+    <w:lvl w:ilvl="7" w:tplc="04050003" w:tentative="1">
+      <w:start w:val="1"/>
+      <w:numFmt w:val="bullet"/>
+      <w:lvlText w:val="o"/>
+      <w:lvlJc w:val="left"/>
+      <w:pPr>
+        <w:ind w:left="5760" w:hanging="360"/>
+      </w:pPr>
+      <w:rPr>
+        <w:rFonts w:ascii="Courier New" w:hAnsi="Courier New" w:cs="Courier New" w:hint="default"/>
+      </w:rPr>
+    </w:lvl>
+    <w:lvl w:ilvl="8" w:tplc="04050005" w:tentative="1">
+      <w:start w:val="1"/>
+      <w:numFmt w:val="bullet"/>
+      <w:lvlText w:val=""/>
+      <w:lvlJc w:val="left"/>
+      <w:pPr>
+        <w:ind w:left="6480" w:hanging="360"/>
+      </w:pPr>
+      <w:rPr>
+        <w:rFonts w:ascii="Wingdings" w:hAnsi="Wingdings" w:hint="default"/>
+      </w:rPr>
+    </w:lvl>
+  </w:abstractNum>
+  <w:abstractNum w:abstractNumId="11" w15:restartNumberingAfterBreak="0">
     <w:nsid w:val="4DF31846"/>
     <w:multiLevelType w:val="multilevel"/>
     <w:tmpl w:val="D9F8BCF0"/>
@@ -3167,7 +4070,269 @@
       </w:rPr>
     </w:lvl>
   </w:abstractNum>
-  <w:abstractNum w:abstractNumId="8" w15:restartNumberingAfterBreak="0">
+  <w:abstractNum w:abstractNumId="12" w15:restartNumberingAfterBreak="0">
+    <w:nsid w:val="51933315"/>
+    <w:multiLevelType w:val="hybridMultilevel"/>
+    <w:tmpl w:val="F3F47ACC"/>
+    <w:lvl w:ilvl="0" w:tplc="04050001">
+      <w:start w:val="1"/>
+      <w:numFmt w:val="bullet"/>
+      <w:lvlText w:val=""/>
+      <w:lvlJc w:val="left"/>
+      <w:pPr>
+        <w:ind w:left="1440" w:hanging="360"/>
+      </w:pPr>
+      <w:rPr>
+        <w:rFonts w:ascii="Symbol" w:hAnsi="Symbol" w:hint="default"/>
+      </w:rPr>
+    </w:lvl>
+    <w:lvl w:ilvl="1" w:tplc="04050003" w:tentative="1">
+      <w:start w:val="1"/>
+      <w:numFmt w:val="bullet"/>
+      <w:lvlText w:val="o"/>
+      <w:lvlJc w:val="left"/>
+      <w:pPr>
+        <w:ind w:left="2160" w:hanging="360"/>
+      </w:pPr>
+      <w:rPr>
+        <w:rFonts w:ascii="Courier New" w:hAnsi="Courier New" w:cs="Courier New" w:hint="default"/>
+      </w:rPr>
+    </w:lvl>
+    <w:lvl w:ilvl="2" w:tplc="04050005" w:tentative="1">
+      <w:start w:val="1"/>
+      <w:numFmt w:val="bullet"/>
+      <w:lvlText w:val=""/>
+      <w:lvlJc w:val="left"/>
+      <w:pPr>
+        <w:ind w:left="2880" w:hanging="360"/>
+      </w:pPr>
+      <w:rPr>
+        <w:rFonts w:ascii="Wingdings" w:hAnsi="Wingdings" w:hint="default"/>
+      </w:rPr>
+    </w:lvl>
+    <w:lvl w:ilvl="3" w:tplc="04050001" w:tentative="1">
+      <w:start w:val="1"/>
+      <w:numFmt w:val="bullet"/>
+      <w:lvlText w:val=""/>
+      <w:lvlJc w:val="left"/>
+      <w:pPr>
+        <w:ind w:left="3600" w:hanging="360"/>
+      </w:pPr>
+      <w:rPr>
+        <w:rFonts w:ascii="Symbol" w:hAnsi="Symbol" w:hint="default"/>
+      </w:rPr>
+    </w:lvl>
+    <w:lvl w:ilvl="4" w:tplc="04050003" w:tentative="1">
+      <w:start w:val="1"/>
+      <w:numFmt w:val="bullet"/>
+      <w:lvlText w:val="o"/>
+      <w:lvlJc w:val="left"/>
+      <w:pPr>
+        <w:ind w:left="4320" w:hanging="360"/>
+      </w:pPr>
+      <w:rPr>
+        <w:rFonts w:ascii="Courier New" w:hAnsi="Courier New" w:cs="Courier New" w:hint="default"/>
+      </w:rPr>
+    </w:lvl>
+    <w:lvl w:ilvl="5" w:tplc="04050005" w:tentative="1">
+      <w:start w:val="1"/>
+      <w:numFmt w:val="bullet"/>
+      <w:lvlText w:val=""/>
+      <w:lvlJc w:val="left"/>
+      <w:pPr>
+        <w:ind w:left="5040" w:hanging="360"/>
+      </w:pPr>
+      <w:rPr>
+        <w:rFonts w:ascii="Wingdings" w:hAnsi="Wingdings" w:hint="default"/>
+      </w:rPr>
+    </w:lvl>
+    <w:lvl w:ilvl="6" w:tplc="04050001" w:tentative="1">
+      <w:start w:val="1"/>
+      <w:numFmt w:val="bullet"/>
+      <w:lvlText w:val=""/>
+      <w:lvlJc w:val="left"/>
+      <w:pPr>
+        <w:ind w:left="5760" w:hanging="360"/>
+      </w:pPr>
+      <w:rPr>
+        <w:rFonts w:ascii="Symbol" w:hAnsi="Symbol" w:hint="default"/>
+      </w:rPr>
+    </w:lvl>
+    <w:lvl w:ilvl="7" w:tplc="04050003" w:tentative="1">
+      <w:start w:val="1"/>
+      <w:numFmt w:val="bullet"/>
+      <w:lvlText w:val="o"/>
+      <w:lvlJc w:val="left"/>
+      <w:pPr>
+        <w:ind w:left="6480" w:hanging="360"/>
+      </w:pPr>
+      <w:rPr>
+        <w:rFonts w:ascii="Courier New" w:hAnsi="Courier New" w:cs="Courier New" w:hint="default"/>
+      </w:rPr>
+    </w:lvl>
+    <w:lvl w:ilvl="8" w:tplc="04050005" w:tentative="1">
+      <w:start w:val="1"/>
+      <w:numFmt w:val="bullet"/>
+      <w:lvlText w:val=""/>
+      <w:lvlJc w:val="left"/>
+      <w:pPr>
+        <w:ind w:left="7200" w:hanging="360"/>
+      </w:pPr>
+      <w:rPr>
+        <w:rFonts w:ascii="Wingdings" w:hAnsi="Wingdings" w:hint="default"/>
+      </w:rPr>
+    </w:lvl>
+  </w:abstractNum>
+  <w:abstractNum w:abstractNumId="13" w15:restartNumberingAfterBreak="0">
+    <w:nsid w:val="5319237F"/>
+    <w:multiLevelType w:val="multilevel"/>
+    <w:tmpl w:val="FDA0A02E"/>
+    <w:lvl w:ilvl="0">
+      <w:start w:val="1"/>
+      <w:numFmt w:val="bullet"/>
+      <w:lvlText w:val=""/>
+      <w:lvlJc w:val="left"/>
+      <w:pPr>
+        <w:tabs>
+          <w:tab w:val="num" w:pos="720"/>
+        </w:tabs>
+        <w:ind w:left="720" w:hanging="360"/>
+      </w:pPr>
+      <w:rPr>
+        <w:rFonts w:ascii="Symbol" w:hAnsi="Symbol" w:hint="default"/>
+        <w:sz w:val="20"/>
+      </w:rPr>
+    </w:lvl>
+    <w:lvl w:ilvl="1" w:tentative="1">
+      <w:start w:val="1"/>
+      <w:numFmt w:val="bullet"/>
+      <w:lvlText w:val="o"/>
+      <w:lvlJc w:val="left"/>
+      <w:pPr>
+        <w:tabs>
+          <w:tab w:val="num" w:pos="1440"/>
+        </w:tabs>
+        <w:ind w:left="1440" w:hanging="360"/>
+      </w:pPr>
+      <w:rPr>
+        <w:rFonts w:ascii="Courier New" w:hAnsi="Courier New" w:hint="default"/>
+        <w:sz w:val="20"/>
+      </w:rPr>
+    </w:lvl>
+    <w:lvl w:ilvl="2" w:tentative="1">
+      <w:start w:val="1"/>
+      <w:numFmt w:val="bullet"/>
+      <w:lvlText w:val=""/>
+      <w:lvlJc w:val="left"/>
+      <w:pPr>
+        <w:tabs>
+          <w:tab w:val="num" w:pos="2160"/>
+        </w:tabs>
+        <w:ind w:left="2160" w:hanging="360"/>
+      </w:pPr>
+      <w:rPr>
+        <w:rFonts w:ascii="Wingdings" w:hAnsi="Wingdings" w:hint="default"/>
+        <w:sz w:val="20"/>
+      </w:rPr>
+    </w:lvl>
+    <w:lvl w:ilvl="3" w:tentative="1">
+      <w:start w:val="1"/>
+      <w:numFmt w:val="bullet"/>
+      <w:lvlText w:val=""/>
+      <w:lvlJc w:val="left"/>
+      <w:pPr>
+        <w:tabs>
+          <w:tab w:val="num" w:pos="2880"/>
+        </w:tabs>
+        <w:ind w:left="2880" w:hanging="360"/>
+      </w:pPr>
+      <w:rPr>
+        <w:rFonts w:ascii="Wingdings" w:hAnsi="Wingdings" w:hint="default"/>
+        <w:sz w:val="20"/>
+      </w:rPr>
+    </w:lvl>
+    <w:lvl w:ilvl="4" w:tentative="1">
+      <w:start w:val="1"/>
+      <w:numFmt w:val="bullet"/>
+      <w:lvlText w:val=""/>
+      <w:lvlJc w:val="left"/>
+      <w:pPr>
+        <w:tabs>
+          <w:tab w:val="num" w:pos="3600"/>
+        </w:tabs>
+        <w:ind w:left="3600" w:hanging="360"/>
+      </w:pPr>
+      <w:rPr>
+        <w:rFonts w:ascii="Wingdings" w:hAnsi="Wingdings" w:hint="default"/>
+        <w:sz w:val="20"/>
+      </w:rPr>
+    </w:lvl>
+    <w:lvl w:ilvl="5" w:tentative="1">
+      <w:start w:val="1"/>
+      <w:numFmt w:val="bullet"/>
+      <w:lvlText w:val=""/>
+      <w:lvlJc w:val="left"/>
+      <w:pPr>
+        <w:tabs>
+          <w:tab w:val="num" w:pos="4320"/>
+        </w:tabs>
+        <w:ind w:left="4320" w:hanging="360"/>
+      </w:pPr>
+      <w:rPr>
+        <w:rFonts w:ascii="Wingdings" w:hAnsi="Wingdings" w:hint="default"/>
+        <w:sz w:val="20"/>
+      </w:rPr>
+    </w:lvl>
+    <w:lvl w:ilvl="6" w:tentative="1">
+      <w:start w:val="1"/>
+      <w:numFmt w:val="bullet"/>
+      <w:lvlText w:val=""/>
+      <w:lvlJc w:val="left"/>
+      <w:pPr>
+        <w:tabs>
+          <w:tab w:val="num" w:pos="5040"/>
+        </w:tabs>
+        <w:ind w:left="5040" w:hanging="360"/>
+      </w:pPr>
+      <w:rPr>
+        <w:rFonts w:ascii="Wingdings" w:hAnsi="Wingdings" w:hint="default"/>
+        <w:sz w:val="20"/>
+      </w:rPr>
+    </w:lvl>
+    <w:lvl w:ilvl="7" w:tentative="1">
+      <w:start w:val="1"/>
+      <w:numFmt w:val="bullet"/>
+      <w:lvlText w:val=""/>
+      <w:lvlJc w:val="left"/>
+      <w:pPr>
+        <w:tabs>
+          <w:tab w:val="num" w:pos="5760"/>
+        </w:tabs>
+        <w:ind w:left="5760" w:hanging="360"/>
+      </w:pPr>
+      <w:rPr>
+        <w:rFonts w:ascii="Wingdings" w:hAnsi="Wingdings" w:hint="default"/>
+        <w:sz w:val="20"/>
+      </w:rPr>
+    </w:lvl>
+    <w:lvl w:ilvl="8" w:tentative="1">
+      <w:start w:val="1"/>
+      <w:numFmt w:val="bullet"/>
+      <w:lvlText w:val=""/>
+      <w:lvlJc w:val="left"/>
+      <w:pPr>
+        <w:tabs>
+          <w:tab w:val="num" w:pos="6480"/>
+        </w:tabs>
+        <w:ind w:left="6480" w:hanging="360"/>
+      </w:pPr>
+      <w:rPr>
+        <w:rFonts w:ascii="Wingdings" w:hAnsi="Wingdings" w:hint="default"/>
+        <w:sz w:val="20"/>
+      </w:rPr>
+    </w:lvl>
+  </w:abstractNum>
+  <w:abstractNum w:abstractNumId="14" w15:restartNumberingAfterBreak="0">
     <w:nsid w:val="587013BA"/>
     <w:multiLevelType w:val="hybridMultilevel"/>
     <w:tmpl w:val="EE6417C4"/>
@@ -3253,7 +4418,7 @@
       </w:pPr>
     </w:lvl>
   </w:abstractNum>
-  <w:abstractNum w:abstractNumId="9" w15:restartNumberingAfterBreak="0">
+  <w:abstractNum w:abstractNumId="15" w15:restartNumberingAfterBreak="0">
     <w:nsid w:val="64891BAC"/>
     <w:multiLevelType w:val="multilevel"/>
     <w:tmpl w:val="71FEB86E"/>
@@ -3402,7 +4567,120 @@
       </w:rPr>
     </w:lvl>
   </w:abstractNum>
-  <w:abstractNum w:abstractNumId="10" w15:restartNumberingAfterBreak="0">
+  <w:abstractNum w:abstractNumId="16" w15:restartNumberingAfterBreak="0">
+    <w:nsid w:val="66150938"/>
+    <w:multiLevelType w:val="hybridMultilevel"/>
+    <w:tmpl w:val="C11A783C"/>
+    <w:lvl w:ilvl="0" w:tplc="04050001">
+      <w:start w:val="1"/>
+      <w:numFmt w:val="bullet"/>
+      <w:lvlText w:val=""/>
+      <w:lvlJc w:val="left"/>
+      <w:pPr>
+        <w:ind w:left="720" w:hanging="360"/>
+      </w:pPr>
+      <w:rPr>
+        <w:rFonts w:ascii="Symbol" w:hAnsi="Symbol" w:hint="default"/>
+      </w:rPr>
+    </w:lvl>
+    <w:lvl w:ilvl="1" w:tplc="04050003" w:tentative="1">
+      <w:start w:val="1"/>
+      <w:numFmt w:val="bullet"/>
+      <w:lvlText w:val="o"/>
+      <w:lvlJc w:val="left"/>
+      <w:pPr>
+        <w:ind w:left="1440" w:hanging="360"/>
+      </w:pPr>
+      <w:rPr>
+        <w:rFonts w:ascii="Courier New" w:hAnsi="Courier New" w:cs="Courier New" w:hint="default"/>
+      </w:rPr>
+    </w:lvl>
+    <w:lvl w:ilvl="2" w:tplc="04050005" w:tentative="1">
+      <w:start w:val="1"/>
+      <w:numFmt w:val="bullet"/>
+      <w:lvlText w:val=""/>
+      <w:lvlJc w:val="left"/>
+      <w:pPr>
+        <w:ind w:left="2160" w:hanging="360"/>
+      </w:pPr>
+      <w:rPr>
+        <w:rFonts w:ascii="Wingdings" w:hAnsi="Wingdings" w:hint="default"/>
+      </w:rPr>
+    </w:lvl>
+    <w:lvl w:ilvl="3" w:tplc="04050001" w:tentative="1">
+      <w:start w:val="1"/>
+      <w:numFmt w:val="bullet"/>
+      <w:lvlText w:val=""/>
+      <w:lvlJc w:val="left"/>
+      <w:pPr>
+        <w:ind w:left="2880" w:hanging="360"/>
+      </w:pPr>
+      <w:rPr>
+        <w:rFonts w:ascii="Symbol" w:hAnsi="Symbol" w:hint="default"/>
+      </w:rPr>
+    </w:lvl>
+    <w:lvl w:ilvl="4" w:tplc="04050003" w:tentative="1">
+      <w:start w:val="1"/>
+      <w:numFmt w:val="bullet"/>
+      <w:lvlText w:val="o"/>
+      <w:lvlJc w:val="left"/>
+      <w:pPr>
+        <w:ind w:left="3600" w:hanging="360"/>
+      </w:pPr>
+      <w:rPr>
+        <w:rFonts w:ascii="Courier New" w:hAnsi="Courier New" w:cs="Courier New" w:hint="default"/>
+      </w:rPr>
+    </w:lvl>
+    <w:lvl w:ilvl="5" w:tplc="04050005" w:tentative="1">
+      <w:start w:val="1"/>
+      <w:numFmt w:val="bullet"/>
+      <w:lvlText w:val=""/>
+      <w:lvlJc w:val="left"/>
+      <w:pPr>
+        <w:ind w:left="4320" w:hanging="360"/>
+      </w:pPr>
+      <w:rPr>
+        <w:rFonts w:ascii="Wingdings" w:hAnsi="Wingdings" w:hint="default"/>
+      </w:rPr>
+    </w:lvl>
+    <w:lvl w:ilvl="6" w:tplc="04050001" w:tentative="1">
+      <w:start w:val="1"/>
+      <w:numFmt w:val="bullet"/>
+      <w:lvlText w:val=""/>
+      <w:lvlJc w:val="left"/>
+      <w:pPr>
+        <w:ind w:left="5040" w:hanging="360"/>
+      </w:pPr>
+      <w:rPr>
+        <w:rFonts w:ascii="Symbol" w:hAnsi="Symbol" w:hint="default"/>
+      </w:rPr>
+    </w:lvl>
+    <w:lvl w:ilvl="7" w:tplc="04050003" w:tentative="1">
+      <w:start w:val="1"/>
+      <w:numFmt w:val="bullet"/>
+      <w:lvlText w:val="o"/>
+      <w:lvlJc w:val="left"/>
+      <w:pPr>
+        <w:ind w:left="5760" w:hanging="360"/>
+      </w:pPr>
+      <w:rPr>
+        <w:rFonts w:ascii="Courier New" w:hAnsi="Courier New" w:cs="Courier New" w:hint="default"/>
+      </w:rPr>
+    </w:lvl>
+    <w:lvl w:ilvl="8" w:tplc="04050005" w:tentative="1">
+      <w:start w:val="1"/>
+      <w:numFmt w:val="bullet"/>
+      <w:lvlText w:val=""/>
+      <w:lvlJc w:val="left"/>
+      <w:pPr>
+        <w:ind w:left="6480" w:hanging="360"/>
+      </w:pPr>
+      <w:rPr>
+        <w:rFonts w:ascii="Wingdings" w:hAnsi="Wingdings" w:hint="default"/>
+      </w:rPr>
+    </w:lvl>
+  </w:abstractNum>
+  <w:abstractNum w:abstractNumId="17" w15:restartNumberingAfterBreak="0">
     <w:nsid w:val="662A2542"/>
     <w:multiLevelType w:val="multilevel"/>
     <w:tmpl w:val="3FC61C46"/>
@@ -3551,7 +4829,7 @@
       </w:rPr>
     </w:lvl>
   </w:abstractNum>
-  <w:abstractNum w:abstractNumId="11" w15:restartNumberingAfterBreak="0">
+  <w:abstractNum w:abstractNumId="18" w15:restartNumberingAfterBreak="0">
     <w:nsid w:val="79725511"/>
     <w:multiLevelType w:val="multilevel"/>
     <w:tmpl w:val="6BD2CCF8"/>
@@ -3700,7 +4978,7 @@
       </w:rPr>
     </w:lvl>
   </w:abstractNum>
-  <w:abstractNum w:abstractNumId="12" w15:restartNumberingAfterBreak="0">
+  <w:abstractNum w:abstractNumId="19" w15:restartNumberingAfterBreak="0">
     <w:nsid w:val="7B5F2E66"/>
     <w:multiLevelType w:val="multilevel"/>
     <w:tmpl w:val="55DA07D0"/>
@@ -3850,43 +5128,64 @@
     </w:lvl>
   </w:abstractNum>
   <w:num w:numId="1" w16cid:durableId="100147962">
-    <w:abstractNumId w:val="2"/>
+    <w:abstractNumId w:val="3"/>
   </w:num>
   <w:num w:numId="2" w16cid:durableId="485517411">
-    <w:abstractNumId w:val="8"/>
+    <w:abstractNumId w:val="14"/>
   </w:num>
   <w:num w:numId="3" w16cid:durableId="374814780">
-    <w:abstractNumId w:val="10"/>
+    <w:abstractNumId w:val="17"/>
   </w:num>
   <w:num w:numId="4" w16cid:durableId="1183739492">
-    <w:abstractNumId w:val="4"/>
+    <w:abstractNumId w:val="6"/>
   </w:num>
   <w:num w:numId="5" w16cid:durableId="1723013851">
-    <w:abstractNumId w:val="7"/>
+    <w:abstractNumId w:val="11"/>
   </w:num>
   <w:num w:numId="6" w16cid:durableId="1673684526">
     <w:abstractNumId w:val="0"/>
   </w:num>
   <w:num w:numId="7" w16cid:durableId="56708285">
-    <w:abstractNumId w:val="6"/>
+    <w:abstractNumId w:val="8"/>
   </w:num>
   <w:num w:numId="8" w16cid:durableId="1129854572">
+    <w:abstractNumId w:val="7"/>
+  </w:num>
+  <w:num w:numId="9" w16cid:durableId="1999385700">
     <w:abstractNumId w:val="5"/>
   </w:num>
-  <w:num w:numId="9" w16cid:durableId="1999385700">
-    <w:abstractNumId w:val="3"/>
-  </w:num>
   <w:num w:numId="10" w16cid:durableId="1855528944">
-    <w:abstractNumId w:val="9"/>
+    <w:abstractNumId w:val="15"/>
   </w:num>
   <w:num w:numId="11" w16cid:durableId="2090301892">
-    <w:abstractNumId w:val="12"/>
+    <w:abstractNumId w:val="19"/>
   </w:num>
   <w:num w:numId="12" w16cid:durableId="1982152134">
     <w:abstractNumId w:val="1"/>
   </w:num>
   <w:num w:numId="13" w16cid:durableId="1953899344">
-    <w:abstractNumId w:val="11"/>
+    <w:abstractNumId w:val="18"/>
+  </w:num>
+  <w:num w:numId="14" w16cid:durableId="925847258">
+    <w:abstractNumId w:val="10"/>
+  </w:num>
+  <w:num w:numId="15" w16cid:durableId="1049498676">
+    <w:abstractNumId w:val="12"/>
+  </w:num>
+  <w:num w:numId="16" w16cid:durableId="1940290535">
+    <w:abstractNumId w:val="2"/>
+  </w:num>
+  <w:num w:numId="17" w16cid:durableId="278344549">
+    <w:abstractNumId w:val="16"/>
+  </w:num>
+  <w:num w:numId="18" w16cid:durableId="94324337">
+    <w:abstractNumId w:val="4"/>
+  </w:num>
+  <w:num w:numId="19" w16cid:durableId="1230114077">
+    <w:abstractNumId w:val="13"/>
+  </w:num>
+  <w:num w:numId="20" w16cid:durableId="347292467">
+    <w:abstractNumId w:val="9"/>
   </w:num>
 </w:numbering>
 </file>
@@ -4287,9 +5586,6 @@
   <w:style w:type="paragraph" w:default="1" w:styleId="Normal">
     <w:name w:val="Normal"/>
     <w:qFormat/>
-    <w:rPr>
-      <w:lang w:val="en-GB"/>
-    </w:rPr>
   </w:style>
   <w:style w:type="paragraph" w:styleId="Heading1">
     <w:name w:val="heading 1"/>
@@ -4491,7 +5787,6 @@
   <w:style w:type="character" w:default="1" w:styleId="DefaultParagraphFont">
     <w:name w:val="Default Paragraph Font"/>
     <w:uiPriority w:val="1"/>
-    <w:semiHidden/>
     <w:unhideWhenUsed/>
   </w:style>
   <w:style w:type="table" w:default="1" w:styleId="TableNormal">

</xml_diff>